<commit_message>
vault backup: 2025-12-12 08:16:09
</commit_message>
<xml_diff>
--- a/Курс 3/НИР/НИР_Кринкин.docx
+++ b/Курс 3/НИР/НИР_Кринкин.docx
@@ -1104,6 +1104,182 @@
           <w:lang w:val="ru-RU"/>
         </w:rPr>
       </w:pPr>
+      <w:r>
+        <w:rPr>
+          <w:lang w:val="ru-RU"/>
+        </w:rPr>
+        <w:t xml:space="preserve">Введение – </w:t>
+      </w:r>
+      <w:r>
+        <w:rPr>
+          <w:color w:val="00B050"/>
+          <w:lang w:val="ru-RU"/>
+        </w:rPr>
+        <w:t>готово</w:t>
+      </w:r>
+    </w:p>
+    <w:p>
+      <w:pPr>
+        <w:rPr>
+          <w:lang w:val="ru-RU"/>
+        </w:rPr>
+      </w:pPr>
+      <w:r>
+        <w:rPr>
+          <w:lang w:val="ru-RU"/>
+        </w:rPr>
+        <w:t>Раздел 1</w:t>
+      </w:r>
+      <w:r>
+        <w:rPr>
+          <w:lang w:val="ru-RU"/>
+        </w:rPr>
+        <w:t xml:space="preserve"> </w:t>
+      </w:r>
+      <w:r>
+        <w:rPr>
+          <w:lang w:val="ru-RU"/>
+        </w:rPr>
+        <w:t xml:space="preserve">– </w:t>
+      </w:r>
+      <w:r>
+        <w:rPr>
+          <w:color w:val="ED7D31" w:themeColor="accent2"/>
+          <w:lang w:val="ru-RU"/>
+        </w:rPr>
+        <w:t>частично</w:t>
+      </w:r>
+    </w:p>
+    <w:p>
+      <w:pPr>
+        <w:rPr>
+          <w:lang w:val="ru-RU"/>
+        </w:rPr>
+      </w:pPr>
+      <w:r>
+        <w:rPr>
+          <w:lang w:val="ru-RU"/>
+        </w:rPr>
+        <w:t>Раздел 2</w:t>
+      </w:r>
+      <w:r>
+        <w:rPr>
+          <w:lang w:val="ru-RU"/>
+        </w:rPr>
+        <w:t xml:space="preserve"> – </w:t>
+      </w:r>
+      <w:r>
+        <w:rPr>
+          <w:color w:val="00B050"/>
+          <w:lang w:val="ru-RU"/>
+        </w:rPr>
+        <w:t>готово</w:t>
+      </w:r>
+    </w:p>
+    <w:p>
+      <w:pPr>
+        <w:rPr>
+          <w:lang w:val="ru-RU"/>
+        </w:rPr>
+      </w:pPr>
+      <w:r>
+        <w:rPr>
+          <w:lang w:val="ru-RU"/>
+        </w:rPr>
+        <w:t>Раздел 3</w:t>
+      </w:r>
+      <w:r>
+        <w:rPr>
+          <w:lang w:val="ru-RU"/>
+        </w:rPr>
+        <w:t xml:space="preserve"> – </w:t>
+      </w:r>
+      <w:r>
+        <w:rPr>
+          <w:color w:val="00B050"/>
+          <w:lang w:val="ru-RU"/>
+        </w:rPr>
+        <w:t>готово</w:t>
+      </w:r>
+    </w:p>
+    <w:p>
+      <w:pPr>
+        <w:rPr>
+          <w:lang w:val="ru-RU"/>
+        </w:rPr>
+      </w:pPr>
+      <w:r>
+        <w:rPr>
+          <w:lang w:val="ru-RU"/>
+        </w:rPr>
+        <w:t>Раздел 4</w:t>
+      </w:r>
+      <w:r>
+        <w:rPr>
+          <w:lang w:val="ru-RU"/>
+        </w:rPr>
+        <w:t xml:space="preserve"> – </w:t>
+      </w:r>
+      <w:r>
+        <w:rPr>
+          <w:color w:val="ED7D31" w:themeColor="accent2"/>
+          <w:lang w:val="ru-RU"/>
+        </w:rPr>
+        <w:t>частично</w:t>
+      </w:r>
+    </w:p>
+    <w:p>
+      <w:pPr>
+        <w:rPr>
+          <w:lang w:val="en-US"/>
+        </w:rPr>
+      </w:pPr>
+      <w:r>
+        <w:rPr>
+          <w:lang w:val="ru-RU"/>
+        </w:rPr>
+        <w:t>Раздел 5</w:t>
+      </w:r>
+      <w:r>
+        <w:rPr>
+          <w:lang w:val="ru-RU"/>
+        </w:rPr>
+        <w:t xml:space="preserve"> – </w:t>
+      </w:r>
+      <w:r>
+        <w:rPr>
+          <w:color w:val="EE0000"/>
+          <w:lang w:val="ru-RU"/>
+        </w:rPr>
+        <w:t>нет</w:t>
+      </w:r>
+    </w:p>
+    <w:p>
+      <w:pPr>
+        <w:rPr>
+          <w:lang w:val="ru-RU"/>
+        </w:rPr>
+      </w:pPr>
+      <w:r>
+        <w:rPr>
+          <w:lang w:val="ru-RU"/>
+        </w:rPr>
+        <w:t xml:space="preserve">Заключение - </w:t>
+      </w:r>
+      <w:r>
+        <w:rPr>
+          <w:color w:val="EE0000"/>
+          <w:lang w:val="ru-RU"/>
+        </w:rPr>
+        <w:t>нет</w:t>
+      </w:r>
+    </w:p>
+    <w:p>
+      <w:pPr>
+        <w:rPr>
+          <w:lang w:val="ru-RU"/>
+        </w:rPr>
+      </w:pPr>
     </w:p>
     <w:p>
       <w:pPr>
@@ -1182,19 +1358,7 @@
         <w:rPr>
           <w:lang w:val="ru-RU"/>
         </w:rPr>
-        <w:t xml:space="preserve">. </w:t>
-      </w:r>
-      <w:r>
-        <w:rPr>
-          <w:lang w:val="ru-RU"/>
-        </w:rPr>
-        <w:t xml:space="preserve">Транскрибирование </w:t>
-      </w:r>
-      <w:r>
-        <w:rPr>
-          <w:lang w:val="ru-RU"/>
-        </w:rPr>
-        <w:t>текста вручную это крайне трудоёмкий процесс, который подразумевает прослушивание и интерпретацию аудио информации человеком. Трудоёмкость этого процесса практически невозможно облегчить, опираясь лишь на человеческий труд. Исходя из этого были разработаны автоматические технические средства для транскрибирования речи в текст.</w:t>
+        <w:t>. Транскрибирование текста вручную это крайне трудоёмкий процесс, который подразумевает прослушивание и интерпретацию аудио информации человеком. Трудоёмкость этого процесса практически невозможно облегчить, опираясь лишь на человеческий труд. Исходя из этого были разработаны автоматические технические средства для транскрибирования речи в текст.</w:t>
       </w:r>
     </w:p>
     <w:p>
@@ -1302,22 +1466,822 @@
     </w:p>
     <w:p>
       <w:pPr>
-        <w:rPr>
-          <w:lang w:val="ru-RU"/>
-        </w:rPr>
-      </w:pPr>
-      <w:r>
-        <w:rPr>
-          <w:lang w:val="ru-RU"/>
-        </w:rPr>
-        <w:t>Это там ну да</w:t>
-      </w:r>
-    </w:p>
-    <w:p>
-      <w:pPr>
-        <w:spacing w:after="160" w:line="278" w:lineRule="auto"/>
-        <w:ind w:firstLine="0"/>
-        <w:jc w:val="left"/>
+        <w:ind w:firstLine="426"/>
+        <w:rPr>
+          <w:rFonts w:eastAsia="Times New Roman" w:cs="Times New Roman"/>
+          <w:color w:val="EE0000"/>
+          <w:szCs w:val="28"/>
+          <w:lang w:eastAsia="ru-RU"/>
+        </w:rPr>
+      </w:pPr>
+      <w:r>
+        <w:rPr>
+          <w:rFonts w:eastAsia="Times New Roman" w:cs="Times New Roman"/>
+          <w:color w:val="EE0000"/>
+          <w:szCs w:val="28"/>
+          <w:lang w:eastAsia="ru-RU"/>
+        </w:rPr>
+        <w:t>Предметная область исследования определяется такими ключевыми понятиями, как автоматическое распознавание речи (ASR), обработка естественного языка (NLP), транскрибация аудио и видео в текст, искусственный интеллект и конфиденциальность данных. Поэтому выбрана тема ВКР: «Автоматическое транскрибирование устной речи в письменный текст с использованием технологий искусственного интеллекта».</w:t>
+      </w:r>
+    </w:p>
+    <w:p>
+      <w:pPr>
+        <w:ind w:firstLine="426"/>
+        <w:rPr>
+          <w:rFonts w:eastAsia="Times New Roman" w:cs="Times New Roman"/>
+          <w:szCs w:val="28"/>
+          <w:lang w:eastAsia="ru-RU"/>
+        </w:rPr>
+      </w:pPr>
+      <w:r>
+        <w:rPr>
+          <w:rFonts w:eastAsia="Times New Roman" w:cs="Times New Roman"/>
+          <w:szCs w:val="28"/>
+          <w:lang w:eastAsia="ru-RU"/>
+        </w:rPr>
+        <w:t>Транскриб</w:t>
+      </w:r>
+      <w:r>
+        <w:rPr>
+          <w:rFonts w:eastAsia="Times New Roman" w:cs="Times New Roman"/>
+          <w:szCs w:val="28"/>
+          <w:lang w:eastAsia="ru-RU"/>
+        </w:rPr>
+        <w:t xml:space="preserve">ирование </w:t>
+      </w:r>
+      <w:r>
+        <w:rPr>
+          <w:rFonts w:eastAsia="Times New Roman" w:cs="Times New Roman"/>
+          <w:szCs w:val="28"/>
+          <w:lang w:eastAsia="ru-RU"/>
+        </w:rPr>
+        <w:t>—</w:t>
+      </w:r>
+      <w:r>
+        <w:rPr>
+          <w:rFonts w:eastAsia="Times New Roman" w:cs="Times New Roman"/>
+          <w:szCs w:val="28"/>
+          <w:lang w:eastAsia="ru-RU"/>
+        </w:rPr>
+        <w:t xml:space="preserve"> </w:t>
+      </w:r>
+      <w:r>
+        <w:rPr>
+          <w:rFonts w:eastAsia="Times New Roman" w:cs="Times New Roman"/>
+          <w:szCs w:val="28"/>
+          <w:lang w:eastAsia="ru-RU"/>
+        </w:rPr>
+        <w:t>это</w:t>
+      </w:r>
+      <w:r>
+        <w:rPr>
+          <w:rFonts w:eastAsia="Times New Roman" w:cs="Times New Roman"/>
+          <w:szCs w:val="28"/>
+          <w:lang w:eastAsia="ru-RU"/>
+        </w:rPr>
+        <w:t xml:space="preserve"> </w:t>
+      </w:r>
+      <w:r>
+        <w:rPr>
+          <w:rFonts w:eastAsia="Times New Roman" w:cs="Times New Roman"/>
+          <w:szCs w:val="28"/>
+          <w:lang w:eastAsia="ru-RU"/>
+        </w:rPr>
+        <w:t>мощный инструмент, который помогает преобразовывать аудиовизуальный контент в удобный для анализа и использования текст.</w:t>
+      </w:r>
+      <w:r>
+        <w:rPr>
+          <w:rFonts w:eastAsia="Times New Roman" w:cs="Times New Roman"/>
+          <w:szCs w:val="28"/>
+          <w:lang w:eastAsia="ru-RU"/>
+        </w:rPr>
+        <w:t xml:space="preserve"> </w:t>
+      </w:r>
+      <w:r>
+        <w:rPr>
+          <w:rFonts w:eastAsia="Times New Roman" w:cs="Times New Roman"/>
+          <w:szCs w:val="28"/>
+          <w:lang w:eastAsia="ru-RU"/>
+        </w:rPr>
+        <w:t>Это особенно актуально для таких сфер, как судебное делопроизводство, образование и корпоративный сектор, где требуется быстрая и точная расшифровка аудиозаписей интервью, лекций, совещаний и выступлений.</w:t>
+      </w:r>
+      <w:r>
+        <w:rPr>
+          <w:rFonts w:eastAsia="Times New Roman" w:cs="Times New Roman"/>
+          <w:szCs w:val="28"/>
+          <w:lang w:eastAsia="ru-RU"/>
+        </w:rPr>
+        <w:t xml:space="preserve"> Также оно применяется в</w:t>
+      </w:r>
+      <w:r>
+        <w:rPr>
+          <w:rFonts w:eastAsia="Times New Roman" w:cs="Times New Roman"/>
+          <w:szCs w:val="28"/>
+          <w:lang w:eastAsia="ru-RU"/>
+        </w:rPr>
+        <w:t xml:space="preserve"> медиа и журналистике. Журналисты и репортеры используют транскрибацию для того, чтобы переводить интервью, пресс-конференции и другие мероприятия в текстовый формат. Это облегчает создание статей и материалов на основе оригинальных источников</w:t>
+      </w:r>
+      <w:r>
+        <w:rPr>
+          <w:rFonts w:eastAsia="Times New Roman" w:cs="Times New Roman"/>
+          <w:szCs w:val="28"/>
+          <w:lang w:val="ru-RU" w:eastAsia="ru-RU"/>
+        </w:rPr>
+        <w:t xml:space="preserve"> </w:t>
+      </w:r>
+      <w:r>
+        <w:rPr>
+          <w:rFonts w:eastAsia="Times New Roman" w:cs="Times New Roman"/>
+          <w:szCs w:val="28"/>
+          <w:lang w:eastAsia="ru-RU"/>
+        </w:rPr>
+        <w:t>[</w:t>
+      </w:r>
+      <w:r>
+        <w:rPr>
+          <w:rFonts w:eastAsia="Times New Roman" w:cs="Times New Roman"/>
+          <w:szCs w:val="28"/>
+          <w:lang w:val="ru-RU" w:eastAsia="ru-RU"/>
+        </w:rPr>
+        <w:t>#</w:t>
+      </w:r>
+      <w:r>
+        <w:rPr>
+          <w:rFonts w:eastAsia="Times New Roman" w:cs="Times New Roman"/>
+          <w:szCs w:val="28"/>
+          <w:lang w:val="ru-RU" w:eastAsia="ru-RU"/>
+        </w:rPr>
+        <w:t>дс 22</w:t>
+      </w:r>
+      <w:r>
+        <w:rPr>
+          <w:rFonts w:eastAsia="Times New Roman" w:cs="Times New Roman"/>
+          <w:szCs w:val="28"/>
+          <w:lang w:eastAsia="ru-RU"/>
+        </w:rPr>
+        <w:t>].</w:t>
+      </w:r>
+    </w:p>
+    <w:p>
+      <w:pPr>
+        <w:ind w:firstLine="426"/>
+        <w:rPr>
+          <w:rFonts w:eastAsia="Times New Roman" w:cs="Times New Roman"/>
+          <w:szCs w:val="28"/>
+          <w:lang w:eastAsia="ru-RU"/>
+        </w:rPr>
+      </w:pPr>
+      <w:r>
+        <w:rPr>
+          <w:rFonts w:eastAsia="Times New Roman" w:cs="Times New Roman"/>
+          <w:szCs w:val="28"/>
+          <w:lang w:eastAsia="ru-RU"/>
+        </w:rPr>
+        <w:t>Текстовая расшифровка аудиозаписей абсолютно необходима для всех специалистов, любителей и обычных пользователей аудио- и видеоконтента. Точная расшифровка любой записи — это лучший способ сэкономить время и деньги</w:t>
+      </w:r>
+      <w:r>
+        <w:rPr>
+          <w:rFonts w:eastAsia="Times New Roman" w:cs="Times New Roman"/>
+          <w:szCs w:val="28"/>
+          <w:lang w:eastAsia="ru-RU"/>
+        </w:rPr>
+        <w:t xml:space="preserve">. </w:t>
+      </w:r>
+      <w:r>
+        <w:rPr>
+          <w:rFonts w:eastAsia="Times New Roman" w:cs="Times New Roman"/>
+          <w:szCs w:val="28"/>
+          <w:lang w:eastAsia="ru-RU"/>
+        </w:rPr>
+        <w:t>В современных условиях организации все больше стремятся к сокращению времени, требующегося для принятия решений на основе данных, собранных в ходе проведения фокус-групп. В связи с чем все активнее используются цифровые технологии их обработки и анализа.</w:t>
+      </w:r>
+    </w:p>
+    <w:p>
+      <w:pPr>
+        <w:ind w:firstLine="426"/>
+        <w:rPr>
+          <w:rFonts w:eastAsia="Times New Roman" w:cs="Times New Roman"/>
+          <w:szCs w:val="28"/>
+          <w:lang w:eastAsia="ru-RU"/>
+        </w:rPr>
+      </w:pPr>
+      <w:r>
+        <w:rPr>
+          <w:rFonts w:eastAsia="Times New Roman" w:cs="Times New Roman"/>
+          <w:szCs w:val="28"/>
+          <w:lang w:eastAsia="ru-RU"/>
+        </w:rPr>
+        <w:t xml:space="preserve">Наиболее широко признанным видом транскрипции является преобразование источника разговорного языка в текст, например, в компьютерную запись, подходящую для печати в виде документа, отчета. </w:t>
+      </w:r>
+    </w:p>
+    <w:p>
+      <w:pPr>
+        <w:ind w:firstLine="426"/>
+        <w:rPr>
+          <w:rFonts w:eastAsia="Times New Roman" w:cs="Times New Roman"/>
+          <w:szCs w:val="28"/>
+          <w:lang w:eastAsia="ru-RU"/>
+        </w:rPr>
+      </w:pPr>
+      <w:r>
+        <w:rPr>
+          <w:rFonts w:eastAsia="Times New Roman" w:cs="Times New Roman"/>
+          <w:szCs w:val="28"/>
+          <w:lang w:eastAsia="ru-RU"/>
+        </w:rPr>
+        <w:lastRenderedPageBreak/>
+        <w:t xml:space="preserve">Ручная транскрипция — это процесс набора произносимых слов так, как они слышатся. Хотя этот метод может занять много времени и быть неточным, он предлагает некоторые преимущества, такие как доступность и точность. </w:t>
+      </w:r>
+    </w:p>
+    <w:p>
+      <w:pPr>
+        <w:ind w:firstLine="426"/>
+        <w:rPr>
+          <w:rFonts w:eastAsia="Times New Roman" w:cs="Times New Roman"/>
+          <w:szCs w:val="28"/>
+          <w:lang w:eastAsia="ru-RU"/>
+        </w:rPr>
+      </w:pPr>
+      <w:r>
+        <w:rPr>
+          <w:rFonts w:eastAsia="Times New Roman" w:cs="Times New Roman"/>
+          <w:szCs w:val="28"/>
+          <w:lang w:eastAsia="ru-RU"/>
+        </w:rPr>
+        <w:t xml:space="preserve">Технологическая транскрипция использует программное обеспечение для преобразования аудиофайлов в текстовый формат. Этот тип транскрипции предлагает несколько преимуществ по сравнению с ручной транскрипцией, включая скорость, точность и экономичность. </w:t>
+      </w:r>
+    </w:p>
+    <w:p>
+      <w:pPr>
+        <w:ind w:firstLine="426"/>
+        <w:rPr>
+          <w:rFonts w:eastAsia="Times New Roman" w:cs="Times New Roman"/>
+          <w:szCs w:val="28"/>
+          <w:lang w:eastAsia="ru-RU"/>
+        </w:rPr>
+      </w:pPr>
+      <w:r>
+        <w:rPr>
+          <w:rFonts w:eastAsia="Times New Roman" w:cs="Times New Roman"/>
+          <w:szCs w:val="28"/>
+          <w:lang w:eastAsia="ru-RU"/>
+        </w:rPr>
+        <w:t xml:space="preserve">Существуют различные типы транскрипции: </w:t>
+      </w:r>
+    </w:p>
+    <w:p>
+      <w:pPr>
+        <w:pStyle w:val="a7"/>
+        <w:numPr>
+          <w:ilvl w:val="0"/>
+          <w:numId w:val="11"/>
+        </w:numPr>
+        <w:ind w:left="709" w:hanging="283"/>
+        <w:rPr>
+          <w:lang w:eastAsia="ru-RU"/>
+        </w:rPr>
+      </w:pPr>
+      <w:r>
+        <w:rPr>
+          <w:lang w:eastAsia="ru-RU"/>
+        </w:rPr>
+        <w:t>живая транскрипция — это когда чьи-то слова транскрибируются в режиме</w:t>
+      </w:r>
+      <w:r>
+        <w:rPr>
+          <w:lang w:val="ru-RU" w:eastAsia="ru-RU"/>
+        </w:rPr>
+        <w:t xml:space="preserve"> </w:t>
+      </w:r>
+      <w:r>
+        <w:rPr>
+          <w:lang w:eastAsia="ru-RU"/>
+        </w:rPr>
+        <w:t xml:space="preserve">реального времени, когда они говорят. </w:t>
+      </w:r>
+    </w:p>
+    <w:p>
+      <w:pPr>
+        <w:pStyle w:val="a7"/>
+        <w:numPr>
+          <w:ilvl w:val="0"/>
+          <w:numId w:val="11"/>
+        </w:numPr>
+        <w:ind w:left="709" w:hanging="283"/>
+        <w:rPr>
+          <w:lang w:eastAsia="ru-RU"/>
+        </w:rPr>
+      </w:pPr>
+      <w:r>
+        <w:rPr>
+          <w:lang w:eastAsia="ru-RU"/>
+        </w:rPr>
+        <w:t xml:space="preserve">полная транскрипция — это когда аудиозапись (обычно лекция или речь) расшифровывается после того, как событие произошло. </w:t>
+      </w:r>
+    </w:p>
+    <w:p>
+      <w:pPr>
+        <w:ind w:firstLine="426"/>
+        <w:rPr>
+          <w:lang w:eastAsia="ru-RU"/>
+        </w:rPr>
+      </w:pPr>
+      <w:r>
+        <w:rPr>
+          <w:lang w:eastAsia="ru-RU"/>
+        </w:rPr>
+        <w:t>Задача программ по преобразованию звука в текст — грамотно перевести и отредактировать аудио или видео в другой формат: убрать слова</w:t>
+      </w:r>
+      <w:r>
+        <w:rPr>
+          <w:lang w:eastAsia="ru-RU"/>
+        </w:rPr>
+        <w:t xml:space="preserve"> </w:t>
+      </w:r>
+      <w:r>
+        <w:rPr>
+          <w:lang w:eastAsia="ru-RU"/>
+        </w:rPr>
+        <w:t>паразиты, неправильные фразы, паузы и шум. Готовый текст должен состоять из логичных фраз, построенных по правилам русского языка</w:t>
+      </w:r>
+      <w:r>
+        <w:rPr>
+          <w:lang w:val="ru-RU" w:eastAsia="ru-RU"/>
+        </w:rPr>
+        <w:t xml:space="preserve"> </w:t>
+      </w:r>
+      <w:r>
+        <w:rPr>
+          <w:lang w:eastAsia="ru-RU"/>
+        </w:rPr>
+        <w:t>[</w:t>
+      </w:r>
+      <w:r>
+        <w:rPr>
+          <w:lang w:val="ru-RU" w:eastAsia="ru-RU"/>
+        </w:rPr>
+        <w:t>#</w:t>
+      </w:r>
+      <w:r>
+        <w:rPr>
+          <w:lang w:val="ru-RU" w:eastAsia="ru-RU"/>
+        </w:rPr>
+        <w:t xml:space="preserve">дс </w:t>
+      </w:r>
+      <w:r>
+        <w:rPr>
+          <w:lang w:eastAsia="ru-RU"/>
+        </w:rPr>
+        <w:t>2</w:t>
+      </w:r>
+      <w:r>
+        <w:rPr>
+          <w:lang w:val="ru-RU" w:eastAsia="ru-RU"/>
+        </w:rPr>
+        <w:t>3</w:t>
+      </w:r>
+      <w:r>
+        <w:rPr>
+          <w:lang w:eastAsia="ru-RU"/>
+        </w:rPr>
+        <w:t>, с. 1-2</w:t>
+      </w:r>
+      <w:r>
+        <w:rPr>
+          <w:lang w:eastAsia="ru-RU"/>
+        </w:rPr>
+        <w:t>].</w:t>
+      </w:r>
+    </w:p>
+    <w:p>
+      <w:pPr>
+        <w:ind w:firstLine="426"/>
+        <w:rPr>
+          <w:lang w:eastAsia="ru-RU"/>
+        </w:rPr>
+      </w:pPr>
+      <w:r>
+        <w:rPr>
+          <w:lang w:eastAsia="ru-RU"/>
+        </w:rPr>
+        <w:t xml:space="preserve">Автоматическая транскрибация имеет высокие риски получения недостоверной информации. Количество ошибок, допускаемых при определении адресанта речи напрямую связано с количеством участников фокус-группы. Сам процесс транскрибации предполагает последовательную смену состояния собранной информации. При этом следует учитывать, что в процессе транскрибации изменяется не только форма представления информации из звуковой в текстовую. Также изменениям могут подвергаться достоверность, целостность и конфиденциальность информации. Например, звук на аудиозаписи может содержать различные неинформативные посторонние шумы, которые после обработки через систему транскрибации будут очищены. В итоге полученный на выходе текст чаще всего не будет содержать их описания. </w:t>
+      </w:r>
+    </w:p>
+    <w:p>
+      <w:pPr>
+        <w:ind w:firstLine="426"/>
+        <w:rPr>
+          <w:lang w:eastAsia="ru-RU"/>
+        </w:rPr>
+      </w:pPr>
+      <w:r>
+        <w:rPr>
+          <w:lang w:eastAsia="ru-RU"/>
+        </w:rPr>
+        <w:lastRenderedPageBreak/>
+        <w:t>Результативность систем транскрибации предполагает соответствие результатов процесса транскрибации требованиям к качеству полученной текстовой информации. Она зависит от ряда факторов</w:t>
+      </w:r>
+      <w:r>
+        <w:rPr>
+          <w:lang w:eastAsia="ru-RU"/>
+        </w:rPr>
+        <w:t>:</w:t>
+      </w:r>
+    </w:p>
+    <w:p>
+      <w:pPr>
+        <w:ind w:firstLine="426"/>
+        <w:rPr>
+          <w:lang w:eastAsia="ru-RU"/>
+        </w:rPr>
+      </w:pPr>
+      <w:r>
+        <w:rPr>
+          <w:lang w:eastAsia="ru-RU"/>
+        </w:rPr>
+        <w:t xml:space="preserve">Во-первых, значимым является количество участников. </w:t>
+      </w:r>
+    </w:p>
+    <w:p>
+      <w:pPr>
+        <w:ind w:firstLine="426"/>
+        <w:rPr>
+          <w:lang w:eastAsia="ru-RU"/>
+        </w:rPr>
+      </w:pPr>
+      <w:r>
+        <w:rPr>
+          <w:lang w:eastAsia="ru-RU"/>
+        </w:rPr>
+        <w:t xml:space="preserve">Во-вторых, результат транскрибации зависит от того, является ли транскрибация потоковой или создается транскрипт аудио/видео записи. Потоковая транскрибация может выдавать большее количество ошибок, чем транскрибация аудио/видео записи. </w:t>
+      </w:r>
+    </w:p>
+    <w:p>
+      <w:pPr>
+        <w:ind w:firstLine="426"/>
+        <w:rPr>
+          <w:lang w:eastAsia="ru-RU"/>
+        </w:rPr>
+      </w:pPr>
+      <w:r>
+        <w:rPr>
+          <w:lang w:eastAsia="ru-RU"/>
+        </w:rPr>
+        <w:t xml:space="preserve">В-третьих, результативность транскрибации связана с используемыми в ходе беседы языками. Ошибки могут возникать в случае, когда адресанты используют в речи иностранные слова или термины, либо в фокус-группе принимают участие иностранцы. </w:t>
+      </w:r>
+    </w:p>
+    <w:p>
+      <w:pPr>
+        <w:ind w:firstLine="426"/>
+        <w:rPr>
+          <w:lang w:eastAsia="ru-RU"/>
+        </w:rPr>
+      </w:pPr>
+      <w:r>
+        <w:rPr>
+          <w:lang w:eastAsia="ru-RU"/>
+        </w:rPr>
+        <w:t>В-четвертых, на результативность влияет среда, в которой проводится интервью или фокус-группа. Если запись ведется через микрофон, установленный возле каждого говорящего, результативность будет выше</w:t>
+      </w:r>
+      <w:r>
+        <w:rPr>
+          <w:lang w:eastAsia="ru-RU"/>
+        </w:rPr>
+        <w:t xml:space="preserve"> </w:t>
+      </w:r>
+      <w:r>
+        <w:rPr>
+          <w:lang w:eastAsia="ru-RU"/>
+        </w:rPr>
+        <w:t>[</w:t>
+      </w:r>
+      <w:r>
+        <w:rPr>
+          <w:lang w:eastAsia="ru-RU"/>
+        </w:rPr>
+        <w:t>6</w:t>
+      </w:r>
+      <w:r>
+        <w:rPr>
+          <w:lang w:eastAsia="ru-RU"/>
+        </w:rPr>
+        <w:t xml:space="preserve">, </w:t>
+      </w:r>
+      <w:r>
+        <w:rPr>
+          <w:lang w:eastAsia="ru-RU"/>
+        </w:rPr>
+        <w:t>с. 2</w:t>
+      </w:r>
+      <w:r>
+        <w:rPr>
+          <w:lang w:eastAsia="ru-RU"/>
+        </w:rPr>
+        <w:t>]</w:t>
+      </w:r>
+      <w:r>
+        <w:rPr>
+          <w:lang w:eastAsia="ru-RU"/>
+        </w:rPr>
+        <w:t>.</w:t>
+      </w:r>
+    </w:p>
+    <w:p>
+      <w:pPr>
+        <w:ind w:firstLine="426"/>
+        <w:rPr>
+          <w:lang w:eastAsia="ru-RU"/>
+        </w:rPr>
+      </w:pPr>
+      <w:r>
+        <w:rPr>
+          <w:lang w:eastAsia="ru-RU"/>
+        </w:rPr>
+        <w:t>Искусственный интеллект</w:t>
+      </w:r>
+      <w:r>
+        <w:rPr>
+          <w:lang w:eastAsia="ru-RU"/>
+        </w:rPr>
+        <w:t xml:space="preserve"> </w:t>
+      </w:r>
+      <w:r>
+        <w:rPr>
+          <w:lang w:eastAsia="ru-RU"/>
+        </w:rPr>
+        <w:t>в данной предметной области применяется для создания автоматизированных систем распознавания речи</w:t>
+      </w:r>
+      <w:r>
+        <w:rPr>
+          <w:lang w:eastAsia="ru-RU"/>
+        </w:rPr>
+        <w:t xml:space="preserve">. </w:t>
+      </w:r>
+      <w:r>
+        <w:rPr>
+          <w:lang w:eastAsia="ru-RU"/>
+        </w:rPr>
+        <w:t>Нейросети способны быстро преобразовать речь в текст с высокой точностью, даже если в записи есть шумы или акценты.</w:t>
+      </w:r>
+      <w:r>
+        <w:rPr>
+          <w:lang w:eastAsia="ru-RU"/>
+        </w:rPr>
+        <w:t xml:space="preserve"> </w:t>
+      </w:r>
+      <w:r>
+        <w:rPr>
+          <w:lang w:eastAsia="ru-RU"/>
+        </w:rPr>
+        <w:t>Современные нейросети учатся на ходу, адаптируясь к новым задачам и языкам.</w:t>
+      </w:r>
+      <w:r>
+        <w:rPr>
+          <w:lang w:eastAsia="ru-RU"/>
+        </w:rPr>
+        <w:t xml:space="preserve"> </w:t>
+      </w:r>
+      <w:r>
+        <w:rPr>
+          <w:lang w:eastAsia="ru-RU"/>
+        </w:rPr>
+        <w:t>[</w:t>
+      </w:r>
+      <w:r>
+        <w:rPr>
+          <w:lang w:val="en-US" w:eastAsia="ru-RU"/>
+        </w:rPr>
+        <w:t>#</w:t>
+      </w:r>
+      <w:proofErr w:type="spellStart"/>
+      <w:r>
+        <w:rPr>
+          <w:lang w:val="ru-RU" w:eastAsia="ru-RU"/>
+        </w:rPr>
+        <w:t>дс</w:t>
+      </w:r>
+      <w:proofErr w:type="spellEnd"/>
+      <w:r>
+        <w:rPr>
+          <w:lang w:val="ru-RU" w:eastAsia="ru-RU"/>
+        </w:rPr>
+        <w:t xml:space="preserve"> 25</w:t>
+      </w:r>
+      <w:r>
+        <w:rPr>
+          <w:lang w:eastAsia="ru-RU"/>
+        </w:rPr>
+        <w:t>]</w:t>
+      </w:r>
+    </w:p>
+    <w:p>
+      <w:pPr>
+        <w:ind w:firstLine="426"/>
+        <w:rPr>
+          <w:lang w:eastAsia="ru-RU"/>
+        </w:rPr>
+      </w:pPr>
+      <w:r>
+        <w:rPr>
+          <w:lang w:eastAsia="ru-RU"/>
+        </w:rPr>
+        <w:t>Разработка систем автоматического распознавания речи на основе ИИ представляет собой важное направление в области технологий обработки речи. Применение современных методов и алгоритмов позволяет достигать высокой точности распознавания и обеспечивать широкие возможности для различных приложений. Существуют такие методы и алгоритмы распознавания речи, как:</w:t>
+      </w:r>
+    </w:p>
+    <w:p>
+      <w:pPr>
+        <w:pStyle w:val="a7"/>
+        <w:numPr>
+          <w:ilvl w:val="0"/>
+          <w:numId w:val="12"/>
+        </w:numPr>
+        <w:ind w:left="709" w:hanging="283"/>
+        <w:rPr>
+          <w:lang w:eastAsia="ru-RU"/>
+        </w:rPr>
+      </w:pPr>
+      <w:r>
+        <w:rPr>
+          <w:lang w:eastAsia="ru-RU"/>
+        </w:rPr>
+        <w:t xml:space="preserve">Нейронные сети и глубокое обучение, играющие ключевую роль в современных системах </w:t>
+      </w:r>
+      <w:r>
+        <w:rPr>
+          <w:lang w:val="en-US" w:eastAsia="ru-RU"/>
+        </w:rPr>
+        <w:t>ASR</w:t>
+      </w:r>
+      <w:r>
+        <w:rPr>
+          <w:lang w:eastAsia="ru-RU"/>
+        </w:rPr>
+        <w:t>, обеспечивая высокую точность распознания.</w:t>
+      </w:r>
+    </w:p>
+    <w:p>
+      <w:pPr>
+        <w:pStyle w:val="a7"/>
+        <w:numPr>
+          <w:ilvl w:val="0"/>
+          <w:numId w:val="12"/>
+        </w:numPr>
+        <w:ind w:left="709" w:hanging="283"/>
+        <w:rPr>
+          <w:lang w:eastAsia="ru-RU"/>
+        </w:rPr>
+      </w:pPr>
+      <w:r>
+        <w:rPr>
+          <w:lang w:eastAsia="ru-RU"/>
+        </w:rPr>
+        <w:lastRenderedPageBreak/>
+        <w:t xml:space="preserve">Обработка естественного языка </w:t>
+      </w:r>
+      <w:r>
+        <w:rPr>
+          <w:lang w:eastAsia="ru-RU"/>
+        </w:rPr>
+        <w:t>(</w:t>
+      </w:r>
+      <w:r>
+        <w:rPr>
+          <w:lang w:val="en-US" w:eastAsia="ru-RU"/>
+        </w:rPr>
+        <w:t>NLP</w:t>
+      </w:r>
+      <w:r>
+        <w:rPr>
+          <w:lang w:eastAsia="ru-RU"/>
+        </w:rPr>
+        <w:t>)</w:t>
+      </w:r>
+      <w:r>
+        <w:rPr>
+          <w:lang w:eastAsia="ru-RU"/>
+        </w:rPr>
+        <w:t xml:space="preserve">, используящаяся для инерпритации и обработки текста, полученного от систем </w:t>
+      </w:r>
+      <w:r>
+        <w:rPr>
+          <w:lang w:val="en-US" w:eastAsia="ru-RU"/>
+        </w:rPr>
+        <w:t>ASR</w:t>
+      </w:r>
+      <w:r>
+        <w:rPr>
+          <w:lang w:eastAsia="ru-RU"/>
+        </w:rPr>
+        <w:t>.</w:t>
+      </w:r>
+    </w:p>
+    <w:p>
+      <w:pPr>
+        <w:rPr>
+          <w:color w:val="EE0000"/>
+          <w:lang w:eastAsia="ru-RU"/>
+        </w:rPr>
+      </w:pPr>
+      <w:r>
+        <w:rPr>
+          <w:color w:val="EE0000"/>
+          <w:lang w:eastAsia="ru-RU"/>
+        </w:rPr>
+        <w:t>Примеры, преимущества и вызовы описаны в статье  «Разработка систем автоматического распознавания речи на основе искусственного интеллекта» авторов Сеитова С., Хатамова С., Машрыковой Ш. [</w:t>
+      </w:r>
+      <w:r>
+        <w:rPr>
+          <w:color w:val="EE0000"/>
+          <w:lang w:val="ru-RU" w:eastAsia="ru-RU"/>
+        </w:rPr>
+        <w:t>#</w:t>
+      </w:r>
+      <w:r>
+        <w:rPr>
+          <w:color w:val="EE0000"/>
+          <w:lang w:val="ru-RU" w:eastAsia="ru-RU"/>
+        </w:rPr>
+        <w:t>дс</w:t>
+      </w:r>
+      <w:r>
+        <w:rPr>
+          <w:color w:val="EE0000"/>
+          <w:lang w:val="ru-RU" w:eastAsia="ru-RU"/>
+        </w:rPr>
+        <w:t xml:space="preserve"> 27</w:t>
+      </w:r>
+      <w:r>
+        <w:rPr>
+          <w:color w:val="EE0000"/>
+          <w:lang w:eastAsia="ru-RU"/>
+        </w:rPr>
+        <w:t>].</w:t>
+      </w:r>
+    </w:p>
+    <w:p>
+      <w:pPr>
+        <w:ind w:firstLine="426"/>
+        <w:rPr>
+          <w:lang w:eastAsia="ru-RU"/>
+        </w:rPr>
+      </w:pPr>
+      <w:r>
+        <w:rPr>
+          <w:lang w:val="ru-RU" w:eastAsia="ru-RU"/>
+        </w:rPr>
+        <w:t>В общем и целом, автоматическое транскрибирование при помощи технологии искусственного интеллекта позволяет сильно повысить эффективность работы путём сокращения временных затрат, отсутствия необходимости воспринимать аудио и видео материал, а также исключая фактор человеческих ошибок. Подробнее обо всех преимуществах и возможных трудностях описано в статье</w:t>
+      </w:r>
+      <w:r>
+        <w:rPr>
+          <w:lang w:eastAsia="ru-RU"/>
+        </w:rPr>
+        <w:t xml:space="preserve"> </w:t>
+      </w:r>
+      <w:r>
+        <w:rPr>
+          <w:lang w:eastAsia="ru-RU"/>
+        </w:rPr>
+        <w:t> «Разработка систем автоматического распознавания речи на основе искусственного интеллекта» авторов Сеитова С., Хатамова С., Машрыковой Ш.</w:t>
+      </w:r>
+      <w:r>
+        <w:rPr>
+          <w:lang w:eastAsia="ru-RU"/>
+        </w:rPr>
+        <w:t xml:space="preserve"> </w:t>
+      </w:r>
+      <w:r>
+        <w:rPr>
+          <w:lang w:eastAsia="ru-RU"/>
+        </w:rPr>
+        <w:t>[</w:t>
+      </w:r>
+      <w:r>
+        <w:rPr>
+          <w:lang w:val="ru-RU" w:eastAsia="ru-RU"/>
+        </w:rPr>
+        <w:t>#</w:t>
+      </w:r>
+      <w:r>
+        <w:rPr>
+          <w:lang w:val="ru-RU" w:eastAsia="ru-RU"/>
+        </w:rPr>
+        <w:t>дс 27</w:t>
+      </w:r>
+      <w:r>
+        <w:rPr>
+          <w:lang w:eastAsia="ru-RU"/>
+        </w:rPr>
+        <w:t>]</w:t>
+      </w:r>
+      <w:r>
+        <w:rPr>
+          <w:lang w:eastAsia="ru-RU"/>
+        </w:rPr>
+        <w:t>.</w:t>
+      </w:r>
+    </w:p>
+    <w:p>
+      <w:pPr>
         <w:rPr>
           <w:lang w:val="ru-RU"/>
         </w:rPr>
@@ -1331,7 +2295,7 @@
     </w:p>
     <w:p>
       <w:pPr>
-        <w:ind w:firstLine="0"/>
+        <w:pStyle w:val="1"/>
         <w:rPr>
           <w:lang w:val="ru-RU"/>
         </w:rPr>
@@ -3292,25 +4256,8 @@
         </w:trPr>
         <w:tc>
           <w:tcPr>
-            <w:tcW w:w="302" w:type="pct"/>
-            <w:vAlign w:val="center"/>
-          </w:tcPr>
-          <w:p>
-            <w:pPr>
-              <w:spacing w:line="23" w:lineRule="atLeast"/>
-              <w:ind w:firstLine="0"/>
-              <w:jc w:val="center"/>
-              <w:rPr>
-                <w:rFonts w:eastAsia="Calibri"/>
-                <w:bCs/>
-                <w:sz w:val="24"/>
-              </w:rPr>
-            </w:pPr>
-          </w:p>
-        </w:tc>
-        <w:tc>
-          <w:tcPr>
-            <w:tcW w:w="1182" w:type="pct"/>
+            <w:tcW w:w="5000" w:type="pct"/>
+            <w:gridSpan w:val="5"/>
             <w:vAlign w:val="center"/>
           </w:tcPr>
           <w:p>
@@ -3332,59 +4279,6 @@
               </w:rPr>
               <w:t>Этап 3. Разработка</w:t>
             </w:r>
-          </w:p>
-        </w:tc>
-        <w:tc>
-          <w:tcPr>
-            <w:tcW w:w="801" w:type="pct"/>
-          </w:tcPr>
-          <w:p>
-            <w:pPr>
-              <w:spacing w:line="23" w:lineRule="atLeast"/>
-              <w:ind w:firstLine="0"/>
-              <w:jc w:val="left"/>
-              <w:rPr>
-                <w:rFonts w:eastAsia="Calibri"/>
-                <w:bCs/>
-                <w:sz w:val="24"/>
-              </w:rPr>
-            </w:pPr>
-          </w:p>
-        </w:tc>
-        <w:tc>
-          <w:tcPr>
-            <w:tcW w:w="1448" w:type="pct"/>
-            <w:vAlign w:val="center"/>
-          </w:tcPr>
-          <w:p>
-            <w:pPr>
-              <w:spacing w:line="23" w:lineRule="atLeast"/>
-              <w:ind w:firstLine="0"/>
-              <w:jc w:val="left"/>
-              <w:rPr>
-                <w:rFonts w:eastAsia="Calibri"/>
-                <w:bCs/>
-                <w:sz w:val="24"/>
-              </w:rPr>
-            </w:pPr>
-          </w:p>
-        </w:tc>
-        <w:tc>
-          <w:tcPr>
-            <w:tcW w:w="1267" w:type="pct"/>
-            <w:vAlign w:val="center"/>
-          </w:tcPr>
-          <w:p>
-            <w:pPr>
-              <w:spacing w:line="23" w:lineRule="atLeast"/>
-              <w:ind w:firstLine="0"/>
-              <w:jc w:val="left"/>
-              <w:rPr>
-                <w:rFonts w:eastAsia="Calibri"/>
-                <w:bCs/>
-                <w:sz w:val="24"/>
-              </w:rPr>
-            </w:pPr>
           </w:p>
         </w:tc>
       </w:tr>
@@ -4820,25 +5714,8 @@
         </w:trPr>
         <w:tc>
           <w:tcPr>
-            <w:tcW w:w="302" w:type="pct"/>
-            <w:vAlign w:val="center"/>
-          </w:tcPr>
-          <w:p>
-            <w:pPr>
-              <w:spacing w:line="23" w:lineRule="atLeast"/>
-              <w:ind w:firstLine="0"/>
-              <w:jc w:val="center"/>
-              <w:rPr>
-                <w:rFonts w:eastAsia="Calibri"/>
-                <w:bCs/>
-                <w:sz w:val="24"/>
-              </w:rPr>
-            </w:pPr>
-          </w:p>
-        </w:tc>
-        <w:tc>
-          <w:tcPr>
-            <w:tcW w:w="1182" w:type="pct"/>
+            <w:tcW w:w="5000" w:type="pct"/>
+            <w:gridSpan w:val="5"/>
             <w:vAlign w:val="center"/>
           </w:tcPr>
           <w:p>
@@ -4860,59 +5737,6 @@
               </w:rPr>
               <w:t>Этап 4. Внедрение</w:t>
             </w:r>
-          </w:p>
-        </w:tc>
-        <w:tc>
-          <w:tcPr>
-            <w:tcW w:w="801" w:type="pct"/>
-          </w:tcPr>
-          <w:p>
-            <w:pPr>
-              <w:spacing w:line="23" w:lineRule="atLeast"/>
-              <w:ind w:firstLine="0"/>
-              <w:jc w:val="left"/>
-              <w:rPr>
-                <w:rFonts w:eastAsia="Calibri"/>
-                <w:bCs/>
-                <w:sz w:val="24"/>
-              </w:rPr>
-            </w:pPr>
-          </w:p>
-        </w:tc>
-        <w:tc>
-          <w:tcPr>
-            <w:tcW w:w="1448" w:type="pct"/>
-            <w:vAlign w:val="center"/>
-          </w:tcPr>
-          <w:p>
-            <w:pPr>
-              <w:spacing w:line="23" w:lineRule="atLeast"/>
-              <w:ind w:firstLine="0"/>
-              <w:jc w:val="left"/>
-              <w:rPr>
-                <w:rFonts w:eastAsia="Calibri"/>
-                <w:bCs/>
-                <w:sz w:val="24"/>
-              </w:rPr>
-            </w:pPr>
-          </w:p>
-        </w:tc>
-        <w:tc>
-          <w:tcPr>
-            <w:tcW w:w="1267" w:type="pct"/>
-            <w:vAlign w:val="center"/>
-          </w:tcPr>
-          <w:p>
-            <w:pPr>
-              <w:spacing w:line="23" w:lineRule="atLeast"/>
-              <w:ind w:firstLine="0"/>
-              <w:jc w:val="left"/>
-              <w:rPr>
-                <w:rFonts w:eastAsia="Calibri"/>
-                <w:bCs/>
-                <w:sz w:val="24"/>
-              </w:rPr>
-            </w:pPr>
           </w:p>
         </w:tc>
       </w:tr>
@@ -5779,7 +6603,7 @@
     </w:p>
     <w:p>
       <w:pPr>
-        <w:ind w:firstLine="0"/>
+        <w:pStyle w:val="1"/>
         <w:rPr>
           <w:lang w:val="ru-RU"/>
         </w:rPr>
@@ -5802,7 +6626,62 @@
         <w:rPr>
           <w:lang w:val="ru-RU"/>
         </w:rPr>
-        <w:t>…</w:t>
+        <w:t>Для реализации поставленных перед проектом задач необходимо выбрать такие инструменты, которые бы позволили сделать транскрибирование аудио достаточно быстрым и достаточно точным, при этом затрачивая на это как можно меньшее количество как денежных, так и технических и человеческих средств.</w:t>
+      </w:r>
+    </w:p>
+    <w:p>
+      <w:pPr>
+        <w:rPr>
+          <w:lang w:val="ru-RU"/>
+        </w:rPr>
+      </w:pPr>
+      <w:r>
+        <w:rPr>
+          <w:lang w:val="ru-RU"/>
+        </w:rPr>
+        <w:t xml:space="preserve">Чтобы реализовать программный продукт необходимо определиться с тем какой язык программирования будет более предпочтителен для решения поставленных задач. </w:t>
+      </w:r>
+      <w:r>
+        <w:t xml:space="preserve">Язык программирования - это инструмент, с помощью которого программисты создают инструкции для компьютера. Эти инструкции могут быть простыми, как "вывести на экран сообщение", или сложными, как "создать трехмерную игру". Существует множество различных языков программирования, каждый из которых имеет свои особенности и предназначен для решения </w:t>
+      </w:r>
+      <w:r>
+        <w:rPr>
+          <w:lang w:val="ru-RU"/>
+        </w:rPr>
+        <w:t>специфичных</w:t>
+      </w:r>
+      <w:r>
+        <w:t xml:space="preserve"> задач.</w:t>
+      </w:r>
+      <w:r>
+        <w:rPr>
+          <w:lang w:val="ru-RU"/>
+        </w:rPr>
+        <w:t xml:space="preserve"> </w:t>
+      </w:r>
+      <w:r>
+        <w:rPr>
+          <w:lang w:val="ru-RU"/>
+        </w:rPr>
+        <w:t>[#</w:t>
+      </w:r>
+      <w:r>
+        <w:rPr>
+          <w:lang w:val="ru-RU"/>
+        </w:rPr>
+        <w:t>дс 20</w:t>
+      </w:r>
+      <w:r>
+        <w:rPr>
+          <w:lang w:val="ru-RU"/>
+        </w:rPr>
+        <w:t>]</w:t>
+      </w:r>
+      <w:r>
+        <w:rPr>
+          <w:lang w:val="ru-RU"/>
+        </w:rPr>
+        <w:t>.</w:t>
       </w:r>
     </w:p>
     <w:p>
@@ -5884,13 +6763,7 @@
         <w:rPr>
           <w:lang w:val="ru-RU"/>
         </w:rPr>
-        <w:t xml:space="preserve">дс </w:t>
-      </w:r>
-      <w:r>
-        <w:rPr>
-          <w:lang w:val="ru-RU"/>
-        </w:rPr>
-        <w:t>19</w:t>
+        <w:t>дс 19</w:t>
       </w:r>
       <w:r>
         <w:rPr>
@@ -5966,7 +6839,14 @@
         <w:rPr>
           <w:color w:val="000000"/>
         </w:rPr>
-        <w:t>]. Его преимуществами являются максимальная производительность и наличие возможностей для работы с системными ресурсами и оптимизации. Недостатком является сложность в поддержке и масштабировании.</w:t>
+        <w:t xml:space="preserve">]. Его преимуществами являются максимальная производительность и наличие возможностей для работы с системными ресурсами и </w:t>
+      </w:r>
+      <w:r>
+        <w:rPr>
+          <w:color w:val="000000"/>
+        </w:rPr>
+        <w:lastRenderedPageBreak/>
+        <w:t>оптимизации. Недостатком является сложность в поддержке и масштабировании.</w:t>
       </w:r>
     </w:p>
     <w:p>
@@ -6041,7 +6921,19 @@
         <w:rPr>
           <w:color w:val="000000"/>
         </w:rPr>
-        <w:t>JavaScript – универсальный язык программирования, ориентированный на разработку web-интерфейсов [</w:t>
+        <w:t xml:space="preserve">JavaScript – универсальный язык программирования, ориентированный на разработку </w:t>
+      </w:r>
+      <w:r>
+        <w:rPr>
+          <w:color w:val="000000"/>
+        </w:rPr>
+        <w:t>W</w:t>
+      </w:r>
+      <w:r>
+        <w:rPr>
+          <w:color w:val="000000"/>
+        </w:rPr>
+        <w:t>eb-интерфейсов [</w:t>
       </w:r>
       <w:r>
         <w:rPr>
@@ -6066,76 +6958,221 @@
         <w:rPr>
           <w:color w:val="000000"/>
         </w:rPr>
-        <w:t xml:space="preserve">]. К его преимуществам относится его поддержка всеми браузерами, наличие большого </w:t>
+        <w:t xml:space="preserve">]. К его преимуществам относится его поддержка всеми браузерами, наличие большого количества </w:t>
       </w:r>
       <w:r>
         <w:rPr>
           <w:color w:val="000000"/>
+          <w:lang w:val="ru-RU"/>
+        </w:rPr>
+        <w:t>готовых инструментов</w:t>
+      </w:r>
+      <w:r>
+        <w:rPr>
+          <w:color w:val="000000"/>
+        </w:rPr>
+        <w:t>, а также возможность создания динамичных интерфейсов. Однако он не оптимален для высокопроизводительных задач.</w:t>
+      </w:r>
+    </w:p>
+    <w:p>
+      <w:pPr>
+        <w:rPr>
+          <w:lang w:val="ru-RU"/>
+        </w:rPr>
+      </w:pPr>
+      <w:r>
+        <w:rPr>
+          <w:lang w:val="ru-RU"/>
+        </w:rPr>
+        <w:t xml:space="preserve">Для реализации части обработки аудио был выбран язык программирования </w:t>
+      </w:r>
+      <w:r>
+        <w:rPr>
+          <w:lang w:val="en-US"/>
+        </w:rPr>
+        <w:t>Python</w:t>
+      </w:r>
+      <w:r>
+        <w:rPr>
+          <w:lang w:val="ru-RU"/>
+        </w:rPr>
+        <w:t xml:space="preserve"> </w:t>
+      </w:r>
+      <w:r>
+        <w:rPr>
+          <w:lang w:val="ru-RU"/>
+        </w:rPr>
+        <w:t xml:space="preserve">за его гибкие возможности в сфере обработки данных и наличия удобных инструментов для решения задач при помощи искусственного интеллекта. Пользовательский интерфейс программы по началу было решено исполнить на том же языке программирования, однако заказчик выразил пожелание чтобы интерфейс программы открывался при помощи браузера, поэтому был выполнен переход на язык программирования </w:t>
+      </w:r>
+      <w:r>
+        <w:rPr>
+          <w:lang w:val="en-US"/>
+        </w:rPr>
+        <w:t>Java</w:t>
+      </w:r>
+      <w:r>
+        <w:rPr>
+          <w:lang w:val="ru-RU"/>
+        </w:rPr>
+        <w:t xml:space="preserve"> </w:t>
+      </w:r>
+      <w:r>
+        <w:rPr>
+          <w:lang w:val="en-US"/>
+        </w:rPr>
+        <w:t>Script</w:t>
+      </w:r>
+      <w:r>
+        <w:rPr>
+          <w:lang w:val="ru-RU"/>
+        </w:rPr>
+        <w:t>.</w:t>
+      </w:r>
+      <w:r>
+        <w:rPr>
+          <w:lang w:val="ru-RU"/>
+        </w:rPr>
+        <w:t xml:space="preserve"> Этот язык создан для того, чтобы работать в браузере и управлять поведением </w:t>
+      </w:r>
+      <w:r>
+        <w:rPr>
+          <w:lang w:val="en-US"/>
+        </w:rPr>
+        <w:t>Web</w:t>
+      </w:r>
+      <w:r>
+        <w:rPr>
+          <w:lang w:val="ru-RU"/>
+        </w:rPr>
+        <w:t>-</w:t>
+      </w:r>
+      <w:r>
+        <w:rPr>
+          <w:lang w:val="ru-RU"/>
+        </w:rPr>
+        <w:t>страниц, из-за чего идеально подходит для решения поставленной задачи.</w:t>
+      </w:r>
+    </w:p>
+    <w:p>
+      <w:pPr>
+        <w:rPr>
+          <w:lang w:val="ru-RU"/>
+        </w:rPr>
+      </w:pPr>
+      <w:r>
+        <w:rPr>
+          <w:lang w:val="ru-RU"/>
+        </w:rPr>
+        <w:t>Для эффективной разработки программного продукта необходима среда разработки (</w:t>
+      </w:r>
+      <w:r>
+        <w:rPr>
+          <w:lang w:val="en-US"/>
+        </w:rPr>
+        <w:t>IDE</w:t>
+      </w:r>
+      <w:r>
+        <w:rPr>
+          <w:lang w:val="ru-RU"/>
+        </w:rPr>
+        <w:t>).</w:t>
+      </w:r>
+      <w:r>
+        <w:rPr>
+          <w:lang w:val="ru-RU"/>
+        </w:rPr>
+        <w:t xml:space="preserve"> </w:t>
+      </w:r>
+      <w:r>
+        <w:rPr>
+          <w:lang w:val="ru-RU"/>
+        </w:rPr>
+        <w:t xml:space="preserve">Среда разработки </w:t>
+      </w:r>
+      <w:r>
+        <w:rPr>
+          <w:lang w:val="ru-RU"/>
+        </w:rPr>
+        <w:t>–</w:t>
+      </w:r>
+      <w:r>
+        <w:rPr>
+          <w:lang w:val="ru-RU"/>
+        </w:rPr>
+        <w:t xml:space="preserve"> это набор процедур и инструментов для разработки, тестирования и отладки приложения или программы. Другими словами, среда разработки программного обеспечения и веб-разработки </w:t>
+      </w:r>
+      <w:r>
+        <w:rPr>
+          <w:lang w:val="ru-RU"/>
+        </w:rPr>
+        <w:t>— это</w:t>
+      </w:r>
+      <w:r>
+        <w:rPr>
+          <w:lang w:val="ru-RU"/>
+        </w:rPr>
+        <w:t xml:space="preserve"> </w:t>
+      </w:r>
+      <w:r>
+        <w:rPr>
+          <w:lang w:val="ru-RU"/>
         </w:rPr>
         <w:lastRenderedPageBreak/>
-        <w:t>количества библиотек и фреймворков, а также возможность создания динамичных интерфейсов. Однако он не оптимален для высокопроизводительных серверных задач.</w:t>
-      </w:r>
-    </w:p>
-    <w:p>
-      <w:pPr>
-        <w:rPr>
-          <w:lang w:val="ru-RU"/>
-        </w:rPr>
-      </w:pPr>
-      <w:r>
-        <w:rPr>
-          <w:lang w:val="ru-RU"/>
-        </w:rPr>
-        <w:t xml:space="preserve">В качестве основного языка программирования был выбран язык программирования </w:t>
-      </w:r>
-      <w:r>
-        <w:rPr>
-          <w:lang w:val="en-US"/>
-        </w:rPr>
-        <w:t>Python</w:t>
-      </w:r>
-      <w:r>
-        <w:rPr>
-          <w:lang w:val="ru-RU"/>
-        </w:rPr>
-        <w:t xml:space="preserve">, а для разработки интерфейса программы был выбран </w:t>
-      </w:r>
-      <w:r>
-        <w:rPr>
-          <w:lang w:val="en-US"/>
-        </w:rPr>
-        <w:t>JavaScript</w:t>
-      </w:r>
-      <w:r>
-        <w:rPr>
-          <w:lang w:val="ru-RU"/>
-        </w:rPr>
-        <w:t>.</w:t>
-      </w:r>
-    </w:p>
-    <w:p>
-      <w:pPr>
-        <w:rPr>
-          <w:lang w:val="ru-RU"/>
-        </w:rPr>
-      </w:pPr>
-      <w:r>
-        <w:rPr>
-          <w:lang w:val="ru-RU"/>
-        </w:rPr>
-        <w:t>Для эффективной разработки программного продукта необходима среда разработки (</w:t>
-      </w:r>
-      <w:r>
-        <w:rPr>
-          <w:lang w:val="en-US"/>
-        </w:rPr>
-        <w:t>IDE</w:t>
-      </w:r>
-      <w:r>
-        <w:rPr>
-          <w:lang w:val="ru-RU"/>
-        </w:rPr>
-        <w:t>). Среди вариантов сред разработки рассматривались:</w:t>
+        <w:t>рабочая среда</w:t>
+      </w:r>
+      <w:r>
+        <w:rPr>
+          <w:lang w:val="ru-RU"/>
+        </w:rPr>
+        <w:t xml:space="preserve"> для </w:t>
+      </w:r>
+      <w:r>
+        <w:rPr>
+          <w:lang w:val="ru-RU"/>
+        </w:rPr>
+        <w:t>разработчиков, в которой можно вносить изменения, не нарушая ничего в реальной среде. Интегрированная среда разработки часто используются как инструмент программирования, чтобы помочь разработчику</w:t>
+      </w:r>
+      <w:r>
+        <w:rPr>
+          <w:lang w:val="ru-RU"/>
+        </w:rPr>
+        <w:t xml:space="preserve">. </w:t>
+      </w:r>
+      <w:r>
+        <w:rPr>
+          <w:lang w:val="ru-RU"/>
+        </w:rPr>
+        <w:t>[#</w:t>
+      </w:r>
+      <w:r>
+        <w:rPr>
+          <w:lang w:val="ru-RU"/>
+        </w:rPr>
+        <w:t>дс 21</w:t>
+      </w:r>
+      <w:r>
+        <w:rPr>
+          <w:lang w:val="ru-RU"/>
+        </w:rPr>
+        <w:t xml:space="preserve">]. </w:t>
+      </w:r>
+      <w:r>
+        <w:rPr>
+          <w:lang w:val="ru-RU"/>
+        </w:rPr>
+        <w:t>Среди вариантов сред разработки</w:t>
+      </w:r>
+      <w:r>
+        <w:rPr>
+          <w:lang w:val="ru-RU"/>
+        </w:rPr>
+        <w:t>, которые подойдут для написания программы на выбранных языках программирования</w:t>
+      </w:r>
+      <w:r>
+        <w:rPr>
+          <w:lang w:val="ru-RU"/>
+        </w:rPr>
+        <w:t xml:space="preserve"> рассматривались:</w:t>
       </w:r>
     </w:p>
     <w:p>
@@ -6220,13 +7257,7 @@
         <w:rPr>
           <w:lang w:val="ru-RU"/>
         </w:rPr>
-        <w:t xml:space="preserve"> [#дс 3]. </w:t>
-      </w:r>
-      <w:r>
-        <w:rPr>
-          <w:lang w:val="ru-RU"/>
-        </w:rPr>
-        <w:t>Недостатком этой среды является довольно небольшая функциональность при начале работы с ней.</w:t>
+        <w:t xml:space="preserve"> [#дс 3].</w:t>
       </w:r>
     </w:p>
     <w:p>
@@ -6329,31 +7360,43 @@
         <w:rPr>
           <w:lang w:val="ru-RU"/>
         </w:rPr>
-        <w:t xml:space="preserve">, глубокий рефакторинг, организацией архитектуры, управлением зависимостями и многими другими. Основным недостатком является тяжеловесность всей платформы </w:t>
+        <w:t xml:space="preserve">, глубокий рефакторинг, организацией архитектуры, управлением зависимостями и многими другими. </w:t>
+      </w:r>
+      <w:r>
+        <w:rPr>
+          <w:lang w:val="ru-RU"/>
+        </w:rPr>
+        <w:t xml:space="preserve">Для работы с языком программирования </w:t>
       </w:r>
       <w:r>
         <w:rPr>
           <w:lang w:val="en-US"/>
         </w:rPr>
-        <w:t>JetBrains</w:t>
-      </w:r>
-      <w:r>
-        <w:rPr>
-          <w:lang w:val="ru-RU"/>
-        </w:rPr>
-        <w:t xml:space="preserve">, на которой построена </w:t>
+        <w:t>Java</w:t>
+      </w:r>
+      <w:r>
+        <w:rPr>
+          <w:lang w:val="ru-RU"/>
+        </w:rPr>
+        <w:t xml:space="preserve"> </w:t>
       </w:r>
       <w:r>
         <w:rPr>
           <w:lang w:val="en-US"/>
         </w:rPr>
-        <w:t>IDE</w:t>
-      </w:r>
-      <w:r>
-        <w:rPr>
-          <w:lang w:val="ru-RU"/>
-        </w:rPr>
-        <w:t>. Она требует большое количество оперативной памяти и места на диске для работы всех своих инструментов.</w:t>
+        <w:t>Script</w:t>
+      </w:r>
+      <w:r>
+        <w:rPr>
+          <w:lang w:val="ru-RU"/>
+        </w:rPr>
+        <w:t xml:space="preserve"> </w:t>
+      </w:r>
+      <w:r>
+        <w:rPr>
+          <w:lang w:val="ru-RU"/>
+        </w:rPr>
+        <w:t>потребуется дополнительно установить расширения.</w:t>
       </w:r>
     </w:p>
     <w:p>
@@ -6408,130 +7451,192 @@
         <w:rPr>
           <w:lang w:val="ru-RU"/>
         </w:rPr>
-        <w:t xml:space="preserve">, разрабатываемая уже на протяжении 25 лет. Предоставляет все </w:t>
-      </w:r>
+        <w:t xml:space="preserve">, разрабатываемая уже на протяжении 25 лет. Предоставляет все необходимые функции, такие как: подсветка и анализ кода, работа с отладчиком, отображение документации, структуры проекта и многие другие. Распространяется по платной модели, но имеет 30-дневную пробную версию </w:t>
+      </w:r>
+      <w:r>
+        <w:rPr>
+          <w:lang w:val="ru-RU"/>
+        </w:rPr>
+        <w:t>[#</w:t>
+      </w:r>
+      <w:r>
+        <w:rPr>
+          <w:lang w:val="ru-RU"/>
+        </w:rPr>
+        <w:t>дс 10</w:t>
+      </w:r>
+      <w:r>
+        <w:rPr>
+          <w:lang w:val="ru-RU"/>
+        </w:rPr>
+        <w:t>]</w:t>
+      </w:r>
+      <w:r>
+        <w:rPr>
+          <w:lang w:val="ru-RU"/>
+        </w:rPr>
+        <w:t xml:space="preserve">. К сожалению, эта среда разработки не может предоставить многие современные возможности и </w:t>
+      </w:r>
+      <w:r>
+        <w:rPr>
+          <w:lang w:val="ru-RU"/>
+        </w:rPr>
+        <w:t>не поддерживает работу с несколькими языками программирования.</w:t>
+      </w:r>
+    </w:p>
+    <w:p>
+      <w:pPr>
+        <w:rPr>
+          <w:lang w:val="ru-RU"/>
+        </w:rPr>
+      </w:pPr>
       <w:r>
         <w:rPr>
           <w:lang w:val="ru-RU"/>
         </w:rPr>
         <w:lastRenderedPageBreak/>
-        <w:t xml:space="preserve">необходимые функции, такие как: подсветка и анализ кода, работа с отладчиком, отображение документации, структуры проекта и многие другие. Распространяется по платной модели, но имеет 30-дневную пробную версию </w:t>
-      </w:r>
-      <w:r>
-        <w:rPr>
-          <w:lang w:val="ru-RU"/>
-        </w:rPr>
-        <w:t>[#</w:t>
-      </w:r>
-      <w:r>
-        <w:rPr>
-          <w:lang w:val="ru-RU"/>
-        </w:rPr>
-        <w:t>дс 10</w:t>
-      </w:r>
-      <w:r>
-        <w:rPr>
-          <w:lang w:val="ru-RU"/>
+        <w:t xml:space="preserve">Из всех </w:t>
+      </w:r>
+      <w:r>
+        <w:rPr>
+          <w:lang w:val="ru-RU"/>
+        </w:rPr>
+        <w:t>вышеописанных</w:t>
+      </w:r>
+      <w:r>
+        <w:rPr>
+          <w:lang w:val="ru-RU"/>
+        </w:rPr>
+        <w:t xml:space="preserve"> вариантов была выбрана среда разработки </w:t>
+      </w:r>
+      <w:r>
+        <w:rPr>
+          <w:lang w:val="en-US"/>
+        </w:rPr>
+        <w:t>Visual</w:t>
+      </w:r>
+      <w:r>
+        <w:rPr>
+          <w:lang w:val="ru-RU"/>
+        </w:rPr>
+        <w:t xml:space="preserve"> </w:t>
+      </w:r>
+      <w:r>
+        <w:rPr>
+          <w:lang w:val="en-US"/>
+        </w:rPr>
+        <w:t>Studio</w:t>
+      </w:r>
+      <w:r>
+        <w:rPr>
+          <w:lang w:val="ru-RU"/>
+        </w:rPr>
+        <w:t xml:space="preserve"> </w:t>
+      </w:r>
+      <w:r>
+        <w:rPr>
+          <w:lang w:val="en-US"/>
+        </w:rPr>
+        <w:t>Code</w:t>
+      </w:r>
+      <w:r>
+        <w:rPr>
+          <w:lang w:val="ru-RU"/>
+        </w:rPr>
+        <w:t xml:space="preserve"> </w:t>
+      </w:r>
+      <w:r>
+        <w:rPr>
+          <w:lang w:val="ru-RU"/>
+        </w:rPr>
+        <w:t xml:space="preserve">из-за сравнительно быстрой работы, чистого интерфейса и </w:t>
+      </w:r>
+      <w:r>
+        <w:rPr>
+          <w:lang w:val="ru-RU"/>
+        </w:rPr>
+        <w:t>большого количества расширений</w:t>
+      </w:r>
+      <w:r>
+        <w:rPr>
+          <w:lang w:val="ru-RU"/>
+        </w:rPr>
+        <w:t xml:space="preserve">, с помощью которых можно добавить полную поддержку </w:t>
+      </w:r>
+      <w:r>
+        <w:rPr>
+          <w:lang w:val="ru-RU"/>
+        </w:rPr>
+        <w:t>необходимых для работы языков программирования</w:t>
+      </w:r>
+      <w:r>
+        <w:rPr>
+          <w:lang w:val="ru-RU"/>
+        </w:rPr>
+        <w:t>.</w:t>
+      </w:r>
+    </w:p>
+    <w:p>
+      <w:pPr>
+        <w:rPr>
+          <w:lang w:val="ru-RU"/>
+        </w:rPr>
+      </w:pPr>
+      <w:r>
+        <w:t>Выбор оптимального инструмента для транскрибации остается нетривиальной задачей из-за компромисса между точностью, скоростью и ресурсоемкостью</w:t>
+      </w:r>
+      <w:r>
+        <w:rPr>
+          <w:lang w:val="ru-RU"/>
+        </w:rPr>
+        <w:t xml:space="preserve"> [</w:t>
+      </w:r>
+      <w:r>
+        <w:rPr>
+          <w:lang w:val="en-US"/>
+        </w:rPr>
+        <w:t>#</w:t>
+      </w:r>
+      <w:proofErr w:type="spellStart"/>
+      <w:r>
+        <w:rPr>
+          <w:lang w:val="ru-RU"/>
+        </w:rPr>
+        <w:t>дс</w:t>
+      </w:r>
+      <w:proofErr w:type="spellEnd"/>
+      <w:r>
+        <w:rPr>
+          <w:lang w:val="ru-RU"/>
+        </w:rPr>
+        <w:t xml:space="preserve"> 28</w:t>
+      </w:r>
+      <w:r>
+        <w:rPr>
+          <w:lang w:val="en-US"/>
         </w:rPr>
         <w:t>]</w:t>
       </w:r>
       <w:r>
-        <w:rPr>
-          <w:lang w:val="ru-RU"/>
-        </w:rPr>
-        <w:t>. К сожалению, эта среда разработки не может предоставить многие современные возможности и не является такой гибкой как многие её аналоги.</w:t>
-      </w:r>
-    </w:p>
-    <w:p>
-      <w:pPr>
-        <w:rPr>
-          <w:lang w:val="ru-RU"/>
-        </w:rPr>
-      </w:pPr>
-      <w:r>
-        <w:rPr>
-          <w:lang w:val="ru-RU"/>
-        </w:rPr>
-        <w:t xml:space="preserve">Из всех представленных вариантов была выбрана среда разработки </w:t>
-      </w:r>
-      <w:r>
-        <w:rPr>
-          <w:lang w:val="en-US"/>
-        </w:rPr>
-        <w:t>Visual</w:t>
-      </w:r>
-      <w:r>
-        <w:rPr>
-          <w:lang w:val="ru-RU"/>
-        </w:rPr>
+        <w:t>.</w:t>
+      </w:r>
+      <w:r>
         <w:t xml:space="preserve"> </w:t>
       </w:r>
       <w:r>
-        <w:rPr>
-          <w:lang w:val="en-US"/>
-        </w:rPr>
-        <w:t>Studio</w:t>
-      </w:r>
-      <w:r>
-        <w:rPr>
-          <w:lang w:val="ru-RU"/>
-        </w:rPr>
-        <w:t xml:space="preserve"> </w:t>
-      </w:r>
-      <w:r>
-        <w:rPr>
-          <w:lang w:val="en-US"/>
-        </w:rPr>
-        <w:t>Code</w:t>
-      </w:r>
-      <w:r>
-        <w:rPr>
-          <w:lang w:val="ru-RU"/>
-        </w:rPr>
-        <w:t xml:space="preserve"> </w:t>
-      </w:r>
-      <w:r>
-        <w:rPr>
-          <w:lang w:val="ru-RU"/>
-        </w:rPr>
-        <w:t xml:space="preserve">из-за сравнительно быстрой работы, чистого интерфейса и поддержки плагинов, с помощью которых можно нивелировать недостаток низкой функциональности и добавить полную поддержку языка </w:t>
-      </w:r>
-      <w:r>
-        <w:rPr>
-          <w:lang w:val="en-US"/>
-        </w:rPr>
-        <w:t>Python</w:t>
-      </w:r>
-      <w:r>
-        <w:rPr>
-          <w:lang w:val="ru-RU"/>
-        </w:rPr>
-        <w:t>.</w:t>
-      </w:r>
-    </w:p>
-    <w:p>
-      <w:pPr>
-        <w:rPr>
-          <w:lang w:val="ru-RU"/>
-        </w:rPr>
-      </w:pPr>
-      <w:r>
-        <w:rPr>
-          <w:lang w:val="ru-RU"/>
-        </w:rPr>
-        <w:t xml:space="preserve">Выбор происходил </w:t>
-      </w:r>
-      <w:r>
-        <w:rPr>
-          <w:lang w:val="ru-RU"/>
-        </w:rPr>
-        <w:t xml:space="preserve">среди </w:t>
-      </w:r>
-      <w:r>
-        <w:rPr>
-          <w:lang w:val="ru-RU"/>
-        </w:rPr>
-        <w:t>следующих технологий транскрибирования речи:</w:t>
+        <w:t>Система транскрибирования речи является «серцем» всего проекта, поэтому крайне важно выбрать</w:t>
+      </w:r>
+      <w:r>
+        <w:rPr>
+          <w:lang w:val="ru-RU"/>
+        </w:rPr>
+        <w:t xml:space="preserve"> такой вариант, который бы позволил как можно лучше выполнить пожелания заказчика и оправдал ожидания от разрабатываемого продукта. </w:t>
+      </w:r>
+      <w:r>
+        <w:rPr>
+          <w:lang w:val="ru-RU"/>
+        </w:rPr>
+        <w:t>Выбор происходил среди следующих технологий транскрибирования речи:</w:t>
       </w:r>
     </w:p>
     <w:p>
@@ -6871,6 +7976,7 @@
           <w:ilvl w:val="0"/>
           <w:numId w:val="5"/>
         </w:numPr>
+        <w:ind w:left="851"/>
         <w:rPr>
           <w:lang w:val="ru-RU"/>
         </w:rPr>
@@ -6923,13 +8029,7 @@
         <w:rPr>
           <w:lang w:val="ru-RU"/>
         </w:rPr>
-        <w:t>, описанной выше</w:t>
-      </w:r>
-      <w:r>
-        <w:rPr>
-          <w:lang w:val="ru-RU"/>
-        </w:rPr>
-        <w:t xml:space="preserve"> –</w:t>
+        <w:t>, описанной выше –</w:t>
       </w:r>
       <w:r>
         <w:rPr>
@@ -7106,13 +8206,103 @@
         <w:rPr>
           <w:lang w:val="en-US"/>
         </w:rPr>
+        <w:t>OpenAI</w:t>
+      </w:r>
+      <w:r>
+        <w:rPr>
+          <w:lang w:val="ru-RU"/>
+        </w:rPr>
+        <w:t xml:space="preserve"> </w:t>
+      </w:r>
+      <w:r>
+        <w:rPr>
+          <w:lang w:val="en-US"/>
+        </w:rPr>
         <w:t>Whisper</w:t>
       </w:r>
       <w:r>
         <w:rPr>
           <w:lang w:val="ru-RU"/>
         </w:rPr>
-        <w:t xml:space="preserve"> из-за своей репутации как надёжной и точной системы, но после того, как предоставленные ограничения на её пользование обойдены не были, а также когда собственная реализация </w:t>
+        <w:t xml:space="preserve"> из-за </w:t>
+      </w:r>
+      <w:r>
+        <w:rPr>
+          <w:lang w:val="ru-RU"/>
+        </w:rPr>
+        <w:t>хорошей</w:t>
+      </w:r>
+      <w:r>
+        <w:rPr>
+          <w:lang w:val="ru-RU"/>
+        </w:rPr>
+        <w:t xml:space="preserve"> репутации </w:t>
+      </w:r>
+      <w:r>
+        <w:rPr>
+          <w:lang w:val="ru-RU"/>
+        </w:rPr>
+        <w:t>в качестве</w:t>
+      </w:r>
+      <w:r>
+        <w:rPr>
+          <w:lang w:val="ru-RU"/>
+        </w:rPr>
+        <w:t xml:space="preserve"> надёжной и точной системы</w:t>
+      </w:r>
+      <w:r>
+        <w:rPr>
+          <w:lang w:val="ru-RU"/>
+        </w:rPr>
+        <w:t xml:space="preserve"> для транскрибирования речи</w:t>
+      </w:r>
+      <w:r>
+        <w:rPr>
+          <w:lang w:val="ru-RU"/>
+        </w:rPr>
+        <w:t xml:space="preserve">, </w:t>
+      </w:r>
+      <w:r>
+        <w:rPr>
+          <w:lang w:val="ru-RU"/>
+        </w:rPr>
+        <w:t xml:space="preserve">но, к сожалению, от неё пришлось отказаться по причине наличия ограничений в использовании со стороны компании </w:t>
+      </w:r>
+      <w:r>
+        <w:rPr>
+          <w:lang w:val="en-US"/>
+        </w:rPr>
+        <w:t>OpenAI</w:t>
+      </w:r>
+      <w:r>
+        <w:rPr>
+          <w:lang w:val="ru-RU"/>
+        </w:rPr>
+        <w:t>.</w:t>
+      </w:r>
+      <w:r>
+        <w:rPr>
+          <w:lang w:val="ru-RU"/>
+        </w:rPr>
+        <w:t xml:space="preserve"> </w:t>
+      </w:r>
+      <w:r>
+        <w:rPr>
+          <w:lang w:val="ru-RU"/>
+        </w:rPr>
+        <w:t>Т</w:t>
+      </w:r>
+      <w:r>
+        <w:rPr>
+          <w:lang w:val="ru-RU"/>
+        </w:rPr>
+        <w:t xml:space="preserve">акже </w:t>
+      </w:r>
+      <w:r>
+        <w:rPr>
+          <w:lang w:val="ru-RU"/>
+        </w:rPr>
+        <w:t xml:space="preserve">с этой системой возникли проблемы реализации достаточно точного алгоритма </w:t>
       </w:r>
       <w:proofErr w:type="spellStart"/>
       <w:r>
@@ -7126,7 +8316,13 @@
         <w:rPr>
           <w:lang w:val="ru-RU"/>
         </w:rPr>
-        <w:t xml:space="preserve"> оказалась крайне неточной было решено перейти на более подходящее решение – </w:t>
+        <w:t>, поэтому б</w:t>
+      </w:r>
+      <w:r>
+        <w:rPr>
+          <w:lang w:val="ru-RU"/>
+        </w:rPr>
+        <w:t xml:space="preserve">ыло решено перейти на более подходящее решение – </w:t>
       </w:r>
       <w:proofErr w:type="spellStart"/>
       <w:r>
@@ -7181,7 +8377,7 @@
     </w:p>
     <w:p>
       <w:pPr>
-        <w:ind w:firstLine="0"/>
+        <w:pStyle w:val="1"/>
         <w:rPr>
           <w:lang w:val="ru-RU"/>
         </w:rPr>
@@ -7192,6 +8388,27 @@
         </w:rPr>
         <w:lastRenderedPageBreak/>
         <w:t>4. Анализ существующих технических решений</w:t>
+      </w:r>
+    </w:p>
+    <w:p>
+      <w:pPr>
+        <w:rPr>
+          <w:lang w:val="en-US"/>
+        </w:rPr>
+      </w:pPr>
+      <w:proofErr w:type="spellStart"/>
+      <w:r>
+        <w:rPr>
+          <w:lang w:val="ru-RU"/>
+        </w:rPr>
+        <w:t>Рыно</w:t>
+      </w:r>
+      <w:proofErr w:type="spellEnd"/>
+      <w:r>
+        <w:rPr>
+          <w:lang w:val="ru-RU"/>
+        </w:rPr>
+        <w:t xml:space="preserve"> к</w:t>
       </w:r>
     </w:p>
     <w:p>
@@ -7295,25 +8512,7 @@
         <w:rPr>
           <w:lang w:val="ru-RU"/>
         </w:rPr>
-        <w:t xml:space="preserve"> - </w:t>
-      </w:r>
-      <w:r>
-        <w:rPr>
-          <w:lang w:val="ru-RU"/>
-        </w:rPr>
-        <w:t>один из</w:t>
-      </w:r>
-      <w:r>
-        <w:rPr>
-          <w:lang w:val="ru-RU"/>
-        </w:rPr>
-        <w:t xml:space="preserve"> </w:t>
-      </w:r>
-      <w:r>
-        <w:rPr>
-          <w:lang w:val="ru-RU"/>
-        </w:rPr>
-        <w:t xml:space="preserve">самых популярных </w:t>
+        <w:t xml:space="preserve"> - один из самых популярных </w:t>
       </w:r>
       <w:r>
         <w:rPr>
@@ -7325,19 +8524,7 @@
         <w:rPr>
           <w:lang w:val="ru-RU"/>
         </w:rPr>
-        <w:t xml:space="preserve"> распознавания речи, чему</w:t>
-      </w:r>
-      <w:r>
-        <w:rPr>
-          <w:lang w:val="ru-RU"/>
-        </w:rPr>
-        <w:t xml:space="preserve"> </w:t>
-      </w:r>
-      <w:r>
-        <w:rPr>
-          <w:lang w:val="ru-RU"/>
-        </w:rPr>
-        <w:t>способствуют следующие достоинства:</w:t>
+        <w:t xml:space="preserve"> распознавания речи, чему способствуют следующие достоинства:</w:t>
       </w:r>
     </w:p>
     <w:p>
@@ -7700,43 +8887,7 @@
         <w:rPr>
           <w:lang w:val="ru-RU"/>
         </w:rPr>
-        <w:t>7. Автоматическая пунктуация, специальные</w:t>
-      </w:r>
-      <w:r>
-        <w:rPr>
-          <w:lang w:val="ru-RU"/>
-        </w:rPr>
-        <w:t xml:space="preserve"> </w:t>
-      </w:r>
-      <w:r>
-        <w:rPr>
-          <w:lang w:val="ru-RU"/>
-        </w:rPr>
-        <w:t>речевые модели и некоторые другие продвинутые</w:t>
-      </w:r>
-      <w:r>
-        <w:rPr>
-          <w:lang w:val="ru-RU"/>
-        </w:rPr>
-        <w:t xml:space="preserve"> </w:t>
-      </w:r>
-      <w:r>
-        <w:rPr>
-          <w:lang w:val="ru-RU"/>
-        </w:rPr>
-        <w:t>функции, доступные для некоторых языков,</w:t>
-      </w:r>
-      <w:r>
-        <w:rPr>
-          <w:lang w:val="ru-RU"/>
-        </w:rPr>
-        <w:t xml:space="preserve"> </w:t>
-      </w:r>
-      <w:r>
-        <w:rPr>
-          <w:lang w:val="ru-RU"/>
-        </w:rPr>
-        <w:t>преимущественно, для английского.</w:t>
+        <w:t>7. Автоматическая пунктуация, специальные речевые модели и некоторые другие продвинутые функции, доступные для некоторых языков, преимущественно, для английского.</w:t>
       </w:r>
     </w:p>
     <w:p>
@@ -7756,43 +8907,7 @@
         <w:rPr>
           <w:lang w:val="ru-RU"/>
         </w:rPr>
-        <w:t xml:space="preserve"> предоставляет готовые библиотеки</w:t>
-      </w:r>
-      <w:r>
-        <w:rPr>
-          <w:lang w:val="ru-RU"/>
-        </w:rPr>
-        <w:t xml:space="preserve"> </w:t>
-      </w:r>
-      <w:r>
-        <w:rPr>
-          <w:lang w:val="ru-RU"/>
-        </w:rPr>
-        <w:t>клиентов для множества языков</w:t>
-      </w:r>
-      <w:r>
-        <w:rPr>
-          <w:lang w:val="ru-RU"/>
-        </w:rPr>
-        <w:t xml:space="preserve"> </w:t>
-      </w:r>
-      <w:r>
-        <w:rPr>
-          <w:lang w:val="ru-RU"/>
-        </w:rPr>
-        <w:t>программирования, что существенно облегчает</w:t>
-      </w:r>
-      <w:r>
-        <w:rPr>
-          <w:lang w:val="ru-RU"/>
-        </w:rPr>
-        <w:t xml:space="preserve"> </w:t>
-      </w:r>
-      <w:r>
-        <w:rPr>
-          <w:lang w:val="ru-RU"/>
-        </w:rPr>
-        <w:t xml:space="preserve">настройку данного </w:t>
+        <w:t xml:space="preserve"> предоставляет готовые библиотеки клиентов для множества языков программирования, что существенно облегчает настройку данного </w:t>
       </w:r>
       <w:r>
         <w:rPr>
@@ -8049,14 +9164,8 @@
         <w:rPr>
           <w:lang w:val="ru-RU"/>
         </w:rPr>
-        <w:t xml:space="preserve">Недостатком сервиса для заказчика же является довольно высокая стоимость (более 750 за час материала), отсутствие возможности </w:t>
-      </w:r>
-      <w:r>
-        <w:rPr>
-          <w:lang w:val="ru-RU"/>
-        </w:rPr>
         <w:lastRenderedPageBreak/>
-        <w:t xml:space="preserve">локальной обработки, </w:t>
+        <w:t xml:space="preserve">Недостатком сервиса для заказчика же является довольно высокая стоимость (более 750 за час материала), отсутствие возможности локальной обработки, </w:t>
       </w:r>
       <w:r>
         <w:rPr>
@@ -8132,10 +9241,7 @@
         </w:rPr>
       </w:pPr>
       <w:r>
-        <w:t>Open Voice OS</w:t>
-      </w:r>
-      <w:r>
-        <w:t xml:space="preserve"> – </w:t>
+        <w:t xml:space="preserve">Open Voice OS – </w:t>
       </w:r>
       <w:r>
         <w:rPr>
@@ -8159,6 +9265,24 @@
         <w:rPr>
           <w:lang w:val="ru-RU"/>
         </w:rPr>
+        <w:t xml:space="preserve"> [#</w:t>
+      </w:r>
+      <w:r>
+        <w:rPr>
+          <w:lang w:val="ru-RU"/>
+        </w:rPr>
+        <w:t>дс 29</w:t>
+      </w:r>
+      <w:r>
+        <w:rPr>
+          <w:lang w:val="ru-RU"/>
+        </w:rPr>
+        <w:t>]</w:t>
+      </w:r>
+      <w:r>
+        <w:rPr>
+          <w:lang w:val="ru-RU"/>
+        </w:rPr>
         <w:t xml:space="preserve"> </w:t>
       </w:r>
       <w:r>
@@ -8257,7 +9381,7 @@
     </w:p>
     <w:p>
       <w:pPr>
-        <w:ind w:firstLine="0"/>
+        <w:pStyle w:val="1"/>
         <w:rPr>
           <w:lang w:val="ru-RU"/>
         </w:rPr>
@@ -8490,21 +9614,7 @@
             <w:rStyle w:val="ac"/>
             <w:lang w:val="ru-RU"/>
           </w:rPr>
-          <w:t>https://elibrary.ru/item.asp?id=5393</w:t>
-        </w:r>
-        <w:r>
-          <w:rPr>
-            <w:rStyle w:val="ac"/>
-            <w:lang w:val="ru-RU"/>
-          </w:rPr>
-          <w:t>5</w:t>
-        </w:r>
-        <w:r>
-          <w:rPr>
-            <w:rStyle w:val="ac"/>
-            <w:lang w:val="ru-RU"/>
-          </w:rPr>
-          <w:t>158</w:t>
+          <w:t>https://elibrary.ru/item.asp?id=53935158</w:t>
         </w:r>
       </w:hyperlink>
     </w:p>
@@ -8658,21 +9768,7 @@
             <w:rStyle w:val="ac"/>
             <w:lang w:val="en-US"/>
           </w:rPr>
-          <w:t>https://openai</w:t>
-        </w:r>
-        <w:r>
-          <w:rPr>
-            <w:rStyle w:val="ac"/>
-            <w:lang w:val="en-US"/>
-          </w:rPr>
-          <w:t>.</w:t>
-        </w:r>
-        <w:r>
-          <w:rPr>
-            <w:rStyle w:val="ac"/>
-            <w:lang w:val="en-US"/>
-          </w:rPr>
-          <w:t>com/index/whisper/</w:t>
+          <w:t>https://openai.com/index/whisper/</w:t>
         </w:r>
       </w:hyperlink>
     </w:p>
@@ -8810,9 +9906,614 @@
           <w:ilvl w:val="0"/>
           <w:numId w:val="3"/>
         </w:numPr>
-        <w:rPr>
-          <w:lang w:val="ru-RU"/>
-        </w:rPr>
+      </w:pPr>
+      <w:hyperlink r:id="rId19" w:history="1">
+        <w:r>
+          <w:rPr>
+            <w:rStyle w:val="ac"/>
+          </w:rPr>
+          <w:t>https://cyberleninka.ru/article/n/yazyki-programmirovaniya-kakimi-byvayut-i-kakoy-vybrat</w:t>
+        </w:r>
+      </w:hyperlink>
+    </w:p>
+    <w:p>
+      <w:pPr>
+        <w:pStyle w:val="a7"/>
+        <w:numPr>
+          <w:ilvl w:val="0"/>
+          <w:numId w:val="3"/>
+        </w:numPr>
+      </w:pPr>
+      <w:hyperlink r:id="rId20" w:history="1">
+        <w:r>
+          <w:rPr>
+            <w:rStyle w:val="ac"/>
+          </w:rPr>
+          <w:t>https://www.google.de/books/edition/%D0%A6%D0%B8%D1%84%D1%80%D0%BE%D0%B2%D1%8B%D0%B5_%D1%82%D0%B5%D1%85%D0%BD%D0%BE%D0%BB%D0%BE%D0%B3%D0%B8%D0%B8_%D0%B0/OIt1EQAAQBAJ?hl=ru&amp;gbpv=1&amp;dq=%22%D1%81%D1%80%D0%B5%D0%B4%D0%B0+%D1%80%D0%B0%D0%B7%D1%80%D0%B0%D0%B1%D0%BE%D1%82%D0%BA%D0%B8+%E2%80%93+%D1%8D%D1%82%D0%BE%22&amp;pg=PA151&amp;printsec=frontcover</w:t>
+        </w:r>
+      </w:hyperlink>
+    </w:p>
+    <w:p>
+      <w:pPr>
+        <w:pStyle w:val="a7"/>
+        <w:numPr>
+          <w:ilvl w:val="0"/>
+          <w:numId w:val="3"/>
+        </w:numPr>
+        <w:rPr>
+          <w:lang w:eastAsia="ru-RU"/>
+        </w:rPr>
+      </w:pPr>
+      <w:r>
+        <w:rPr>
+          <w:lang w:eastAsia="ru-RU"/>
+        </w:rPr>
+        <w:t>Что такое транскрибация и зачем она нужна в современном мире?</w:t>
+      </w:r>
+      <w:r>
+        <w:rPr>
+          <w:lang w:eastAsia="ru-RU"/>
+        </w:rPr>
+        <w:t xml:space="preserve"> </w:t>
+      </w:r>
+      <w:r>
+        <w:rPr>
+          <w:lang w:val="en-US" w:eastAsia="ru-RU"/>
+        </w:rPr>
+        <w:t>URL</w:t>
+      </w:r>
+      <w:r>
+        <w:rPr>
+          <w:lang w:eastAsia="ru-RU"/>
+        </w:rPr>
+        <w:t xml:space="preserve">: </w:t>
+      </w:r>
+      <w:r>
+        <w:fldChar w:fldCharType="begin"/>
+      </w:r>
+      <w:r>
+        <w:instrText>HYPERLINK "https://www.interfax.ru/pressreleases/1042372%20/"</w:instrText>
+      </w:r>
+      <w:r>
+        <w:fldChar w:fldCharType="separate"/>
+      </w:r>
+      <w:r>
+        <w:rPr>
+          <w:rStyle w:val="ac"/>
+          <w:lang w:val="en-US" w:eastAsia="ru-RU"/>
+        </w:rPr>
+        <w:t>https</w:t>
+      </w:r>
+      <w:r>
+        <w:rPr>
+          <w:rStyle w:val="ac"/>
+          <w:lang w:eastAsia="ru-RU"/>
+        </w:rPr>
+        <w:t>://</w:t>
+      </w:r>
+      <w:r>
+        <w:rPr>
+          <w:rStyle w:val="ac"/>
+          <w:lang w:val="en-US" w:eastAsia="ru-RU"/>
+        </w:rPr>
+        <w:t>www</w:t>
+      </w:r>
+      <w:r>
+        <w:rPr>
+          <w:rStyle w:val="ac"/>
+          <w:lang w:eastAsia="ru-RU"/>
+        </w:rPr>
+        <w:t>.</w:t>
+      </w:r>
+      <w:proofErr w:type="spellStart"/>
+      <w:r>
+        <w:rPr>
+          <w:rStyle w:val="ac"/>
+          <w:lang w:val="en-US" w:eastAsia="ru-RU"/>
+        </w:rPr>
+        <w:t>interfax</w:t>
+      </w:r>
+      <w:proofErr w:type="spellEnd"/>
+      <w:r>
+        <w:rPr>
+          <w:rStyle w:val="ac"/>
+          <w:lang w:eastAsia="ru-RU"/>
+        </w:rPr>
+        <w:t>.</w:t>
+      </w:r>
+      <w:proofErr w:type="spellStart"/>
+      <w:r>
+        <w:rPr>
+          <w:rStyle w:val="ac"/>
+          <w:lang w:val="en-US" w:eastAsia="ru-RU"/>
+        </w:rPr>
+        <w:t>ru</w:t>
+      </w:r>
+      <w:proofErr w:type="spellEnd"/>
+      <w:r>
+        <w:rPr>
+          <w:rStyle w:val="ac"/>
+          <w:lang w:eastAsia="ru-RU"/>
+        </w:rPr>
+        <w:t>/</w:t>
+      </w:r>
+      <w:proofErr w:type="spellStart"/>
+      <w:r>
+        <w:rPr>
+          <w:rStyle w:val="ac"/>
+          <w:lang w:val="en-US" w:eastAsia="ru-RU"/>
+        </w:rPr>
+        <w:t>pressreleases</w:t>
+      </w:r>
+      <w:proofErr w:type="spellEnd"/>
+      <w:r>
+        <w:rPr>
+          <w:rStyle w:val="ac"/>
+          <w:lang w:eastAsia="ru-RU"/>
+        </w:rPr>
+        <w:t>/1042372</w:t>
+      </w:r>
+      <w:r>
+        <w:rPr>
+          <w:rStyle w:val="ac"/>
+          <w:color w:val="auto"/>
+          <w:lang w:eastAsia="ru-RU"/>
+        </w:rPr>
+        <w:t xml:space="preserve"> /</w:t>
+      </w:r>
+      <w:r>
+        <w:fldChar w:fldCharType="end"/>
+      </w:r>
+      <w:r>
+        <w:rPr>
+          <w:lang w:eastAsia="ru-RU"/>
+        </w:rPr>
+        <w:t xml:space="preserve"> (</w:t>
+      </w:r>
+      <w:r>
+        <w:rPr>
+          <w:lang w:eastAsia="ru-RU"/>
+        </w:rPr>
+        <w:t>дата обращения 05.12.2025</w:t>
+      </w:r>
+      <w:r>
+        <w:rPr>
+          <w:lang w:eastAsia="ru-RU"/>
+        </w:rPr>
+        <w:t>)</w:t>
+      </w:r>
+    </w:p>
+    <w:p>
+      <w:pPr>
+        <w:pStyle w:val="a7"/>
+        <w:numPr>
+          <w:ilvl w:val="0"/>
+          <w:numId w:val="3"/>
+        </w:numPr>
+        <w:rPr>
+          <w:lang w:eastAsia="ru-RU"/>
+        </w:rPr>
+      </w:pPr>
+      <w:r>
+        <w:rPr>
+          <w:lang w:eastAsia="ru-RU"/>
+        </w:rPr>
+        <w:t>Елизаров, Д. А. применение системы транскрибирования / Д. А. Елизаров, П. Е. Колпакова // Математическое и экспериментальное моделирование физических процессов : Сборник материалов Всероссийской научно-практической конференции с международным участием, Биробиджан, 15 декабря 2022 года / Под научной редакцией В.М. Козина. – Биробиджан: Приамурский государственный университет им. Шолом-Алейхема, 2023. – С. 13-16. – EDN BXAZZQ.</w:t>
+      </w:r>
+      <w:r>
+        <w:rPr>
+          <w:lang w:eastAsia="ru-RU"/>
+        </w:rPr>
+        <w:t xml:space="preserve"> </w:t>
+      </w:r>
+      <w:r>
+        <w:rPr>
+          <w:lang w:val="en-US" w:eastAsia="ru-RU"/>
+        </w:rPr>
+        <w:t>URL</w:t>
+      </w:r>
+      <w:r>
+        <w:rPr>
+          <w:lang w:eastAsia="ru-RU"/>
+        </w:rPr>
+        <w:t xml:space="preserve">: </w:t>
+      </w:r>
+      <w:r>
+        <w:fldChar w:fldCharType="begin"/>
+      </w:r>
+      <w:r>
+        <w:instrText>HYPERLINK "https://elibrary.ru/item.asp?id=50780350"</w:instrText>
+      </w:r>
+      <w:r>
+        <w:fldChar w:fldCharType="separate"/>
+      </w:r>
+      <w:r>
+        <w:rPr>
+          <w:rStyle w:val="ac"/>
+          <w:lang w:val="en-US" w:eastAsia="ru-RU"/>
+        </w:rPr>
+        <w:t>https</w:t>
+      </w:r>
+      <w:r>
+        <w:rPr>
+          <w:rStyle w:val="ac"/>
+          <w:lang w:eastAsia="ru-RU"/>
+        </w:rPr>
+        <w:t>://</w:t>
+      </w:r>
+      <w:proofErr w:type="spellStart"/>
+      <w:r>
+        <w:rPr>
+          <w:rStyle w:val="ac"/>
+          <w:lang w:val="en-US" w:eastAsia="ru-RU"/>
+        </w:rPr>
+        <w:t>elibrary</w:t>
+      </w:r>
+      <w:proofErr w:type="spellEnd"/>
+      <w:r>
+        <w:rPr>
+          <w:rStyle w:val="ac"/>
+          <w:lang w:eastAsia="ru-RU"/>
+        </w:rPr>
+        <w:t>.</w:t>
+      </w:r>
+      <w:proofErr w:type="spellStart"/>
+      <w:r>
+        <w:rPr>
+          <w:rStyle w:val="ac"/>
+          <w:lang w:val="en-US" w:eastAsia="ru-RU"/>
+        </w:rPr>
+        <w:t>ru</w:t>
+      </w:r>
+      <w:proofErr w:type="spellEnd"/>
+      <w:r>
+        <w:rPr>
+          <w:rStyle w:val="ac"/>
+          <w:lang w:eastAsia="ru-RU"/>
+        </w:rPr>
+        <w:t>/</w:t>
+      </w:r>
+      <w:r>
+        <w:rPr>
+          <w:rStyle w:val="ac"/>
+          <w:lang w:val="en-US" w:eastAsia="ru-RU"/>
+        </w:rPr>
+        <w:t>item</w:t>
+      </w:r>
+      <w:r>
+        <w:rPr>
+          <w:rStyle w:val="ac"/>
+          <w:lang w:eastAsia="ru-RU"/>
+        </w:rPr>
+        <w:t>.</w:t>
+      </w:r>
+      <w:r>
+        <w:rPr>
+          <w:rStyle w:val="ac"/>
+          <w:lang w:val="en-US" w:eastAsia="ru-RU"/>
+        </w:rPr>
+        <w:t>asp</w:t>
+      </w:r>
+      <w:r>
+        <w:rPr>
+          <w:rStyle w:val="ac"/>
+          <w:lang w:eastAsia="ru-RU"/>
+        </w:rPr>
+        <w:t>?</w:t>
+      </w:r>
+      <w:r>
+        <w:rPr>
+          <w:rStyle w:val="ac"/>
+          <w:lang w:val="en-US" w:eastAsia="ru-RU"/>
+        </w:rPr>
+        <w:t>id</w:t>
+      </w:r>
+      <w:r>
+        <w:rPr>
+          <w:rStyle w:val="ac"/>
+          <w:lang w:eastAsia="ru-RU"/>
+        </w:rPr>
+        <w:t>=50780350</w:t>
+      </w:r>
+      <w:r>
+        <w:fldChar w:fldCharType="end"/>
+      </w:r>
+      <w:r>
+        <w:rPr>
+          <w:lang w:eastAsia="ru-RU"/>
+        </w:rPr>
+        <w:t xml:space="preserve"> </w:t>
+      </w:r>
+      <w:r>
+        <w:rPr>
+          <w:lang w:eastAsia="ru-RU"/>
+        </w:rPr>
+        <w:t>/ (</w:t>
+      </w:r>
+      <w:r>
+        <w:rPr>
+          <w:lang w:eastAsia="ru-RU"/>
+        </w:rPr>
+        <w:t>дата обращения 05.12.2025</w:t>
+      </w:r>
+      <w:r>
+        <w:rPr>
+          <w:lang w:eastAsia="ru-RU"/>
+        </w:rPr>
+        <w:t>)</w:t>
+      </w:r>
+    </w:p>
+    <w:p>
+      <w:pPr>
+        <w:pStyle w:val="a7"/>
+        <w:numPr>
+          <w:ilvl w:val="0"/>
+          <w:numId w:val="3"/>
+        </w:numPr>
+        <w:rPr>
+          <w:lang w:eastAsia="ru-RU"/>
+        </w:rPr>
+      </w:pPr>
+      <w:r>
+        <w:rPr>
+          <w:lang w:eastAsia="ru-RU"/>
+        </w:rPr>
+        <w:t xml:space="preserve">Толкачева, Е. В. Применение систем автоматического транскрибирования данных фокус-групп при проведении исследований в организациях / Е. В. Толкачева // Инновационная парадигма экономических механизмов хозяйствования : Сборник научных трудов IX Международной научно-практической конференции, Симферополь, 15 мая 2024 года. – Симферополь: ООО "Издательство Типография </w:t>
+      </w:r>
+      <w:r>
+        <w:rPr>
+          <w:lang w:eastAsia="ru-RU"/>
+        </w:rPr>
+        <w:lastRenderedPageBreak/>
+        <w:t>"Ариал", 2024. – С. 656-658. – EDN PZLBXI.</w:t>
+      </w:r>
+      <w:r>
+        <w:rPr>
+          <w:lang w:eastAsia="ru-RU"/>
+        </w:rPr>
+        <w:t xml:space="preserve"> </w:t>
+      </w:r>
+      <w:r>
+        <w:rPr>
+          <w:lang w:val="en-US" w:eastAsia="ru-RU"/>
+        </w:rPr>
+        <w:t>URL</w:t>
+      </w:r>
+      <w:r>
+        <w:rPr>
+          <w:lang w:eastAsia="ru-RU"/>
+        </w:rPr>
+        <w:t xml:space="preserve">: </w:t>
+      </w:r>
+      <w:r>
+        <w:fldChar w:fldCharType="begin"/>
+      </w:r>
+      <w:r>
+        <w:instrText>HYPERLINK "https://elibrary.ru/item.asp?id=67343956"</w:instrText>
+      </w:r>
+      <w:r>
+        <w:fldChar w:fldCharType="separate"/>
+      </w:r>
+      <w:r>
+        <w:rPr>
+          <w:rStyle w:val="ac"/>
+          <w:lang w:val="en-US" w:eastAsia="ru-RU"/>
+        </w:rPr>
+        <w:t>https</w:t>
+      </w:r>
+      <w:r>
+        <w:rPr>
+          <w:rStyle w:val="ac"/>
+          <w:lang w:eastAsia="ru-RU"/>
+        </w:rPr>
+        <w:t>://</w:t>
+      </w:r>
+      <w:proofErr w:type="spellStart"/>
+      <w:r>
+        <w:rPr>
+          <w:rStyle w:val="ac"/>
+          <w:lang w:val="en-US" w:eastAsia="ru-RU"/>
+        </w:rPr>
+        <w:t>elibrary</w:t>
+      </w:r>
+      <w:proofErr w:type="spellEnd"/>
+      <w:r>
+        <w:rPr>
+          <w:rStyle w:val="ac"/>
+          <w:lang w:eastAsia="ru-RU"/>
+        </w:rPr>
+        <w:t>.</w:t>
+      </w:r>
+      <w:proofErr w:type="spellStart"/>
+      <w:r>
+        <w:rPr>
+          <w:rStyle w:val="ac"/>
+          <w:lang w:val="en-US" w:eastAsia="ru-RU"/>
+        </w:rPr>
+        <w:t>ru</w:t>
+      </w:r>
+      <w:proofErr w:type="spellEnd"/>
+      <w:r>
+        <w:rPr>
+          <w:rStyle w:val="ac"/>
+          <w:lang w:eastAsia="ru-RU"/>
+        </w:rPr>
+        <w:t>/</w:t>
+      </w:r>
+      <w:r>
+        <w:rPr>
+          <w:rStyle w:val="ac"/>
+          <w:lang w:val="en-US" w:eastAsia="ru-RU"/>
+        </w:rPr>
+        <w:t>item</w:t>
+      </w:r>
+      <w:r>
+        <w:rPr>
+          <w:rStyle w:val="ac"/>
+          <w:lang w:eastAsia="ru-RU"/>
+        </w:rPr>
+        <w:t>.</w:t>
+      </w:r>
+      <w:r>
+        <w:rPr>
+          <w:rStyle w:val="ac"/>
+          <w:lang w:val="en-US" w:eastAsia="ru-RU"/>
+        </w:rPr>
+        <w:t>asp</w:t>
+      </w:r>
+      <w:r>
+        <w:rPr>
+          <w:rStyle w:val="ac"/>
+          <w:lang w:eastAsia="ru-RU"/>
+        </w:rPr>
+        <w:t>?</w:t>
+      </w:r>
+      <w:r>
+        <w:rPr>
+          <w:rStyle w:val="ac"/>
+          <w:lang w:val="en-US" w:eastAsia="ru-RU"/>
+        </w:rPr>
+        <w:t>id</w:t>
+      </w:r>
+      <w:r>
+        <w:rPr>
+          <w:rStyle w:val="ac"/>
+          <w:lang w:eastAsia="ru-RU"/>
+        </w:rPr>
+        <w:t>=67343956</w:t>
+      </w:r>
+      <w:r>
+        <w:fldChar w:fldCharType="end"/>
+      </w:r>
+      <w:r>
+        <w:rPr>
+          <w:lang w:eastAsia="ru-RU"/>
+        </w:rPr>
+        <w:t xml:space="preserve"> / (</w:t>
+      </w:r>
+      <w:r>
+        <w:rPr>
+          <w:lang w:eastAsia="ru-RU"/>
+        </w:rPr>
+        <w:t>Дата обращения 05. 12. 2025</w:t>
+      </w:r>
+      <w:r>
+        <w:rPr>
+          <w:lang w:eastAsia="ru-RU"/>
+        </w:rPr>
+        <w:t>)</w:t>
+      </w:r>
+    </w:p>
+    <w:p>
+      <w:pPr>
+        <w:pStyle w:val="a7"/>
+        <w:numPr>
+          <w:ilvl w:val="0"/>
+          <w:numId w:val="3"/>
+        </w:numPr>
+        <w:rPr>
+          <w:lang w:eastAsia="ru-RU"/>
+        </w:rPr>
+      </w:pPr>
+      <w:r>
+        <w:rPr>
+          <w:lang w:eastAsia="ru-RU"/>
+        </w:rPr>
+        <w:t xml:space="preserve"> </w:t>
+      </w:r>
+      <w:r>
+        <w:rPr>
+          <w:lang w:eastAsia="ru-RU"/>
+        </w:rPr>
+        <w:t>Введенская В. В. Транскрибация как метод научного исследования в юриспруденции / В. В. Введенская // Вопросы российского и международного права. - 2021. - Т. 11, № 2A. - С. 262-269 .</w:t>
+      </w:r>
+    </w:p>
+    <w:p>
+      <w:pPr>
+        <w:pStyle w:val="a7"/>
+        <w:numPr>
+          <w:ilvl w:val="0"/>
+          <w:numId w:val="3"/>
+        </w:numPr>
+        <w:rPr>
+          <w:lang w:eastAsia="ru-RU"/>
+        </w:rPr>
+      </w:pPr>
+      <w:r>
+        <w:rPr>
+          <w:lang w:eastAsia="ru-RU"/>
+        </w:rPr>
+        <w:t>Сивков М. Н. Проблемы и особенности транскрибирования социологических интервью / М. Н. Сивков // Документ. Архив. История. Современность: Сборник научных трудов / Гл. редактор Л.Н. Мазур. Том Выпуск 23. - Екатеринбург: Уральский федеральный университет имени первого Президента России Б.Н. Ельцина, 2023. - С. 14-21.</w:t>
+      </w:r>
+    </w:p>
+    <w:p>
+      <w:pPr>
+        <w:pStyle w:val="a7"/>
+        <w:numPr>
+          <w:ilvl w:val="0"/>
+          <w:numId w:val="3"/>
+        </w:numPr>
+        <w:rPr>
+          <w:lang w:eastAsia="ru-RU"/>
+        </w:rPr>
+      </w:pPr>
+      <w:hyperlink r:id="rId21" w:history="1">
+        <w:r>
+          <w:rPr>
+            <w:rStyle w:val="ac"/>
+            <w:lang w:eastAsia="ru-RU"/>
+          </w:rPr>
+          <w:t>https://www.interfax.ru/pressreleases/1017511</w:t>
+        </w:r>
+      </w:hyperlink>
+      <w:r>
+        <w:rPr>
+          <w:lang w:eastAsia="ru-RU"/>
+        </w:rPr>
+        <w:t xml:space="preserve"> </w:t>
+      </w:r>
+    </w:p>
+    <w:p>
+      <w:pPr>
+        <w:pStyle w:val="a7"/>
+        <w:numPr>
+          <w:ilvl w:val="0"/>
+          <w:numId w:val="3"/>
+        </w:numPr>
+      </w:pPr>
+      <w:hyperlink r:id="rId22" w:history="1">
+        <w:r>
+          <w:rPr>
+            <w:rStyle w:val="ac"/>
+          </w:rPr>
+          <w:t>https://cyberleninka.ru/article/n/metod-optimalnogo-vybora-bibliotek-dlya-transkribatsii-audiofaylov</w:t>
+        </w:r>
+      </w:hyperlink>
+    </w:p>
+    <w:p>
+      <w:pPr>
+        <w:pStyle w:val="a7"/>
+        <w:numPr>
+          <w:ilvl w:val="0"/>
+          <w:numId w:val="3"/>
+        </w:numPr>
+      </w:pPr>
+      <w:hyperlink r:id="rId23" w:history="1">
+        <w:r>
+          <w:rPr>
+            <w:rStyle w:val="ac"/>
+          </w:rPr>
+          <w:t>https://cyberleninka.ru/article/n/kratko-pro-docker</w:t>
+        </w:r>
+      </w:hyperlink>
+    </w:p>
+    <w:p>
+      <w:pPr>
+        <w:pStyle w:val="a7"/>
+        <w:numPr>
+          <w:ilvl w:val="0"/>
+          <w:numId w:val="3"/>
+        </w:numPr>
       </w:pPr>
     </w:p>
     <w:sectPr>
@@ -9455,6 +11156,119 @@
     </w:lvl>
   </w:abstractNum>
   <w:abstractNum w:abstractNumId="6" w15:restartNumberingAfterBreak="0">
+    <w:nsid w:val="4F5247E0"/>
+    <w:multiLevelType w:val="hybridMultilevel"/>
+    <w:tmpl w:val="F1EC70D2"/>
+    <w:lvl w:ilvl="0" w:tplc="04190001">
+      <w:start w:val="1"/>
+      <w:numFmt w:val="bullet"/>
+      <w:lvlText w:val=""/>
+      <w:lvlJc w:val="left"/>
+      <w:pPr>
+        <w:ind w:left="1150" w:hanging="360"/>
+      </w:pPr>
+      <w:rPr>
+        <w:rFonts w:ascii="Symbol" w:hAnsi="Symbol" w:hint="default"/>
+      </w:rPr>
+    </w:lvl>
+    <w:lvl w:ilvl="1" w:tplc="04190003" w:tentative="1">
+      <w:start w:val="1"/>
+      <w:numFmt w:val="bullet"/>
+      <w:lvlText w:val="o"/>
+      <w:lvlJc w:val="left"/>
+      <w:pPr>
+        <w:ind w:left="1870" w:hanging="360"/>
+      </w:pPr>
+      <w:rPr>
+        <w:rFonts w:ascii="Courier New" w:hAnsi="Courier New" w:cs="Courier New" w:hint="default"/>
+      </w:rPr>
+    </w:lvl>
+    <w:lvl w:ilvl="2" w:tplc="04190005" w:tentative="1">
+      <w:start w:val="1"/>
+      <w:numFmt w:val="bullet"/>
+      <w:lvlText w:val=""/>
+      <w:lvlJc w:val="left"/>
+      <w:pPr>
+        <w:ind w:left="2590" w:hanging="360"/>
+      </w:pPr>
+      <w:rPr>
+        <w:rFonts w:ascii="Wingdings" w:hAnsi="Wingdings" w:hint="default"/>
+      </w:rPr>
+    </w:lvl>
+    <w:lvl w:ilvl="3" w:tplc="04190001" w:tentative="1">
+      <w:start w:val="1"/>
+      <w:numFmt w:val="bullet"/>
+      <w:lvlText w:val=""/>
+      <w:lvlJc w:val="left"/>
+      <w:pPr>
+        <w:ind w:left="3310" w:hanging="360"/>
+      </w:pPr>
+      <w:rPr>
+        <w:rFonts w:ascii="Symbol" w:hAnsi="Symbol" w:hint="default"/>
+      </w:rPr>
+    </w:lvl>
+    <w:lvl w:ilvl="4" w:tplc="04190003" w:tentative="1">
+      <w:start w:val="1"/>
+      <w:numFmt w:val="bullet"/>
+      <w:lvlText w:val="o"/>
+      <w:lvlJc w:val="left"/>
+      <w:pPr>
+        <w:ind w:left="4030" w:hanging="360"/>
+      </w:pPr>
+      <w:rPr>
+        <w:rFonts w:ascii="Courier New" w:hAnsi="Courier New" w:cs="Courier New" w:hint="default"/>
+      </w:rPr>
+    </w:lvl>
+    <w:lvl w:ilvl="5" w:tplc="04190005" w:tentative="1">
+      <w:start w:val="1"/>
+      <w:numFmt w:val="bullet"/>
+      <w:lvlText w:val=""/>
+      <w:lvlJc w:val="left"/>
+      <w:pPr>
+        <w:ind w:left="4750" w:hanging="360"/>
+      </w:pPr>
+      <w:rPr>
+        <w:rFonts w:ascii="Wingdings" w:hAnsi="Wingdings" w:hint="default"/>
+      </w:rPr>
+    </w:lvl>
+    <w:lvl w:ilvl="6" w:tplc="04190001" w:tentative="1">
+      <w:start w:val="1"/>
+      <w:numFmt w:val="bullet"/>
+      <w:lvlText w:val=""/>
+      <w:lvlJc w:val="left"/>
+      <w:pPr>
+        <w:ind w:left="5470" w:hanging="360"/>
+      </w:pPr>
+      <w:rPr>
+        <w:rFonts w:ascii="Symbol" w:hAnsi="Symbol" w:hint="default"/>
+      </w:rPr>
+    </w:lvl>
+    <w:lvl w:ilvl="7" w:tplc="04190003" w:tentative="1">
+      <w:start w:val="1"/>
+      <w:numFmt w:val="bullet"/>
+      <w:lvlText w:val="o"/>
+      <w:lvlJc w:val="left"/>
+      <w:pPr>
+        <w:ind w:left="6190" w:hanging="360"/>
+      </w:pPr>
+      <w:rPr>
+        <w:rFonts w:ascii="Courier New" w:hAnsi="Courier New" w:cs="Courier New" w:hint="default"/>
+      </w:rPr>
+    </w:lvl>
+    <w:lvl w:ilvl="8" w:tplc="04190005" w:tentative="1">
+      <w:start w:val="1"/>
+      <w:numFmt w:val="bullet"/>
+      <w:lvlText w:val=""/>
+      <w:lvlJc w:val="left"/>
+      <w:pPr>
+        <w:ind w:left="6910" w:hanging="360"/>
+      </w:pPr>
+      <w:rPr>
+        <w:rFonts w:ascii="Wingdings" w:hAnsi="Wingdings" w:hint="default"/>
+      </w:rPr>
+    </w:lvl>
+  </w:abstractNum>
+  <w:abstractNum w:abstractNumId="7" w15:restartNumberingAfterBreak="0">
     <w:nsid w:val="59E97E85"/>
     <w:multiLevelType w:val="hybridMultilevel"/>
     <w:tmpl w:val="0220C726"/>
@@ -9540,7 +11354,120 @@
       </w:pPr>
     </w:lvl>
   </w:abstractNum>
-  <w:abstractNum w:abstractNumId="7" w15:restartNumberingAfterBreak="0">
+  <w:abstractNum w:abstractNumId="8" w15:restartNumberingAfterBreak="0">
+    <w:nsid w:val="5EDE364C"/>
+    <w:multiLevelType w:val="hybridMultilevel"/>
+    <w:tmpl w:val="4C2E11BC"/>
+    <w:lvl w:ilvl="0" w:tplc="04190001">
+      <w:start w:val="1"/>
+      <w:numFmt w:val="bullet"/>
+      <w:lvlText w:val=""/>
+      <w:lvlJc w:val="left"/>
+      <w:pPr>
+        <w:ind w:left="1150" w:hanging="360"/>
+      </w:pPr>
+      <w:rPr>
+        <w:rFonts w:ascii="Symbol" w:hAnsi="Symbol" w:hint="default"/>
+      </w:rPr>
+    </w:lvl>
+    <w:lvl w:ilvl="1" w:tplc="04190003" w:tentative="1">
+      <w:start w:val="1"/>
+      <w:numFmt w:val="bullet"/>
+      <w:lvlText w:val="o"/>
+      <w:lvlJc w:val="left"/>
+      <w:pPr>
+        <w:ind w:left="1870" w:hanging="360"/>
+      </w:pPr>
+      <w:rPr>
+        <w:rFonts w:ascii="Courier New" w:hAnsi="Courier New" w:cs="Courier New" w:hint="default"/>
+      </w:rPr>
+    </w:lvl>
+    <w:lvl w:ilvl="2" w:tplc="04190005" w:tentative="1">
+      <w:start w:val="1"/>
+      <w:numFmt w:val="bullet"/>
+      <w:lvlText w:val=""/>
+      <w:lvlJc w:val="left"/>
+      <w:pPr>
+        <w:ind w:left="2590" w:hanging="360"/>
+      </w:pPr>
+      <w:rPr>
+        <w:rFonts w:ascii="Wingdings" w:hAnsi="Wingdings" w:hint="default"/>
+      </w:rPr>
+    </w:lvl>
+    <w:lvl w:ilvl="3" w:tplc="04190001" w:tentative="1">
+      <w:start w:val="1"/>
+      <w:numFmt w:val="bullet"/>
+      <w:lvlText w:val=""/>
+      <w:lvlJc w:val="left"/>
+      <w:pPr>
+        <w:ind w:left="3310" w:hanging="360"/>
+      </w:pPr>
+      <w:rPr>
+        <w:rFonts w:ascii="Symbol" w:hAnsi="Symbol" w:hint="default"/>
+      </w:rPr>
+    </w:lvl>
+    <w:lvl w:ilvl="4" w:tplc="04190003" w:tentative="1">
+      <w:start w:val="1"/>
+      <w:numFmt w:val="bullet"/>
+      <w:lvlText w:val="o"/>
+      <w:lvlJc w:val="left"/>
+      <w:pPr>
+        <w:ind w:left="4030" w:hanging="360"/>
+      </w:pPr>
+      <w:rPr>
+        <w:rFonts w:ascii="Courier New" w:hAnsi="Courier New" w:cs="Courier New" w:hint="default"/>
+      </w:rPr>
+    </w:lvl>
+    <w:lvl w:ilvl="5" w:tplc="04190005" w:tentative="1">
+      <w:start w:val="1"/>
+      <w:numFmt w:val="bullet"/>
+      <w:lvlText w:val=""/>
+      <w:lvlJc w:val="left"/>
+      <w:pPr>
+        <w:ind w:left="4750" w:hanging="360"/>
+      </w:pPr>
+      <w:rPr>
+        <w:rFonts w:ascii="Wingdings" w:hAnsi="Wingdings" w:hint="default"/>
+      </w:rPr>
+    </w:lvl>
+    <w:lvl w:ilvl="6" w:tplc="04190001" w:tentative="1">
+      <w:start w:val="1"/>
+      <w:numFmt w:val="bullet"/>
+      <w:lvlText w:val=""/>
+      <w:lvlJc w:val="left"/>
+      <w:pPr>
+        <w:ind w:left="5470" w:hanging="360"/>
+      </w:pPr>
+      <w:rPr>
+        <w:rFonts w:ascii="Symbol" w:hAnsi="Symbol" w:hint="default"/>
+      </w:rPr>
+    </w:lvl>
+    <w:lvl w:ilvl="7" w:tplc="04190003" w:tentative="1">
+      <w:start w:val="1"/>
+      <w:numFmt w:val="bullet"/>
+      <w:lvlText w:val="o"/>
+      <w:lvlJc w:val="left"/>
+      <w:pPr>
+        <w:ind w:left="6190" w:hanging="360"/>
+      </w:pPr>
+      <w:rPr>
+        <w:rFonts w:ascii="Courier New" w:hAnsi="Courier New" w:cs="Courier New" w:hint="default"/>
+      </w:rPr>
+    </w:lvl>
+    <w:lvl w:ilvl="8" w:tplc="04190005" w:tentative="1">
+      <w:start w:val="1"/>
+      <w:numFmt w:val="bullet"/>
+      <w:lvlText w:val=""/>
+      <w:lvlJc w:val="left"/>
+      <w:pPr>
+        <w:ind w:left="6910" w:hanging="360"/>
+      </w:pPr>
+      <w:rPr>
+        <w:rFonts w:ascii="Wingdings" w:hAnsi="Wingdings" w:hint="default"/>
+      </w:rPr>
+    </w:lvl>
+  </w:abstractNum>
+  <w:abstractNum w:abstractNumId="9" w15:restartNumberingAfterBreak="0">
     <w:nsid w:val="62AE7F63"/>
     <w:multiLevelType w:val="multilevel"/>
     <w:tmpl w:val="E34EB49E"/>
@@ -9626,7 +11553,96 @@
       </w:pPr>
     </w:lvl>
   </w:abstractNum>
-  <w:abstractNum w:abstractNumId="8" w15:restartNumberingAfterBreak="0">
+  <w:abstractNum w:abstractNumId="10" w15:restartNumberingAfterBreak="0">
+    <w:nsid w:val="6EA637AB"/>
+    <w:multiLevelType w:val="hybridMultilevel"/>
+    <w:tmpl w:val="D5D2519E"/>
+    <w:lvl w:ilvl="0" w:tplc="4DBEC5C6">
+      <w:start w:val="1"/>
+      <w:numFmt w:val="decimal"/>
+      <w:lvlText w:val="%1."/>
+      <w:lvlJc w:val="left"/>
+      <w:pPr>
+        <w:ind w:left="786" w:hanging="360"/>
+      </w:pPr>
+      <w:rPr>
+        <w:rFonts w:hint="default"/>
+      </w:rPr>
+    </w:lvl>
+    <w:lvl w:ilvl="1" w:tplc="04190019" w:tentative="1">
+      <w:start w:val="1"/>
+      <w:numFmt w:val="lowerLetter"/>
+      <w:lvlText w:val="%2."/>
+      <w:lvlJc w:val="left"/>
+      <w:pPr>
+        <w:ind w:left="1506" w:hanging="360"/>
+      </w:pPr>
+    </w:lvl>
+    <w:lvl w:ilvl="2" w:tplc="0419001B" w:tentative="1">
+      <w:start w:val="1"/>
+      <w:numFmt w:val="lowerRoman"/>
+      <w:lvlText w:val="%3."/>
+      <w:lvlJc w:val="right"/>
+      <w:pPr>
+        <w:ind w:left="2226" w:hanging="180"/>
+      </w:pPr>
+    </w:lvl>
+    <w:lvl w:ilvl="3" w:tplc="0419000F" w:tentative="1">
+      <w:start w:val="1"/>
+      <w:numFmt w:val="decimal"/>
+      <w:lvlText w:val="%4."/>
+      <w:lvlJc w:val="left"/>
+      <w:pPr>
+        <w:ind w:left="2946" w:hanging="360"/>
+      </w:pPr>
+    </w:lvl>
+    <w:lvl w:ilvl="4" w:tplc="04190019" w:tentative="1">
+      <w:start w:val="1"/>
+      <w:numFmt w:val="lowerLetter"/>
+      <w:lvlText w:val="%5."/>
+      <w:lvlJc w:val="left"/>
+      <w:pPr>
+        <w:ind w:left="3666" w:hanging="360"/>
+      </w:pPr>
+    </w:lvl>
+    <w:lvl w:ilvl="5" w:tplc="0419001B" w:tentative="1">
+      <w:start w:val="1"/>
+      <w:numFmt w:val="lowerRoman"/>
+      <w:lvlText w:val="%6."/>
+      <w:lvlJc w:val="right"/>
+      <w:pPr>
+        <w:ind w:left="4386" w:hanging="180"/>
+      </w:pPr>
+    </w:lvl>
+    <w:lvl w:ilvl="6" w:tplc="0419000F" w:tentative="1">
+      <w:start w:val="1"/>
+      <w:numFmt w:val="decimal"/>
+      <w:lvlText w:val="%7."/>
+      <w:lvlJc w:val="left"/>
+      <w:pPr>
+        <w:ind w:left="5106" w:hanging="360"/>
+      </w:pPr>
+    </w:lvl>
+    <w:lvl w:ilvl="7" w:tplc="04190019" w:tentative="1">
+      <w:start w:val="1"/>
+      <w:numFmt w:val="lowerLetter"/>
+      <w:lvlText w:val="%8."/>
+      <w:lvlJc w:val="left"/>
+      <w:pPr>
+        <w:ind w:left="5826" w:hanging="360"/>
+      </w:pPr>
+    </w:lvl>
+    <w:lvl w:ilvl="8" w:tplc="0419001B" w:tentative="1">
+      <w:start w:val="1"/>
+      <w:numFmt w:val="lowerRoman"/>
+      <w:lvlText w:val="%9."/>
+      <w:lvlJc w:val="right"/>
+      <w:pPr>
+        <w:ind w:left="6546" w:hanging="180"/>
+      </w:pPr>
+    </w:lvl>
+  </w:abstractNum>
+  <w:abstractNum w:abstractNumId="11" w15:restartNumberingAfterBreak="0">
     <w:nsid w:val="77401D8C"/>
     <w:multiLevelType w:val="hybridMultilevel"/>
     <w:tmpl w:val="3FF28CBE"/>
@@ -9743,10 +11759,10 @@
     <w:abstractNumId w:val="3"/>
   </w:num>
   <w:num w:numId="2" w16cid:durableId="330836810">
-    <w:abstractNumId w:val="8"/>
+    <w:abstractNumId w:val="11"/>
   </w:num>
   <w:num w:numId="3" w16cid:durableId="2129813295">
-    <w:abstractNumId w:val="6"/>
+    <w:abstractNumId w:val="7"/>
   </w:num>
   <w:num w:numId="4" w16cid:durableId="271596478">
     <w:abstractNumId w:val="0"/>
@@ -9758,13 +11774,22 @@
     <w:abstractNumId w:val="2"/>
   </w:num>
   <w:num w:numId="7" w16cid:durableId="2171568">
-    <w:abstractNumId w:val="7"/>
+    <w:abstractNumId w:val="9"/>
   </w:num>
   <w:num w:numId="8" w16cid:durableId="1494371105">
     <w:abstractNumId w:val="1"/>
   </w:num>
   <w:num w:numId="9" w16cid:durableId="376860634">
     <w:abstractNumId w:val="5"/>
+  </w:num>
+  <w:num w:numId="10" w16cid:durableId="1219902315">
+    <w:abstractNumId w:val="10"/>
+  </w:num>
+  <w:num w:numId="11" w16cid:durableId="1049257415">
+    <w:abstractNumId w:val="6"/>
+  </w:num>
+  <w:num w:numId="12" w16cid:durableId="234559171">
+    <w:abstractNumId w:val="8"/>
   </w:num>
 </w:numbering>
 </file>
@@ -10169,7 +12194,7 @@
   <w:style w:type="paragraph" w:default="1" w:styleId="a">
     <w:name w:val="Normal"/>
     <w:qFormat/>
-    <w:rsid w:val="005A395E"/>
+    <w:rsid w:val="00C109B4"/>
     <w:pPr>
       <w:spacing w:after="0" w:line="360" w:lineRule="auto"/>
       <w:ind w:firstLine="425"/>

</xml_diff>

<commit_message>
vault backup: 2025-12-12 18:29:52
</commit_message>
<xml_diff>
--- a/Курс 3/НИР/НИР_Кринкин.docx
+++ b/Курс 3/НИР/НИР_Кринкин.docx
@@ -1144,6 +1144,66 @@
       </w:r>
       <w:r>
         <w:rPr>
+          <w:color w:val="00B050"/>
+          <w:lang w:val="ru-RU"/>
+        </w:rPr>
+        <w:t>готово</w:t>
+      </w:r>
+    </w:p>
+    <w:p>
+      <w:pPr>
+        <w:rPr>
+          <w:lang w:val="ru-RU"/>
+        </w:rPr>
+      </w:pPr>
+      <w:r>
+        <w:rPr>
+          <w:lang w:val="ru-RU"/>
+        </w:rPr>
+        <w:t xml:space="preserve">Раздел 2 – </w:t>
+      </w:r>
+      <w:r>
+        <w:rPr>
+          <w:color w:val="00B050"/>
+          <w:lang w:val="ru-RU"/>
+        </w:rPr>
+        <w:t>готово</w:t>
+      </w:r>
+    </w:p>
+    <w:p>
+      <w:pPr>
+        <w:rPr>
+          <w:lang w:val="ru-RU"/>
+        </w:rPr>
+      </w:pPr>
+      <w:r>
+        <w:rPr>
+          <w:lang w:val="ru-RU"/>
+        </w:rPr>
+        <w:t xml:space="preserve">Раздел 3 – </w:t>
+      </w:r>
+      <w:r>
+        <w:rPr>
+          <w:color w:val="00B050"/>
+          <w:lang w:val="ru-RU"/>
+        </w:rPr>
+        <w:t>готово</w:t>
+      </w:r>
+    </w:p>
+    <w:p>
+      <w:pPr>
+        <w:rPr>
+          <w:lang w:val="ru-RU"/>
+        </w:rPr>
+      </w:pPr>
+      <w:r>
+        <w:rPr>
+          <w:lang w:val="ru-RU"/>
+        </w:rPr>
+        <w:t xml:space="preserve">Раздел 4 – </w:t>
+      </w:r>
+      <w:r>
+        <w:rPr>
           <w:color w:val="ED7D31" w:themeColor="accent2"/>
           <w:lang w:val="ru-RU"/>
         </w:rPr>
@@ -1160,91 +1220,7 @@
         <w:rPr>
           <w:lang w:val="ru-RU"/>
         </w:rPr>
-        <w:t>Раздел 2</w:t>
-      </w:r>
-      <w:r>
-        <w:rPr>
-          <w:lang w:val="ru-RU"/>
-        </w:rPr>
-        <w:t xml:space="preserve"> – </w:t>
-      </w:r>
-      <w:r>
-        <w:rPr>
-          <w:color w:val="00B050"/>
-          <w:lang w:val="ru-RU"/>
-        </w:rPr>
-        <w:t>готово</w:t>
-      </w:r>
-    </w:p>
-    <w:p>
-      <w:pPr>
-        <w:rPr>
-          <w:lang w:val="ru-RU"/>
-        </w:rPr>
-      </w:pPr>
-      <w:r>
-        <w:rPr>
-          <w:lang w:val="ru-RU"/>
-        </w:rPr>
-        <w:t>Раздел 3</w:t>
-      </w:r>
-      <w:r>
-        <w:rPr>
-          <w:lang w:val="ru-RU"/>
-        </w:rPr>
-        <w:t xml:space="preserve"> – </w:t>
-      </w:r>
-      <w:r>
-        <w:rPr>
-          <w:color w:val="00B050"/>
-          <w:lang w:val="ru-RU"/>
-        </w:rPr>
-        <w:t>готово</w:t>
-      </w:r>
-    </w:p>
-    <w:p>
-      <w:pPr>
-        <w:rPr>
-          <w:lang w:val="ru-RU"/>
-        </w:rPr>
-      </w:pPr>
-      <w:r>
-        <w:rPr>
-          <w:lang w:val="ru-RU"/>
-        </w:rPr>
-        <w:t>Раздел 4</w:t>
-      </w:r>
-      <w:r>
-        <w:rPr>
-          <w:lang w:val="ru-RU"/>
-        </w:rPr>
-        <w:t xml:space="preserve"> – </w:t>
-      </w:r>
-      <w:r>
-        <w:rPr>
-          <w:color w:val="ED7D31" w:themeColor="accent2"/>
-          <w:lang w:val="ru-RU"/>
-        </w:rPr>
-        <w:t>частично</w:t>
-      </w:r>
-    </w:p>
-    <w:p>
-      <w:pPr>
-        <w:rPr>
-          <w:lang w:val="en-US"/>
-        </w:rPr>
-      </w:pPr>
-      <w:r>
-        <w:rPr>
-          <w:lang w:val="ru-RU"/>
-        </w:rPr>
-        <w:t>Раздел 5</w:t>
-      </w:r>
-      <w:r>
-        <w:rPr>
-          <w:lang w:val="ru-RU"/>
-        </w:rPr>
-        <w:t xml:space="preserve"> – </w:t>
+        <w:t xml:space="preserve">Раздел 5 – </w:t>
       </w:r>
       <w:r>
         <w:rPr>
@@ -1469,26 +1445,6 @@
         <w:ind w:firstLine="426"/>
         <w:rPr>
           <w:rFonts w:eastAsia="Times New Roman" w:cs="Times New Roman"/>
-          <w:color w:val="EE0000"/>
-          <w:szCs w:val="28"/>
-          <w:lang w:eastAsia="ru-RU"/>
-        </w:rPr>
-      </w:pPr>
-      <w:r>
-        <w:rPr>
-          <w:rFonts w:eastAsia="Times New Roman" w:cs="Times New Roman"/>
-          <w:color w:val="EE0000"/>
-          <w:szCs w:val="28"/>
-          <w:lang w:eastAsia="ru-RU"/>
-        </w:rPr>
-        <w:t>Предметная область исследования определяется такими ключевыми понятиями, как автоматическое распознавание речи (ASR), обработка естественного языка (NLP), транскрибация аудио и видео в текст, искусственный интеллект и конфиденциальность данных. Поэтому выбрана тема ВКР: «Автоматическое транскрибирование устной речи в письменный текст с использованием технологий искусственного интеллекта».</w:t>
-      </w:r>
-    </w:p>
-    <w:p>
-      <w:pPr>
-        <w:ind w:firstLine="426"/>
-        <w:rPr>
-          <w:rFonts w:eastAsia="Times New Roman" w:cs="Times New Roman"/>
           <w:szCs w:val="28"/>
           <w:lang w:eastAsia="ru-RU"/>
         </w:rPr>
@@ -1645,87 +1601,223 @@
           <w:szCs w:val="28"/>
           <w:lang w:eastAsia="ru-RU"/>
         </w:rPr>
-        <w:t xml:space="preserve">. </w:t>
+        <w:t>.</w:t>
       </w:r>
       <w:r>
         <w:rPr>
           <w:rFonts w:eastAsia="Times New Roman" w:cs="Times New Roman"/>
           <w:szCs w:val="28"/>
-          <w:lang w:eastAsia="ru-RU"/>
-        </w:rPr>
-        <w:t>В современных условиях организации все больше стремятся к сокращению времени, требующегося для принятия решений на основе данных, собранных в ходе проведения фокус-групп. В связи с чем все активнее используются цифровые технологии их обработки и анализа.</w:t>
-      </w:r>
-    </w:p>
-    <w:p>
-      <w:pPr>
-        <w:ind w:firstLine="426"/>
+          <w:lang w:val="ru-RU" w:eastAsia="ru-RU"/>
+        </w:rPr>
+        <w:t xml:space="preserve"> </w:t>
+      </w:r>
+      <w:r>
         <w:rPr>
           <w:rFonts w:eastAsia="Times New Roman" w:cs="Times New Roman"/>
           <w:szCs w:val="28"/>
-          <w:lang w:eastAsia="ru-RU"/>
-        </w:rPr>
-      </w:pPr>
+          <w:lang w:val="ru-RU" w:eastAsia="ru-RU"/>
+        </w:rPr>
+        <w:t>[#</w:t>
+      </w:r>
       <w:r>
         <w:rPr>
           <w:rFonts w:eastAsia="Times New Roman" w:cs="Times New Roman"/>
           <w:szCs w:val="28"/>
-          <w:lang w:eastAsia="ru-RU"/>
-        </w:rPr>
-        <w:t xml:space="preserve">Наиболее широко признанным видом транскрипции является преобразование источника разговорного языка в текст, например, в компьютерную запись, подходящую для печати в виде документа, отчета. </w:t>
-      </w:r>
-    </w:p>
-    <w:p>
-      <w:pPr>
-        <w:ind w:firstLine="426"/>
+          <w:lang w:val="ru-RU" w:eastAsia="ru-RU"/>
+        </w:rPr>
+        <w:t>дс 30</w:t>
+      </w:r>
+      <w:r>
         <w:rPr>
           <w:rFonts w:eastAsia="Times New Roman" w:cs="Times New Roman"/>
           <w:szCs w:val="28"/>
-          <w:lang w:eastAsia="ru-RU"/>
-        </w:rPr>
-      </w:pPr>
+          <w:lang w:val="ru-RU" w:eastAsia="ru-RU"/>
+        </w:rPr>
+        <w:t>]</w:t>
+      </w:r>
       <w:r>
         <w:rPr>
           <w:rFonts w:eastAsia="Times New Roman" w:cs="Times New Roman"/>
           <w:szCs w:val="28"/>
           <w:lang w:eastAsia="ru-RU"/>
         </w:rPr>
-        <w:lastRenderedPageBreak/>
-        <w:t xml:space="preserve">Ручная транскрипция — это процесс набора произносимых слов так, как они слышатся. Хотя этот метод может занять много времени и быть неточным, он предлагает некоторые преимущества, такие как доступность и точность. </w:t>
-      </w:r>
-    </w:p>
-    <w:p>
-      <w:pPr>
-        <w:ind w:firstLine="426"/>
+        <w:t xml:space="preserve"> </w:t>
+      </w:r>
+      <w:r>
         <w:rPr>
           <w:rFonts w:eastAsia="Times New Roman" w:cs="Times New Roman"/>
           <w:szCs w:val="28"/>
           <w:lang w:eastAsia="ru-RU"/>
         </w:rPr>
-      </w:pPr>
+        <w:t>В современных условиях организации все больше стремятся к сокращению времени, требующегося для принятия решений на основе данных, собранных в ходе проведения фокус-групп. В связи с чем все активнее используются цифровые технологии их обработки и анализа</w:t>
+      </w:r>
       <w:r>
         <w:rPr>
           <w:rFonts w:eastAsia="Times New Roman" w:cs="Times New Roman"/>
           <w:szCs w:val="28"/>
-          <w:lang w:eastAsia="ru-RU"/>
-        </w:rPr>
-        <w:t xml:space="preserve">Технологическая транскрипция использует программное обеспечение для преобразования аудиофайлов в текстовый формат. Этот тип транскрипции предлагает несколько преимуществ по сравнению с ручной транскрипцией, включая скорость, точность и экономичность. </w:t>
-      </w:r>
-    </w:p>
-    <w:p>
-      <w:pPr>
-        <w:ind w:firstLine="426"/>
+          <w:lang w:val="ru-RU" w:eastAsia="ru-RU"/>
+        </w:rPr>
+        <w:t xml:space="preserve"> </w:t>
+      </w:r>
+      <w:r>
         <w:rPr>
           <w:rFonts w:eastAsia="Times New Roman" w:cs="Times New Roman"/>
           <w:szCs w:val="28"/>
-          <w:lang w:eastAsia="ru-RU"/>
-        </w:rPr>
-      </w:pPr>
+          <w:lang w:val="ru-RU" w:eastAsia="ru-RU"/>
+        </w:rPr>
+        <w:t>[#</w:t>
+      </w:r>
       <w:r>
         <w:rPr>
           <w:rFonts w:eastAsia="Times New Roman" w:cs="Times New Roman"/>
           <w:szCs w:val="28"/>
-          <w:lang w:eastAsia="ru-RU"/>
-        </w:rPr>
+          <w:lang w:val="ru-RU" w:eastAsia="ru-RU"/>
+        </w:rPr>
+        <w:t>дс</w:t>
+      </w:r>
+      <w:r>
+        <w:rPr>
+          <w:rFonts w:eastAsia="Times New Roman" w:cs="Times New Roman"/>
+          <w:szCs w:val="28"/>
+          <w:lang w:val="ru-RU" w:eastAsia="ru-RU"/>
+        </w:rPr>
+        <w:t xml:space="preserve"> </w:t>
+      </w:r>
+      <w:r>
+        <w:rPr>
+          <w:rFonts w:eastAsia="Times New Roman" w:cs="Times New Roman"/>
+          <w:szCs w:val="28"/>
+          <w:lang w:val="ru-RU" w:eastAsia="ru-RU"/>
+        </w:rPr>
+        <w:t>24</w:t>
+      </w:r>
+      <w:r>
+        <w:rPr>
+          <w:rFonts w:eastAsia="Times New Roman" w:cs="Times New Roman"/>
+          <w:szCs w:val="28"/>
+          <w:lang w:val="ru-RU" w:eastAsia="ru-RU"/>
+        </w:rPr>
+        <w:t>]</w:t>
+      </w:r>
+      <w:r>
+        <w:rPr>
+          <w:rFonts w:eastAsia="Times New Roman" w:cs="Times New Roman"/>
+          <w:szCs w:val="28"/>
+          <w:lang w:eastAsia="ru-RU"/>
+        </w:rPr>
+        <w:t>.</w:t>
+      </w:r>
+    </w:p>
+    <w:p>
+      <w:pPr>
+        <w:ind w:firstLine="426"/>
+        <w:rPr>
+          <w:rFonts w:eastAsia="Times New Roman" w:cs="Times New Roman"/>
+          <w:szCs w:val="28"/>
+          <w:lang w:eastAsia="ru-RU"/>
+        </w:rPr>
+      </w:pPr>
+      <w:r>
+        <w:rPr>
+          <w:rFonts w:eastAsia="Times New Roman" w:cs="Times New Roman"/>
+          <w:szCs w:val="28"/>
+          <w:lang w:eastAsia="ru-RU"/>
+        </w:rPr>
+        <w:t xml:space="preserve">Наиболее широко признанным видом транскрипции является преобразование источника разговорного языка в текст, например, в компьютерную запись, подходящую для печати в виде документа, отчета. </w:t>
+      </w:r>
+    </w:p>
+    <w:p>
+      <w:pPr>
+        <w:ind w:firstLine="426"/>
+        <w:rPr>
+          <w:rFonts w:eastAsia="Times New Roman" w:cs="Times New Roman"/>
+          <w:szCs w:val="28"/>
+          <w:lang w:eastAsia="ru-RU"/>
+        </w:rPr>
+      </w:pPr>
+      <w:r>
+        <w:rPr>
+          <w:rFonts w:eastAsia="Times New Roman" w:cs="Times New Roman"/>
+          <w:szCs w:val="28"/>
+          <w:lang w:eastAsia="ru-RU"/>
+        </w:rPr>
+        <w:t>Ручная транскрипция — это процесс набора произносимых слов так, как они слышатся. Хотя этот метод может занять много времени и быть неточным, он предлагает некоторые преимущества, такие как доступность и точность</w:t>
+      </w:r>
+      <w:r>
+        <w:rPr>
+          <w:rFonts w:eastAsia="Times New Roman" w:cs="Times New Roman"/>
+          <w:szCs w:val="28"/>
+          <w:lang w:val="ru-RU" w:eastAsia="ru-RU"/>
+        </w:rPr>
+        <w:t xml:space="preserve"> </w:t>
+      </w:r>
+      <w:r>
+        <w:rPr>
+          <w:rFonts w:eastAsia="Times New Roman" w:cs="Times New Roman"/>
+          <w:szCs w:val="28"/>
+          <w:lang w:val="ru-RU" w:eastAsia="ru-RU"/>
+        </w:rPr>
+        <w:t>[#</w:t>
+      </w:r>
+      <w:r>
+        <w:rPr>
+          <w:rFonts w:eastAsia="Times New Roman" w:cs="Times New Roman"/>
+          <w:szCs w:val="28"/>
+          <w:lang w:val="ru-RU" w:eastAsia="ru-RU"/>
+        </w:rPr>
+        <w:t>дс 30</w:t>
+      </w:r>
+      <w:r>
+        <w:rPr>
+          <w:rFonts w:eastAsia="Times New Roman" w:cs="Times New Roman"/>
+          <w:szCs w:val="28"/>
+          <w:lang w:val="ru-RU" w:eastAsia="ru-RU"/>
+        </w:rPr>
+        <w:t>]</w:t>
+      </w:r>
+      <w:r>
+        <w:rPr>
+          <w:rFonts w:eastAsia="Times New Roman" w:cs="Times New Roman"/>
+          <w:szCs w:val="28"/>
+          <w:lang w:eastAsia="ru-RU"/>
+        </w:rPr>
+        <w:t xml:space="preserve">. </w:t>
+      </w:r>
+    </w:p>
+    <w:p>
+      <w:pPr>
+        <w:ind w:firstLine="426"/>
+        <w:rPr>
+          <w:rFonts w:eastAsia="Times New Roman" w:cs="Times New Roman"/>
+          <w:szCs w:val="28"/>
+          <w:lang w:eastAsia="ru-RU"/>
+        </w:rPr>
+      </w:pPr>
+      <w:r>
+        <w:rPr>
+          <w:rFonts w:eastAsia="Times New Roman" w:cs="Times New Roman"/>
+          <w:szCs w:val="28"/>
+          <w:lang w:eastAsia="ru-RU"/>
+        </w:rPr>
+        <w:t xml:space="preserve">Технологическая транскрипция использует программное обеспечение для преобразования аудиофайлов в текстовый формат. Этот тип транскрипции предлагает несколько преимуществ по сравнению с ручной транскрипцией, включая скорость, точность и экономичность. </w:t>
+      </w:r>
+    </w:p>
+    <w:p>
+      <w:pPr>
+        <w:ind w:firstLine="426"/>
+        <w:rPr>
+          <w:rFonts w:eastAsia="Times New Roman" w:cs="Times New Roman"/>
+          <w:szCs w:val="28"/>
+          <w:lang w:eastAsia="ru-RU"/>
+        </w:rPr>
+      </w:pPr>
+      <w:r>
+        <w:rPr>
+          <w:rFonts w:eastAsia="Times New Roman" w:cs="Times New Roman"/>
+          <w:szCs w:val="28"/>
+          <w:lang w:eastAsia="ru-RU"/>
+        </w:rPr>
+        <w:lastRenderedPageBreak/>
         <w:t xml:space="preserve">Существуют различные типы транскрипции: </w:t>
       </w:r>
     </w:p>
@@ -1857,14 +1949,14 @@
       <w:pPr>
         <w:ind w:firstLine="426"/>
         <w:rPr>
-          <w:lang w:eastAsia="ru-RU"/>
-        </w:rPr>
-      </w:pPr>
-      <w:r>
-        <w:rPr>
-          <w:lang w:eastAsia="ru-RU"/>
-        </w:rPr>
-        <w:t xml:space="preserve">Автоматическая транскрибация имеет высокие риски получения недостоверной информации. Количество ошибок, допускаемых при определении адресанта речи напрямую связано с количеством участников фокус-группы. Сам процесс транскрибации предполагает последовательную смену состояния собранной информации. При этом следует учитывать, что в процессе транскрибации изменяется не только форма представления информации из звуковой в текстовую. Также изменениям могут подвергаться достоверность, целостность и конфиденциальность информации. Например, звук на аудиозаписи может содержать различные неинформативные посторонние шумы, которые после обработки через систему транскрибации будут очищены. В итоге полученный на выходе текст чаще всего не будет содержать их описания. </w:t>
+          <w:lang w:val="ru-RU" w:eastAsia="ru-RU"/>
+        </w:rPr>
+      </w:pPr>
+      <w:r>
+        <w:rPr>
+          <w:lang w:eastAsia="ru-RU"/>
+        </w:rPr>
+        <w:t xml:space="preserve">Автоматическая транскрибация имеет высокие риски получения недостоверной информации. Количество ошибок, допускаемых при определении адресанта речи напрямую связано с количеством участников фокус-группы. </w:t>
       </w:r>
     </w:p>
     <w:p>
@@ -1878,14 +1970,70 @@
         <w:rPr>
           <w:lang w:eastAsia="ru-RU"/>
         </w:rPr>
+        <w:t xml:space="preserve">Сам процесс транскрибации предполагает последовательную смену состояния собранной информации. При этом следует учитывать, что в процессе транскрибации изменяется не только форма представления информации из звуковой в текстовую. Также изменениям могут подвергаться достоверность, целостность и конфиденциальность информации. Например, звук на аудиозаписи может содержать различные неинформативные посторонние шумы, которые после обработки через систему транскрибации будут очищены. В итоге полученный на выходе текст чаще всего не будет содержать их описания. </w:t>
+      </w:r>
+    </w:p>
+    <w:p>
+      <w:pPr>
+        <w:ind w:firstLine="426"/>
+        <w:rPr>
+          <w:lang w:eastAsia="ru-RU"/>
+        </w:rPr>
+      </w:pPr>
+      <w:r>
+        <w:rPr>
+          <w:lang w:eastAsia="ru-RU"/>
+        </w:rPr>
+        <w:t>Результативность систем транскрибации предполагает соответствие результатов процесса транскрибации требованиям к качеству полученной текстовой информации. Она зависит от ряда факторов</w:t>
+      </w:r>
+      <w:r>
+        <w:rPr>
+          <w:lang w:eastAsia="ru-RU"/>
+        </w:rPr>
+        <w:t>:</w:t>
+      </w:r>
+    </w:p>
+    <w:p>
+      <w:pPr>
+        <w:ind w:firstLine="426"/>
+        <w:rPr>
+          <w:lang w:eastAsia="ru-RU"/>
+        </w:rPr>
+      </w:pPr>
+      <w:r>
+        <w:rPr>
+          <w:lang w:eastAsia="ru-RU"/>
+        </w:rPr>
+        <w:t xml:space="preserve">Во-первых, значимым является количество участников. </w:t>
+      </w:r>
+    </w:p>
+    <w:p>
+      <w:pPr>
+        <w:ind w:firstLine="426"/>
+        <w:rPr>
+          <w:lang w:eastAsia="ru-RU"/>
+        </w:rPr>
+      </w:pPr>
+      <w:r>
+        <w:rPr>
+          <w:lang w:eastAsia="ru-RU"/>
+        </w:rPr>
+        <w:t xml:space="preserve">Во-вторых, результат транскрибации зависит от того, является ли транскрибация потоковой или создается транскрипт аудио/видео записи. Потоковая транскрибация может выдавать большее количество ошибок, чем транскрибация аудио/видео записи. </w:t>
+      </w:r>
+    </w:p>
+    <w:p>
+      <w:pPr>
+        <w:ind w:firstLine="426"/>
+        <w:rPr>
+          <w:lang w:eastAsia="ru-RU"/>
+        </w:rPr>
+      </w:pPr>
+      <w:r>
+        <w:rPr>
+          <w:lang w:eastAsia="ru-RU"/>
+        </w:rPr>
         <w:lastRenderedPageBreak/>
-        <w:t>Результативность систем транскрибации предполагает соответствие результатов процесса транскрибации требованиям к качеству полученной текстовой информации. Она зависит от ряда факторов</w:t>
-      </w:r>
-      <w:r>
-        <w:rPr>
-          <w:lang w:eastAsia="ru-RU"/>
-        </w:rPr>
-        <w:t>:</w:t>
+        <w:t xml:space="preserve">В-третьих, результативность транскрибации связана с используемыми в ходе беседы языками. Ошибки могут возникать в случае, когда адресанты используют в речи иностранные слова или термины, либо в фокус-группе принимают участие иностранцы. </w:t>
       </w:r>
     </w:p>
     <w:p>
@@ -1899,7 +2047,98 @@
         <w:rPr>
           <w:lang w:eastAsia="ru-RU"/>
         </w:rPr>
-        <w:t xml:space="preserve">Во-первых, значимым является количество участников. </w:t>
+        <w:t>В-четвертых, на результативность влияет среда, в которой проводится интервью или фокус-группа. Если запись ведется через микрофон, установленный возле каждого говорящего, результативность будет выше</w:t>
+      </w:r>
+      <w:r>
+        <w:rPr>
+          <w:lang w:eastAsia="ru-RU"/>
+        </w:rPr>
+        <w:t xml:space="preserve"> </w:t>
+      </w:r>
+      <w:r>
+        <w:rPr>
+          <w:lang w:eastAsia="ru-RU"/>
+        </w:rPr>
+        <w:t>[</w:t>
+      </w:r>
+      <w:r>
+        <w:rPr>
+          <w:lang w:val="ru-RU" w:eastAsia="ru-RU"/>
+        </w:rPr>
+        <w:t>#</w:t>
+      </w:r>
+      <w:r>
+        <w:rPr>
+          <w:lang w:val="ru-RU" w:eastAsia="ru-RU"/>
+        </w:rPr>
+        <w:t>дс 24</w:t>
+      </w:r>
+      <w:r>
+        <w:rPr>
+          <w:lang w:eastAsia="ru-RU"/>
+        </w:rPr>
+        <w:t xml:space="preserve">, </w:t>
+      </w:r>
+      <w:r>
+        <w:rPr>
+          <w:lang w:eastAsia="ru-RU"/>
+        </w:rPr>
+        <w:t>с. 2</w:t>
+      </w:r>
+      <w:r>
+        <w:rPr>
+          <w:lang w:eastAsia="ru-RU"/>
+        </w:rPr>
+        <w:t>]</w:t>
+      </w:r>
+      <w:r>
+        <w:rPr>
+          <w:lang w:eastAsia="ru-RU"/>
+        </w:rPr>
+        <w:t>.</w:t>
+      </w:r>
+    </w:p>
+    <w:p>
+      <w:pPr>
+        <w:rPr>
+          <w:lang w:eastAsia="ru-RU"/>
+        </w:rPr>
+      </w:pPr>
+      <w:r>
+        <w:rPr>
+          <w:lang w:val="ru-RU"/>
+        </w:rPr>
+        <w:t>Искусственный интеллект (ИИ) стал неотъемлемой частью управления информационными технологиями благодаря своей способности к анализу данных, обучению на основе опыта и автоматизации процессов</w:t>
+      </w:r>
+      <w:r>
+        <w:rPr>
+          <w:lang w:val="ru-RU"/>
+        </w:rPr>
+        <w:t xml:space="preserve"> </w:t>
+      </w:r>
+      <w:r>
+        <w:rPr>
+          <w:lang w:val="ru-RU"/>
+        </w:rPr>
+        <w:t>[#</w:t>
+      </w:r>
+      <w:r>
+        <w:rPr>
+          <w:lang w:val="ru-RU"/>
+        </w:rPr>
+        <w:t>дс 31</w:t>
+      </w:r>
+      <w:r>
+        <w:rPr>
+          <w:lang w:val="ru-RU"/>
+        </w:rPr>
+        <w:t>]</w:t>
+      </w:r>
+      <w:r>
+        <w:rPr>
+          <w:lang w:val="ru-RU"/>
+        </w:rPr>
+        <w:t>.</w:t>
       </w:r>
     </w:p>
     <w:p>
@@ -1911,37 +2150,9 @@
       </w:pPr>
       <w:r>
         <w:rPr>
-          <w:lang w:eastAsia="ru-RU"/>
-        </w:rPr>
-        <w:t xml:space="preserve">Во-вторых, результат транскрибации зависит от того, является ли транскрибация потоковой или создается транскрипт аудио/видео записи. Потоковая транскрибация может выдавать большее количество ошибок, чем транскрибация аудио/видео записи. </w:t>
-      </w:r>
-    </w:p>
-    <w:p>
-      <w:pPr>
-        <w:ind w:firstLine="426"/>
-        <w:rPr>
-          <w:lang w:eastAsia="ru-RU"/>
-        </w:rPr>
-      </w:pPr>
-      <w:r>
-        <w:rPr>
-          <w:lang w:eastAsia="ru-RU"/>
-        </w:rPr>
-        <w:t xml:space="preserve">В-третьих, результативность транскрибации связана с используемыми в ходе беседы языками. Ошибки могут возникать в случае, когда адресанты используют в речи иностранные слова или термины, либо в фокус-группе принимают участие иностранцы. </w:t>
-      </w:r>
-    </w:p>
-    <w:p>
-      <w:pPr>
-        <w:ind w:firstLine="426"/>
-        <w:rPr>
-          <w:lang w:eastAsia="ru-RU"/>
-        </w:rPr>
-      </w:pPr>
-      <w:r>
-        <w:rPr>
-          <w:lang w:eastAsia="ru-RU"/>
-        </w:rPr>
-        <w:t>В-четвертых, на результативность влияет среда, в которой проводится интервью или фокус-группа. Если запись ведется через микрофон, установленный возле каждого говорящего, результативность будет выше</w:t>
+          <w:lang w:val="ru-RU" w:eastAsia="ru-RU"/>
+        </w:rPr>
+        <w:t>В</w:t>
       </w:r>
       <w:r>
         <w:rPr>
@@ -1951,121 +2162,81 @@
       </w:r>
       <w:r>
         <w:rPr>
+          <w:lang w:val="ru-RU" w:eastAsia="ru-RU"/>
+        </w:rPr>
+        <w:t xml:space="preserve">исследуемой </w:t>
+      </w:r>
+      <w:r>
+        <w:rPr>
+          <w:lang w:eastAsia="ru-RU"/>
+        </w:rPr>
+        <w:t xml:space="preserve">предметной области </w:t>
+      </w:r>
+      <w:r>
+        <w:rPr>
+          <w:lang w:val="ru-RU" w:eastAsia="ru-RU"/>
+        </w:rPr>
+        <w:t>и</w:t>
+      </w:r>
+      <w:r>
+        <w:rPr>
+          <w:lang w:eastAsia="ru-RU"/>
+        </w:rPr>
+        <w:t xml:space="preserve">скусственный интеллект </w:t>
+      </w:r>
+      <w:r>
+        <w:rPr>
+          <w:lang w:eastAsia="ru-RU"/>
+        </w:rPr>
+        <w:t>применяется для создания автоматизированных систем распознавания речи</w:t>
+      </w:r>
+      <w:r>
+        <w:rPr>
+          <w:lang w:eastAsia="ru-RU"/>
+        </w:rPr>
+        <w:t xml:space="preserve">. </w:t>
+      </w:r>
+      <w:r>
+        <w:rPr>
+          <w:lang w:eastAsia="ru-RU"/>
+        </w:rPr>
+        <w:t>Нейросети способны быстро преобразовать речь в текст с высокой точностью, даже если в записи есть шумы или акценты.</w:t>
+      </w:r>
+      <w:r>
+        <w:rPr>
+          <w:lang w:eastAsia="ru-RU"/>
+        </w:rPr>
+        <w:t xml:space="preserve"> </w:t>
+      </w:r>
+      <w:r>
+        <w:rPr>
+          <w:lang w:eastAsia="ru-RU"/>
+        </w:rPr>
+        <w:t>Современные нейросети учатся на ходу, адаптируясь к новым задачам и языкам.</w:t>
+      </w:r>
+      <w:r>
+        <w:rPr>
+          <w:lang w:eastAsia="ru-RU"/>
+        </w:rPr>
+        <w:t xml:space="preserve"> </w:t>
+      </w:r>
+      <w:r>
+        <w:rPr>
           <w:lang w:eastAsia="ru-RU"/>
         </w:rPr>
         <w:t>[</w:t>
       </w:r>
       <w:r>
         <w:rPr>
-          <w:lang w:eastAsia="ru-RU"/>
-        </w:rPr>
-        <w:t>6</w:t>
-      </w:r>
-      <w:r>
-        <w:rPr>
-          <w:lang w:eastAsia="ru-RU"/>
-        </w:rPr>
-        <w:t xml:space="preserve">, </w:t>
-      </w:r>
-      <w:r>
-        <w:rPr>
-          <w:lang w:eastAsia="ru-RU"/>
-        </w:rPr>
-        <w:t>с. 2</w:t>
-      </w:r>
-      <w:r>
-        <w:rPr>
-          <w:lang w:eastAsia="ru-RU"/>
-        </w:rPr>
-        <w:t>]</w:t>
-      </w:r>
-      <w:r>
-        <w:rPr>
-          <w:lang w:eastAsia="ru-RU"/>
-        </w:rPr>
-        <w:t>.</w:t>
-      </w:r>
-    </w:p>
-    <w:p>
-      <w:pPr>
-        <w:ind w:firstLine="426"/>
-        <w:rPr>
-          <w:lang w:eastAsia="ru-RU"/>
-        </w:rPr>
-      </w:pPr>
-      <w:r>
-        <w:rPr>
-          <w:lang w:eastAsia="ru-RU"/>
-        </w:rPr>
-        <w:t>Искусственный интеллект</w:t>
-      </w:r>
-      <w:r>
-        <w:rPr>
-          <w:lang w:eastAsia="ru-RU"/>
-        </w:rPr>
-        <w:t xml:space="preserve"> </w:t>
-      </w:r>
-      <w:r>
-        <w:rPr>
-          <w:lang w:eastAsia="ru-RU"/>
-        </w:rPr>
-        <w:t>в данной предметной области применяется для создания автоматизированных систем распознавания речи</w:t>
-      </w:r>
-      <w:r>
-        <w:rPr>
-          <w:lang w:eastAsia="ru-RU"/>
-        </w:rPr>
-        <w:t xml:space="preserve">. </w:t>
-      </w:r>
-      <w:r>
-        <w:rPr>
-          <w:lang w:eastAsia="ru-RU"/>
-        </w:rPr>
-        <w:t>Нейросети способны быстро преобразовать речь в текст с высокой точностью, даже если в записи есть шумы или акценты.</w:t>
-      </w:r>
-      <w:r>
-        <w:rPr>
-          <w:lang w:eastAsia="ru-RU"/>
-        </w:rPr>
-        <w:t xml:space="preserve"> </w:t>
-      </w:r>
-      <w:r>
-        <w:rPr>
-          <w:lang w:eastAsia="ru-RU"/>
-        </w:rPr>
-        <w:t>Современные нейросети учатся на ходу, адаптируясь к новым задачам и языкам.</w:t>
-      </w:r>
-      <w:r>
-        <w:rPr>
-          <w:lang w:eastAsia="ru-RU"/>
-        </w:rPr>
-        <w:t xml:space="preserve"> </w:t>
-      </w:r>
-      <w:r>
-        <w:rPr>
-          <w:lang w:eastAsia="ru-RU"/>
-        </w:rPr>
-        <w:t>[</w:t>
-      </w:r>
-      <w:r>
-        <w:rPr>
-          <w:lang w:val="en-US" w:eastAsia="ru-RU"/>
+          <w:lang w:val="ru-RU" w:eastAsia="ru-RU"/>
         </w:rPr>
         <w:t>#</w:t>
       </w:r>
-      <w:proofErr w:type="spellStart"/>
       <w:r>
         <w:rPr>
           <w:lang w:val="ru-RU" w:eastAsia="ru-RU"/>
         </w:rPr>
-        <w:t>дс</w:t>
-      </w:r>
-      <w:proofErr w:type="spellEnd"/>
-      <w:r>
-        <w:rPr>
-          <w:lang w:val="ru-RU" w:eastAsia="ru-RU"/>
-        </w:rPr>
-        <w:t xml:space="preserve"> 25</w:t>
+        <w:t>дс 25</w:t>
       </w:r>
       <w:r>
         <w:rPr>
@@ -2135,38 +2306,106 @@
         <w:rPr>
           <w:lang w:eastAsia="ru-RU"/>
         </w:rPr>
+        <w:t xml:space="preserve">Обработка естественного языка </w:t>
+      </w:r>
+      <w:r>
+        <w:rPr>
+          <w:lang w:eastAsia="ru-RU"/>
+        </w:rPr>
+        <w:t>(</w:t>
+      </w:r>
+      <w:r>
+        <w:rPr>
+          <w:lang w:val="en-US" w:eastAsia="ru-RU"/>
+        </w:rPr>
+        <w:t>NLP</w:t>
+      </w:r>
+      <w:r>
+        <w:rPr>
+          <w:lang w:eastAsia="ru-RU"/>
+        </w:rPr>
+        <w:t>)</w:t>
+      </w:r>
+      <w:r>
+        <w:rPr>
+          <w:lang w:eastAsia="ru-RU"/>
+        </w:rPr>
+        <w:t xml:space="preserve">, используящаяся для инерпритации и обработки текста, полученного от систем </w:t>
+      </w:r>
+      <w:r>
+        <w:rPr>
+          <w:lang w:val="en-US" w:eastAsia="ru-RU"/>
+        </w:rPr>
+        <w:t>ASR</w:t>
+      </w:r>
+      <w:r>
+        <w:rPr>
+          <w:lang w:eastAsia="ru-RU"/>
+        </w:rPr>
+        <w:t>.</w:t>
+      </w:r>
+    </w:p>
+    <w:p>
+      <w:pPr>
+        <w:ind w:firstLine="426"/>
+        <w:rPr>
+          <w:lang w:val="ru-RU" w:eastAsia="ru-RU"/>
+        </w:rPr>
+      </w:pPr>
+      <w:r>
+        <w:rPr>
+          <w:lang w:val="ru-RU" w:eastAsia="ru-RU"/>
+        </w:rPr>
+        <w:t xml:space="preserve">В общем и целом, автоматическое транскрибирование при помощи технологии искусственного интеллекта позволяет сильно повысить эффективность работы путём сокращения временных затрат, отсутствия необходимости воспринимать аудио и видео материал, а также исключая </w:t>
+      </w:r>
+      <w:r>
+        <w:rPr>
+          <w:lang w:val="ru-RU" w:eastAsia="ru-RU"/>
+        </w:rPr>
         <w:lastRenderedPageBreak/>
-        <w:t xml:space="preserve">Обработка естественного языка </w:t>
-      </w:r>
-      <w:r>
-        <w:rPr>
-          <w:lang w:eastAsia="ru-RU"/>
-        </w:rPr>
-        <w:t>(</w:t>
-      </w:r>
-      <w:r>
-        <w:rPr>
-          <w:lang w:val="en-US" w:eastAsia="ru-RU"/>
-        </w:rPr>
-        <w:t>NLP</w:t>
-      </w:r>
-      <w:r>
-        <w:rPr>
-          <w:lang w:eastAsia="ru-RU"/>
-        </w:rPr>
-        <w:t>)</w:t>
-      </w:r>
-      <w:r>
-        <w:rPr>
-          <w:lang w:eastAsia="ru-RU"/>
-        </w:rPr>
-        <w:t xml:space="preserve">, используящаяся для инерпритации и обработки текста, полученного от систем </w:t>
-      </w:r>
-      <w:r>
-        <w:rPr>
-          <w:lang w:val="en-US" w:eastAsia="ru-RU"/>
-        </w:rPr>
-        <w:t>ASR</w:t>
+        <w:t>фактор человеческих ошибок. Подробнее обо всех преимуществах и возможных трудностях описано в статье</w:t>
+      </w:r>
+      <w:r>
+        <w:rPr>
+          <w:lang w:eastAsia="ru-RU"/>
+        </w:rPr>
+        <w:t xml:space="preserve"> </w:t>
+      </w:r>
+      <w:r>
+        <w:rPr>
+          <w:lang w:eastAsia="ru-RU"/>
+        </w:rPr>
+        <w:t> «Разработка систем автоматического распознавания речи на основе искусственного интеллекта» авторов Сеитова С., Хатамова С., Машрыковой Ш.</w:t>
+      </w:r>
+      <w:r>
+        <w:rPr>
+          <w:lang w:eastAsia="ru-RU"/>
+        </w:rPr>
+        <w:t xml:space="preserve"> </w:t>
+      </w:r>
+      <w:r>
+        <w:rPr>
+          <w:lang w:eastAsia="ru-RU"/>
+        </w:rPr>
+        <w:t>[</w:t>
+      </w:r>
+      <w:r>
+        <w:rPr>
+          <w:lang w:val="ru-RU" w:eastAsia="ru-RU"/>
+        </w:rPr>
+        <w:t>#</w:t>
+      </w:r>
+      <w:r>
+        <w:rPr>
+          <w:lang w:val="ru-RU" w:eastAsia="ru-RU"/>
+        </w:rPr>
+        <w:t>дс 27</w:t>
+      </w:r>
+      <w:r>
+        <w:rPr>
+          <w:lang w:eastAsia="ru-RU"/>
+        </w:rPr>
+        <w:t>]</w:t>
       </w:r>
       <w:r>
         <w:rPr>
@@ -2177,107 +2416,129 @@
     </w:p>
     <w:p>
       <w:pPr>
-        <w:rPr>
-          <w:color w:val="EE0000"/>
-          <w:lang w:eastAsia="ru-RU"/>
-        </w:rPr>
-      </w:pPr>
-      <w:r>
-        <w:rPr>
-          <w:color w:val="EE0000"/>
-          <w:lang w:eastAsia="ru-RU"/>
-        </w:rPr>
-        <w:t>Примеры, преимущества и вызовы описаны в статье  «Разработка систем автоматического распознавания речи на основе искусственного интеллекта» авторов Сеитова С., Хатамова С., Машрыковой Ш. [</w:t>
-      </w:r>
-      <w:r>
-        <w:rPr>
-          <w:color w:val="EE0000"/>
+        <w:ind w:firstLine="426"/>
+        <w:rPr>
           <w:lang w:val="ru-RU" w:eastAsia="ru-RU"/>
         </w:rPr>
-        <w:t>#</w:t>
-      </w:r>
-      <w:r>
-        <w:rPr>
-          <w:color w:val="EE0000"/>
+      </w:pPr>
+      <w:r>
+        <w:rPr>
           <w:lang w:val="ru-RU" w:eastAsia="ru-RU"/>
         </w:rPr>
-        <w:t>дс</w:t>
-      </w:r>
-      <w:r>
-        <w:rPr>
-          <w:color w:val="EE0000"/>
+        <w:t xml:space="preserve">С. Г. </w:t>
+      </w:r>
+      <w:r>
+        <w:t>Корконосенко</w:t>
+      </w:r>
+      <w:r>
+        <w:rPr>
+          <w:lang w:val="ru-RU"/>
+        </w:rPr>
+        <w:t xml:space="preserve"> в учебнике для вузов «Политическая журналистика» пишет следующее:</w:t>
+      </w:r>
+      <w:r>
+        <w:rPr>
           <w:lang w:val="ru-RU" w:eastAsia="ru-RU"/>
         </w:rPr>
-        <w:t xml:space="preserve"> 27</w:t>
-      </w:r>
-      <w:r>
-        <w:rPr>
-          <w:color w:val="EE0000"/>
-          <w:lang w:eastAsia="ru-RU"/>
-        </w:rPr>
-        <w:t>].</w:t>
+        <w:t xml:space="preserve"> «Выполнение требований конфиденциальности является делом профессиональной этики и чести журналиста» </w:t>
+      </w:r>
+      <w:r>
+        <w:rPr>
+          <w:lang w:val="ru-RU" w:eastAsia="ru-RU"/>
+        </w:rPr>
+        <w:t>[#</w:t>
+      </w:r>
+      <w:r>
+        <w:rPr>
+          <w:lang w:val="ru-RU" w:eastAsia="ru-RU"/>
+        </w:rPr>
+        <w:t>дс 32</w:t>
+      </w:r>
+      <w:r>
+        <w:rPr>
+          <w:lang w:val="ru-RU" w:eastAsia="ru-RU"/>
+        </w:rPr>
+        <w:t>]</w:t>
+      </w:r>
+      <w:r>
+        <w:rPr>
+          <w:lang w:val="ru-RU" w:eastAsia="ru-RU"/>
+        </w:rPr>
+        <w:t xml:space="preserve">, а это означает что при система автоматическом транскрибирования для журналистов должна обеспечивать высокий уровень сохранности данных. </w:t>
+      </w:r>
+      <w:r>
+        <w:rPr>
+          <w:lang w:val="ru-RU" w:eastAsia="ru-RU"/>
+        </w:rPr>
+        <w:t xml:space="preserve">В работе Кузьмичевой К. Е. </w:t>
+      </w:r>
+      <w:r>
+        <w:rPr>
+          <w:lang w:val="ru-RU" w:eastAsia="ru-RU"/>
+        </w:rPr>
+        <w:t>[#</w:t>
+      </w:r>
+      <w:r>
+        <w:rPr>
+          <w:lang w:val="ru-RU" w:eastAsia="ru-RU"/>
+        </w:rPr>
+        <w:t>дс 33</w:t>
+      </w:r>
+      <w:r>
+        <w:rPr>
+          <w:lang w:val="ru-RU" w:eastAsia="ru-RU"/>
+        </w:rPr>
+        <w:t xml:space="preserve">] </w:t>
+      </w:r>
+      <w:r>
+        <w:rPr>
+          <w:lang w:val="ru-RU" w:eastAsia="ru-RU"/>
+        </w:rPr>
+        <w:t xml:space="preserve">описывается </w:t>
+      </w:r>
+      <w:r>
+        <w:rPr>
+          <w:lang w:val="ru-RU" w:eastAsia="ru-RU"/>
+        </w:rPr>
+        <w:t xml:space="preserve">архитектура сервиса для распознавания речи, в которой явно участвует обработка на стороне сервера </w:t>
+      </w:r>
+      <w:r>
+        <w:rPr>
+          <w:lang w:val="ru-RU" w:eastAsia="ru-RU"/>
+        </w:rPr>
+        <w:t>[#</w:t>
+      </w:r>
+      <w:r>
+        <w:rPr>
+          <w:lang w:val="ru-RU" w:eastAsia="ru-RU"/>
+        </w:rPr>
+        <w:t>дс 34</w:t>
+      </w:r>
+      <w:r>
+        <w:rPr>
+          <w:lang w:val="ru-RU" w:eastAsia="ru-RU"/>
+        </w:rPr>
+        <w:t>]</w:t>
+      </w:r>
+      <w:r>
+        <w:rPr>
+          <w:lang w:val="ru-RU" w:eastAsia="ru-RU"/>
+        </w:rPr>
+        <w:t>, что означает что обрабатываемые данные попадают неким третьим лицам, что совершенно недопустимо если речь идёт о конфиденциальности. По этой причине крайне востребованной является разработка собственного продукта для транскрибирования устной речи в текст.</w:t>
       </w:r>
     </w:p>
     <w:p>
       <w:pPr>
         <w:ind w:firstLine="426"/>
         <w:rPr>
-          <w:lang w:eastAsia="ru-RU"/>
-        </w:rPr>
-      </w:pPr>
-      <w:r>
-        <w:rPr>
           <w:lang w:val="ru-RU" w:eastAsia="ru-RU"/>
         </w:rPr>
-        <w:t>В общем и целом, автоматическое транскрибирование при помощи технологии искусственного интеллекта позволяет сильно повысить эффективность работы путём сокращения временных затрат, отсутствия необходимости воспринимать аудио и видео материал, а также исключая фактор человеческих ошибок. Подробнее обо всех преимуществах и возможных трудностях описано в статье</w:t>
-      </w:r>
-      <w:r>
-        <w:rPr>
-          <w:lang w:eastAsia="ru-RU"/>
-        </w:rPr>
-        <w:t xml:space="preserve"> </w:t>
-      </w:r>
-      <w:r>
-        <w:rPr>
-          <w:lang w:eastAsia="ru-RU"/>
-        </w:rPr>
-        <w:t> «Разработка систем автоматического распознавания речи на основе искусственного интеллекта» авторов Сеитова С., Хатамова С., Машрыковой Ш.</w:t>
-      </w:r>
-      <w:r>
-        <w:rPr>
-          <w:lang w:eastAsia="ru-RU"/>
-        </w:rPr>
-        <w:t xml:space="preserve"> </w:t>
-      </w:r>
-      <w:r>
-        <w:rPr>
-          <w:lang w:eastAsia="ru-RU"/>
-        </w:rPr>
-        <w:t>[</w:t>
-      </w:r>
+      </w:pPr>
       <w:r>
         <w:rPr>
           <w:lang w:val="ru-RU" w:eastAsia="ru-RU"/>
         </w:rPr>
-        <w:t>#</w:t>
-      </w:r>
-      <w:r>
-        <w:rPr>
-          <w:lang w:val="ru-RU" w:eastAsia="ru-RU"/>
-        </w:rPr>
-        <w:t>дс 27</w:t>
-      </w:r>
-      <w:r>
-        <w:rPr>
-          <w:lang w:eastAsia="ru-RU"/>
-        </w:rPr>
-        <w:t>]</w:t>
-      </w:r>
-      <w:r>
-        <w:rPr>
-          <w:lang w:eastAsia="ru-RU"/>
-        </w:rPr>
-        <w:t>.</w:t>
+        <w:t>На основе описания предметной области была сформирована тема работы: «Автоматическое транскрибирование устной речи в текст при помощи искусственного интеллекта».</w:t>
       </w:r>
     </w:p>
     <w:p>
@@ -7081,62 +7342,26 @@
         <w:rPr>
           <w:lang w:val="ru-RU"/>
         </w:rPr>
+        <w:t xml:space="preserve"> Среда разработки – это набор процедур и инструментов для разработки, тестирования и отладки приложения или программы. Другими словами, среда разработки программного обеспечения и веб-разработки </w:t>
+      </w:r>
+      <w:r>
+        <w:rPr>
+          <w:lang w:val="ru-RU"/>
+        </w:rPr>
+        <w:t>— это</w:t>
+      </w:r>
+      <w:r>
+        <w:rPr>
+          <w:lang w:val="ru-RU"/>
+        </w:rPr>
         <w:t xml:space="preserve"> </w:t>
       </w:r>
       <w:r>
         <w:rPr>
           <w:lang w:val="ru-RU"/>
         </w:rPr>
-        <w:t xml:space="preserve">Среда разработки </w:t>
-      </w:r>
-      <w:r>
-        <w:rPr>
-          <w:lang w:val="ru-RU"/>
-        </w:rPr>
-        <w:t>–</w:t>
-      </w:r>
-      <w:r>
-        <w:rPr>
-          <w:lang w:val="ru-RU"/>
-        </w:rPr>
-        <w:t xml:space="preserve"> это набор процедур и инструментов для разработки, тестирования и отладки приложения или программы. Другими словами, среда разработки программного обеспечения и веб-разработки </w:t>
-      </w:r>
-      <w:r>
-        <w:rPr>
-          <w:lang w:val="ru-RU"/>
-        </w:rPr>
-        <w:t>— это</w:t>
-      </w:r>
-      <w:r>
-        <w:rPr>
-          <w:lang w:val="ru-RU"/>
-        </w:rPr>
-        <w:t xml:space="preserve"> </w:t>
-      </w:r>
-      <w:r>
-        <w:rPr>
-          <w:lang w:val="ru-RU"/>
-        </w:rPr>
         <w:lastRenderedPageBreak/>
-        <w:t>рабочая среда</w:t>
-      </w:r>
-      <w:r>
-        <w:rPr>
-          <w:lang w:val="ru-RU"/>
-        </w:rPr>
-        <w:t xml:space="preserve"> для </w:t>
-      </w:r>
-      <w:r>
-        <w:rPr>
-          <w:lang w:val="ru-RU"/>
-        </w:rPr>
-        <w:t>разработчиков, в которой можно вносить изменения, не нарушая ничего в реальной среде. Интегрированная среда разработки часто используются как инструмент программирования, чтобы помочь разработчику</w:t>
-      </w:r>
-      <w:r>
-        <w:rPr>
-          <w:lang w:val="ru-RU"/>
-        </w:rPr>
-        <w:t xml:space="preserve">. </w:t>
+        <w:t xml:space="preserve">рабочая среда для разработчиков, в которой можно вносить изменения, не нарушая ничего в реальной среде. Интегрированная среда разработки часто используются как инструмент программирования, чтобы помочь разработчику. </w:t>
       </w:r>
       <w:r>
         <w:rPr>
@@ -7593,35 +7818,24 @@
       </w:r>
       <w:r>
         <w:rPr>
-          <w:lang w:val="en-US"/>
+          <w:lang w:val="ru-RU"/>
         </w:rPr>
         <w:t>#</w:t>
       </w:r>
-      <w:proofErr w:type="spellStart"/>
-      <w:r>
-        <w:rPr>
-          <w:lang w:val="ru-RU"/>
-        </w:rPr>
-        <w:t>дс</w:t>
-      </w:r>
-      <w:proofErr w:type="spellEnd"/>
-      <w:r>
-        <w:rPr>
-          <w:lang w:val="ru-RU"/>
-        </w:rPr>
-        <w:t xml:space="preserve"> 28</w:t>
-      </w:r>
-      <w:r>
-        <w:rPr>
-          <w:lang w:val="en-US"/>
+      <w:r>
+        <w:rPr>
+          <w:lang w:val="ru-RU"/>
+        </w:rPr>
+        <w:t>дс 28</w:t>
+      </w:r>
+      <w:r>
+        <w:rPr>
+          <w:lang w:val="ru-RU"/>
         </w:rPr>
         <w:t>]</w:t>
       </w:r>
       <w:r>
-        <w:t>.</w:t>
-      </w:r>
-      <w:r>
-        <w:t xml:space="preserve"> </w:t>
+        <w:t xml:space="preserve">. </w:t>
       </w:r>
       <w:r>
         <w:t>Система транскрибирования речи является «серцем» всего проекта, поэтому крайне важно выбрать</w:t>
@@ -8393,7 +8607,7 @@
     <w:p>
       <w:pPr>
         <w:rPr>
-          <w:lang w:val="en-US"/>
+          <w:lang w:val="ru-RU"/>
         </w:rPr>
       </w:pPr>
       <w:proofErr w:type="spellStart"/>
@@ -8899,6 +9113,12 @@
       </w:pPr>
       <w:r>
         <w:rPr>
+          <w:lang w:val="ru-RU"/>
+        </w:rPr>
+        <w:t xml:space="preserve">Компания </w:t>
+      </w:r>
+      <w:r>
+        <w:rPr>
           <w:lang w:val="en-US"/>
         </w:rPr>
         <w:t>Google</w:t>
@@ -9075,7 +9295,19 @@
         <w:rPr>
           <w:lang w:val="ru-RU"/>
         </w:rPr>
-        <w:t xml:space="preserve">Сервис от </w:t>
+        <w:t xml:space="preserve">Сервис </w:t>
+      </w:r>
+      <w:r>
+        <w:rPr>
+          <w:lang w:val="ru-RU"/>
+        </w:rPr>
+        <w:t>компании</w:t>
+      </w:r>
+      <w:r>
+        <w:rPr>
+          <w:lang w:val="ru-RU"/>
+        </w:rPr>
+        <w:t xml:space="preserve"> </w:t>
       </w:r>
       <w:r>
         <w:rPr>
@@ -10504,6 +10736,91 @@
             <w:rStyle w:val="ac"/>
           </w:rPr>
           <w:t>https://cyberleninka.ru/article/n/kratko-pro-docker</w:t>
+        </w:r>
+      </w:hyperlink>
+    </w:p>
+    <w:p>
+      <w:pPr>
+        <w:pStyle w:val="a7"/>
+        <w:numPr>
+          <w:ilvl w:val="0"/>
+          <w:numId w:val="3"/>
+        </w:numPr>
+      </w:pPr>
+      <w:hyperlink r:id="rId24" w:history="1">
+        <w:r>
+          <w:rPr>
+            <w:rStyle w:val="ac"/>
+          </w:rPr>
+          <w:t>https://vestnik-rosnou.ru/sites/default/files/87_CC%204%202023.pdf</w:t>
+        </w:r>
+      </w:hyperlink>
+    </w:p>
+    <w:p>
+      <w:pPr>
+        <w:pStyle w:val="a7"/>
+        <w:numPr>
+          <w:ilvl w:val="0"/>
+          <w:numId w:val="3"/>
+        </w:numPr>
+      </w:pPr>
+      <w:hyperlink r:id="rId25" w:history="1">
+        <w:r>
+          <w:rPr>
+            <w:rStyle w:val="ac"/>
+          </w:rPr>
+          <w:t>https://www.google.de/books/edition/%D0%98%D0%BD%D1%84%D0%BE%D1%80%D0%BC%D0%B0%D1%86%D0%B8%D0%BE%D0%BD%D0%BD%D1%8B%D0%B5_%D1%82%D0%B5%D1%85%D0%BD%D0%BE/EmkSEQAAQBAJ?hl=en&amp;gbpv=0</w:t>
+        </w:r>
+      </w:hyperlink>
+    </w:p>
+    <w:p>
+      <w:pPr>
+        <w:pStyle w:val="a7"/>
+        <w:numPr>
+          <w:ilvl w:val="0"/>
+          <w:numId w:val="3"/>
+        </w:numPr>
+      </w:pPr>
+      <w:hyperlink r:id="rId26" w:history="1">
+        <w:r>
+          <w:rPr>
+            <w:rStyle w:val="ac"/>
+          </w:rPr>
+          <w:t>https://www.google.de/books/edition/%D0%9F%D0%BE%D0%BB%D0%B8%D1%82%D0%B8%D1%87%D0%B5%D1%81%D0%BA%D0%B0%D1%8F_%D0%B6%D1%83%D1%80%D0%BD%D0%B0%D0%BB%D0%B8/kCYkEAAAQBAJ?hl=ru&amp;gbpv=0&amp;kptab=overview</w:t>
+        </w:r>
+      </w:hyperlink>
+    </w:p>
+    <w:p>
+      <w:pPr>
+        <w:pStyle w:val="a7"/>
+        <w:numPr>
+          <w:ilvl w:val="0"/>
+          <w:numId w:val="3"/>
+        </w:numPr>
+      </w:pPr>
+      <w:hyperlink r:id="rId27" w:history="1">
+        <w:r>
+          <w:rPr>
+            <w:rStyle w:val="ac"/>
+          </w:rPr>
+          <w:t>https://www.elibrary.ru/item.asp?id=48004881</w:t>
+        </w:r>
+      </w:hyperlink>
+    </w:p>
+    <w:p>
+      <w:pPr>
+        <w:pStyle w:val="a7"/>
+        <w:numPr>
+          <w:ilvl w:val="0"/>
+          <w:numId w:val="3"/>
+        </w:numPr>
+      </w:pPr>
+      <w:hyperlink r:id="rId28" w:history="1">
+        <w:r>
+          <w:rPr>
+            <w:rStyle w:val="ac"/>
+          </w:rPr>
+          <w:t>https://cyberleninka.ru/article/n/obzor-razlichnyh-web-serverov</w:t>
         </w:r>
       </w:hyperlink>
     </w:p>
@@ -12404,6 +12721,7 @@
   <w:style w:type="character" w:default="1" w:styleId="a0">
     <w:name w:val="Default Paragraph Font"/>
     <w:uiPriority w:val="1"/>
+    <w:semiHidden/>
     <w:unhideWhenUsed/>
   </w:style>
   <w:style w:type="table" w:default="1" w:styleId="a1">

</xml_diff>

<commit_message>
vault backup: 2025-12-12 23:57:34
</commit_message>
<xml_diff>
--- a/Курс 3/НИР/НИР_Кринкин.docx
+++ b/Курс 3/НИР/НИР_Кринкин.docx
@@ -1083,180 +1083,1216 @@
         <w:t xml:space="preserve"> г.</w:t>
       </w:r>
     </w:p>
-    <w:p>
-      <w:pPr>
-        <w:jc w:val="center"/>
-        <w:rPr>
-          <w:lang w:val="ru-RU"/>
-        </w:rPr>
-      </w:pPr>
-      <w:r>
-        <w:rPr>
-          <w:lang w:val="ru-RU"/>
-        </w:rPr>
-        <w:lastRenderedPageBreak/>
-        <w:t>Оглавление</w:t>
-      </w:r>
-    </w:p>
-    <w:p>
-      <w:pPr>
-        <w:rPr>
-          <w:lang w:val="ru-RU"/>
-        </w:rPr>
-      </w:pPr>
-      <w:r>
-        <w:rPr>
-          <w:lang w:val="ru-RU"/>
-        </w:rPr>
-        <w:t xml:space="preserve">Введение – </w:t>
-      </w:r>
-      <w:r>
-        <w:rPr>
-          <w:color w:val="00B050"/>
-          <w:lang w:val="ru-RU"/>
-        </w:rPr>
-        <w:t>готово</w:t>
-      </w:r>
-    </w:p>
-    <w:p>
-      <w:pPr>
-        <w:rPr>
-          <w:lang w:val="ru-RU"/>
-        </w:rPr>
-      </w:pPr>
-      <w:r>
-        <w:rPr>
-          <w:lang w:val="ru-RU"/>
-        </w:rPr>
-        <w:t>Раздел 1</w:t>
-      </w:r>
-      <w:r>
-        <w:rPr>
-          <w:lang w:val="ru-RU"/>
-        </w:rPr>
-        <w:t xml:space="preserve"> </w:t>
-      </w:r>
-      <w:r>
-        <w:rPr>
-          <w:lang w:val="ru-RU"/>
-        </w:rPr>
-        <w:t xml:space="preserve">– </w:t>
-      </w:r>
-      <w:r>
-        <w:rPr>
-          <w:color w:val="00B050"/>
-          <w:lang w:val="ru-RU"/>
-        </w:rPr>
-        <w:t>готово</w:t>
-      </w:r>
-    </w:p>
-    <w:p>
-      <w:pPr>
-        <w:rPr>
-          <w:lang w:val="ru-RU"/>
-        </w:rPr>
-      </w:pPr>
-      <w:r>
-        <w:rPr>
-          <w:lang w:val="ru-RU"/>
-        </w:rPr>
-        <w:t xml:space="preserve">Раздел 2 – </w:t>
-      </w:r>
-      <w:r>
-        <w:rPr>
-          <w:color w:val="00B050"/>
-          <w:lang w:val="ru-RU"/>
-        </w:rPr>
-        <w:t>готово</w:t>
-      </w:r>
-    </w:p>
-    <w:p>
-      <w:pPr>
-        <w:rPr>
-          <w:lang w:val="ru-RU"/>
-        </w:rPr>
-      </w:pPr>
-      <w:r>
-        <w:rPr>
-          <w:lang w:val="ru-RU"/>
-        </w:rPr>
-        <w:t xml:space="preserve">Раздел 3 – </w:t>
-      </w:r>
-      <w:r>
-        <w:rPr>
-          <w:color w:val="00B050"/>
-          <w:lang w:val="ru-RU"/>
-        </w:rPr>
-        <w:t>готово</w:t>
-      </w:r>
-    </w:p>
-    <w:p>
-      <w:pPr>
-        <w:rPr>
-          <w:lang w:val="ru-RU"/>
-        </w:rPr>
-      </w:pPr>
-      <w:r>
-        <w:rPr>
-          <w:lang w:val="ru-RU"/>
-        </w:rPr>
-        <w:t xml:space="preserve">Раздел 4 – </w:t>
-      </w:r>
-      <w:r>
-        <w:rPr>
-          <w:color w:val="00B050"/>
-          <w:lang w:val="ru-RU"/>
-        </w:rPr>
-        <w:t>готово</w:t>
-      </w:r>
-    </w:p>
-    <w:p>
-      <w:pPr>
-        <w:rPr>
-          <w:lang w:val="ru-RU"/>
-        </w:rPr>
-      </w:pPr>
-      <w:r>
-        <w:rPr>
-          <w:lang w:val="ru-RU"/>
-        </w:rPr>
-        <w:t xml:space="preserve">Раздел 5 – </w:t>
-      </w:r>
-      <w:r>
-        <w:rPr>
-          <w:color w:val="00B050"/>
-          <w:lang w:val="ru-RU"/>
-        </w:rPr>
-        <w:t>готово</w:t>
-      </w:r>
-    </w:p>
-    <w:p>
-      <w:pPr>
-        <w:rPr>
-          <w:lang w:val="ru-RU"/>
-        </w:rPr>
-      </w:pPr>
-      <w:r>
-        <w:rPr>
-          <w:lang w:val="ru-RU"/>
-        </w:rPr>
-        <w:t xml:space="preserve">Заключение - </w:t>
-      </w:r>
-      <w:r>
-        <w:rPr>
-          <w:color w:val="EE0000"/>
-          <w:lang w:val="ru-RU"/>
-        </w:rPr>
-        <w:t>нет</w:t>
-      </w:r>
-    </w:p>
-    <w:p>
-      <w:pPr>
-        <w:rPr>
-          <w:lang w:val="ru-RU"/>
-        </w:rPr>
-      </w:pPr>
-    </w:p>
+    <w:sdt>
+      <w:sdtPr>
+        <w:rPr>
+          <w:lang w:val="ru-RU"/>
+        </w:rPr>
+        <w:id w:val="786777568"/>
+        <w:docPartObj>
+          <w:docPartGallery w:val="Table of Contents"/>
+          <w:docPartUnique/>
+        </w:docPartObj>
+      </w:sdtPr>
+      <w:sdtEndPr>
+        <w:rPr>
+          <w:b/>
+          <w:bCs/>
+          <w:noProof/>
+          <w:lang w:val="ru-US"/>
+        </w:rPr>
+      </w:sdtEndPr>
+      <w:sdtContent>
+        <w:p>
+          <w:pPr>
+            <w:spacing w:line="720" w:lineRule="auto"/>
+            <w:ind w:firstLine="0"/>
+            <w:jc w:val="center"/>
+            <w:rPr>
+              <w:rStyle w:val="20"/>
+              <w:rFonts w:cs="Times New Roman"/>
+              <w:szCs w:val="28"/>
+              <w:lang w:val="ru-RU"/>
+            </w:rPr>
+          </w:pPr>
+          <w:r>
+            <w:rPr>
+              <w:rStyle w:val="20"/>
+              <w:rFonts w:cs="Times New Roman"/>
+              <w:szCs w:val="28"/>
+            </w:rPr>
+            <w:t>Оглавление</w:t>
+          </w:r>
+        </w:p>
+        <w:p>
+          <w:pPr>
+            <w:pStyle w:val="11"/>
+            <w:ind w:firstLine="0"/>
+            <w:rPr>
+              <w:rFonts w:ascii="Times New Roman" w:hAnsi="Times New Roman" w:cs="Times New Roman"/>
+              <w:b w:val="0"/>
+              <w:bCs w:val="0"/>
+              <w:i w:val="0"/>
+              <w:iCs w:val="0"/>
+              <w:noProof/>
+              <w:sz w:val="28"/>
+              <w:szCs w:val="28"/>
+            </w:rPr>
+          </w:pPr>
+          <w:r>
+            <w:rPr>
+              <w:rFonts w:ascii="Times New Roman" w:hAnsi="Times New Roman" w:cs="Times New Roman"/>
+              <w:b w:val="0"/>
+              <w:bCs w:val="0"/>
+              <w:i w:val="0"/>
+              <w:iCs w:val="0"/>
+              <w:sz w:val="28"/>
+              <w:szCs w:val="28"/>
+            </w:rPr>
+            <w:fldChar w:fldCharType="begin"/>
+          </w:r>
+          <w:r>
+            <w:rPr>
+              <w:rFonts w:ascii="Times New Roman" w:hAnsi="Times New Roman" w:cs="Times New Roman"/>
+              <w:b w:val="0"/>
+              <w:bCs w:val="0"/>
+              <w:i w:val="0"/>
+              <w:iCs w:val="0"/>
+              <w:sz w:val="28"/>
+              <w:szCs w:val="28"/>
+            </w:rPr>
+            <w:instrText>TOC \o "1-3" \h \z \u</w:instrText>
+          </w:r>
+          <w:r>
+            <w:rPr>
+              <w:rFonts w:ascii="Times New Roman" w:hAnsi="Times New Roman" w:cs="Times New Roman"/>
+              <w:b w:val="0"/>
+              <w:bCs w:val="0"/>
+              <w:i w:val="0"/>
+              <w:iCs w:val="0"/>
+              <w:sz w:val="28"/>
+              <w:szCs w:val="28"/>
+            </w:rPr>
+            <w:fldChar w:fldCharType="separate"/>
+          </w:r>
+          <w:hyperlink w:anchor="_Toc216476068" w:history="1">
+            <w:r>
+              <w:rPr>
+                <w:rStyle w:val="ac"/>
+                <w:rFonts w:ascii="Times New Roman" w:hAnsi="Times New Roman" w:cs="Times New Roman"/>
+                <w:b w:val="0"/>
+                <w:bCs w:val="0"/>
+                <w:i w:val="0"/>
+                <w:iCs w:val="0"/>
+                <w:noProof/>
+                <w:sz w:val="28"/>
+                <w:szCs w:val="28"/>
+                <w:lang w:val="ru-RU"/>
+              </w:rPr>
+              <w:t>Введение</w:t>
+            </w:r>
+            <w:r>
+              <w:rPr>
+                <w:rFonts w:ascii="Times New Roman" w:hAnsi="Times New Roman" w:cs="Times New Roman"/>
+                <w:b w:val="0"/>
+                <w:bCs w:val="0"/>
+                <w:i w:val="0"/>
+                <w:iCs w:val="0"/>
+                <w:noProof/>
+                <w:webHidden/>
+                <w:sz w:val="28"/>
+                <w:szCs w:val="28"/>
+              </w:rPr>
+              <w:tab/>
+            </w:r>
+            <w:r>
+              <w:rPr>
+                <w:rFonts w:ascii="Times New Roman" w:hAnsi="Times New Roman" w:cs="Times New Roman"/>
+                <w:b w:val="0"/>
+                <w:bCs w:val="0"/>
+                <w:i w:val="0"/>
+                <w:iCs w:val="0"/>
+                <w:noProof/>
+                <w:webHidden/>
+                <w:sz w:val="28"/>
+                <w:szCs w:val="28"/>
+              </w:rPr>
+              <w:fldChar w:fldCharType="begin"/>
+            </w:r>
+            <w:r>
+              <w:rPr>
+                <w:rFonts w:ascii="Times New Roman" w:hAnsi="Times New Roman" w:cs="Times New Roman"/>
+                <w:b w:val="0"/>
+                <w:bCs w:val="0"/>
+                <w:i w:val="0"/>
+                <w:iCs w:val="0"/>
+                <w:noProof/>
+                <w:webHidden/>
+                <w:sz w:val="28"/>
+                <w:szCs w:val="28"/>
+              </w:rPr>
+              <w:instrText xml:space="preserve"> PAGEREF _Toc216476068 \h </w:instrText>
+            </w:r>
+            <w:r>
+              <w:rPr>
+                <w:rFonts w:ascii="Times New Roman" w:hAnsi="Times New Roman" w:cs="Times New Roman"/>
+                <w:b w:val="0"/>
+                <w:bCs w:val="0"/>
+                <w:i w:val="0"/>
+                <w:iCs w:val="0"/>
+                <w:noProof/>
+                <w:webHidden/>
+                <w:sz w:val="28"/>
+                <w:szCs w:val="28"/>
+              </w:rPr>
+            </w:r>
+            <w:r>
+              <w:rPr>
+                <w:rFonts w:ascii="Times New Roman" w:hAnsi="Times New Roman" w:cs="Times New Roman"/>
+                <w:b w:val="0"/>
+                <w:bCs w:val="0"/>
+                <w:i w:val="0"/>
+                <w:iCs w:val="0"/>
+                <w:noProof/>
+                <w:webHidden/>
+                <w:sz w:val="28"/>
+                <w:szCs w:val="28"/>
+              </w:rPr>
+              <w:fldChar w:fldCharType="separate"/>
+            </w:r>
+            <w:r>
+              <w:rPr>
+                <w:rFonts w:ascii="Times New Roman" w:hAnsi="Times New Roman" w:cs="Times New Roman"/>
+                <w:b w:val="0"/>
+                <w:bCs w:val="0"/>
+                <w:i w:val="0"/>
+                <w:iCs w:val="0"/>
+                <w:noProof/>
+                <w:webHidden/>
+                <w:sz w:val="28"/>
+                <w:szCs w:val="28"/>
+              </w:rPr>
+              <w:t>3</w:t>
+            </w:r>
+            <w:r>
+              <w:rPr>
+                <w:rFonts w:ascii="Times New Roman" w:hAnsi="Times New Roman" w:cs="Times New Roman"/>
+                <w:b w:val="0"/>
+                <w:bCs w:val="0"/>
+                <w:i w:val="0"/>
+                <w:iCs w:val="0"/>
+                <w:noProof/>
+                <w:webHidden/>
+                <w:sz w:val="28"/>
+                <w:szCs w:val="28"/>
+              </w:rPr>
+              <w:fldChar w:fldCharType="end"/>
+            </w:r>
+          </w:hyperlink>
+        </w:p>
+        <w:p>
+          <w:pPr>
+            <w:pStyle w:val="11"/>
+            <w:ind w:firstLine="0"/>
+            <w:rPr>
+              <w:rFonts w:ascii="Times New Roman" w:hAnsi="Times New Roman" w:cs="Times New Roman"/>
+              <w:b w:val="0"/>
+              <w:bCs w:val="0"/>
+              <w:i w:val="0"/>
+              <w:iCs w:val="0"/>
+              <w:noProof/>
+              <w:sz w:val="28"/>
+              <w:szCs w:val="28"/>
+            </w:rPr>
+          </w:pPr>
+          <w:hyperlink w:anchor="_Toc216476069" w:history="1">
+            <w:r>
+              <w:rPr>
+                <w:rStyle w:val="ac"/>
+                <w:rFonts w:ascii="Times New Roman" w:hAnsi="Times New Roman" w:cs="Times New Roman"/>
+                <w:b w:val="0"/>
+                <w:bCs w:val="0"/>
+                <w:i w:val="0"/>
+                <w:iCs w:val="0"/>
+                <w:noProof/>
+                <w:sz w:val="28"/>
+                <w:szCs w:val="28"/>
+                <w:lang w:val="ru-RU"/>
+              </w:rPr>
+              <w:t>Основная часть</w:t>
+            </w:r>
+            <w:r>
+              <w:rPr>
+                <w:rFonts w:ascii="Times New Roman" w:hAnsi="Times New Roman" w:cs="Times New Roman"/>
+                <w:b w:val="0"/>
+                <w:bCs w:val="0"/>
+                <w:i w:val="0"/>
+                <w:iCs w:val="0"/>
+                <w:noProof/>
+                <w:webHidden/>
+                <w:sz w:val="28"/>
+                <w:szCs w:val="28"/>
+              </w:rPr>
+              <w:tab/>
+            </w:r>
+            <w:r>
+              <w:rPr>
+                <w:rFonts w:ascii="Times New Roman" w:hAnsi="Times New Roman" w:cs="Times New Roman"/>
+                <w:b w:val="0"/>
+                <w:bCs w:val="0"/>
+                <w:i w:val="0"/>
+                <w:iCs w:val="0"/>
+                <w:noProof/>
+                <w:webHidden/>
+                <w:sz w:val="28"/>
+                <w:szCs w:val="28"/>
+              </w:rPr>
+              <w:fldChar w:fldCharType="begin"/>
+            </w:r>
+            <w:r>
+              <w:rPr>
+                <w:rFonts w:ascii="Times New Roman" w:hAnsi="Times New Roman" w:cs="Times New Roman"/>
+                <w:b w:val="0"/>
+                <w:bCs w:val="0"/>
+                <w:i w:val="0"/>
+                <w:iCs w:val="0"/>
+                <w:noProof/>
+                <w:webHidden/>
+                <w:sz w:val="28"/>
+                <w:szCs w:val="28"/>
+              </w:rPr>
+              <w:instrText xml:space="preserve"> PAGEREF _Toc216476069 \h </w:instrText>
+            </w:r>
+            <w:r>
+              <w:rPr>
+                <w:rFonts w:ascii="Times New Roman" w:hAnsi="Times New Roman" w:cs="Times New Roman"/>
+                <w:b w:val="0"/>
+                <w:bCs w:val="0"/>
+                <w:i w:val="0"/>
+                <w:iCs w:val="0"/>
+                <w:noProof/>
+                <w:webHidden/>
+                <w:sz w:val="28"/>
+                <w:szCs w:val="28"/>
+              </w:rPr>
+            </w:r>
+            <w:r>
+              <w:rPr>
+                <w:rFonts w:ascii="Times New Roman" w:hAnsi="Times New Roman" w:cs="Times New Roman"/>
+                <w:b w:val="0"/>
+                <w:bCs w:val="0"/>
+                <w:i w:val="0"/>
+                <w:iCs w:val="0"/>
+                <w:noProof/>
+                <w:webHidden/>
+                <w:sz w:val="28"/>
+                <w:szCs w:val="28"/>
+              </w:rPr>
+              <w:fldChar w:fldCharType="separate"/>
+            </w:r>
+            <w:r>
+              <w:rPr>
+                <w:rFonts w:ascii="Times New Roman" w:hAnsi="Times New Roman" w:cs="Times New Roman"/>
+                <w:b w:val="0"/>
+                <w:bCs w:val="0"/>
+                <w:i w:val="0"/>
+                <w:iCs w:val="0"/>
+                <w:noProof/>
+                <w:webHidden/>
+                <w:sz w:val="28"/>
+                <w:szCs w:val="28"/>
+              </w:rPr>
+              <w:t>4</w:t>
+            </w:r>
+            <w:r>
+              <w:rPr>
+                <w:rFonts w:ascii="Times New Roman" w:hAnsi="Times New Roman" w:cs="Times New Roman"/>
+                <w:b w:val="0"/>
+                <w:bCs w:val="0"/>
+                <w:i w:val="0"/>
+                <w:iCs w:val="0"/>
+                <w:noProof/>
+                <w:webHidden/>
+                <w:sz w:val="28"/>
+                <w:szCs w:val="28"/>
+              </w:rPr>
+              <w:fldChar w:fldCharType="end"/>
+            </w:r>
+          </w:hyperlink>
+        </w:p>
+        <w:p>
+          <w:pPr>
+            <w:pStyle w:val="23"/>
+            <w:tabs>
+              <w:tab w:val="right" w:leader="dot" w:pos="9345"/>
+            </w:tabs>
+            <w:ind w:left="0" w:firstLine="0"/>
+            <w:rPr>
+              <w:rFonts w:ascii="Times New Roman" w:hAnsi="Times New Roman" w:cs="Times New Roman"/>
+              <w:b w:val="0"/>
+              <w:bCs w:val="0"/>
+              <w:noProof/>
+              <w:sz w:val="28"/>
+              <w:szCs w:val="28"/>
+            </w:rPr>
+          </w:pPr>
+          <w:hyperlink w:anchor="_Toc216476070" w:history="1">
+            <w:r>
+              <w:rPr>
+                <w:rStyle w:val="ac"/>
+                <w:rFonts w:ascii="Times New Roman" w:hAnsi="Times New Roman" w:cs="Times New Roman"/>
+                <w:b w:val="0"/>
+                <w:bCs w:val="0"/>
+                <w:noProof/>
+                <w:sz w:val="28"/>
+                <w:szCs w:val="28"/>
+                <w:lang w:val="ru-RU"/>
+              </w:rPr>
+              <w:t>1. Изучение предметной области. Определение темы ВКР. Описаниепредметной области как объекта.</w:t>
+            </w:r>
+            <w:r>
+              <w:rPr>
+                <w:rFonts w:ascii="Times New Roman" w:hAnsi="Times New Roman" w:cs="Times New Roman"/>
+                <w:b w:val="0"/>
+                <w:bCs w:val="0"/>
+                <w:noProof/>
+                <w:webHidden/>
+                <w:sz w:val="28"/>
+                <w:szCs w:val="28"/>
+              </w:rPr>
+              <w:tab/>
+            </w:r>
+            <w:r>
+              <w:rPr>
+                <w:rFonts w:ascii="Times New Roman" w:hAnsi="Times New Roman" w:cs="Times New Roman"/>
+                <w:b w:val="0"/>
+                <w:bCs w:val="0"/>
+                <w:noProof/>
+                <w:webHidden/>
+                <w:sz w:val="28"/>
+                <w:szCs w:val="28"/>
+              </w:rPr>
+              <w:fldChar w:fldCharType="begin"/>
+            </w:r>
+            <w:r>
+              <w:rPr>
+                <w:rFonts w:ascii="Times New Roman" w:hAnsi="Times New Roman" w:cs="Times New Roman"/>
+                <w:b w:val="0"/>
+                <w:bCs w:val="0"/>
+                <w:noProof/>
+                <w:webHidden/>
+                <w:sz w:val="28"/>
+                <w:szCs w:val="28"/>
+              </w:rPr>
+              <w:instrText xml:space="preserve"> PAGEREF _Toc216476070 \h </w:instrText>
+            </w:r>
+            <w:r>
+              <w:rPr>
+                <w:rFonts w:ascii="Times New Roman" w:hAnsi="Times New Roman" w:cs="Times New Roman"/>
+                <w:b w:val="0"/>
+                <w:bCs w:val="0"/>
+                <w:noProof/>
+                <w:webHidden/>
+                <w:sz w:val="28"/>
+                <w:szCs w:val="28"/>
+              </w:rPr>
+            </w:r>
+            <w:r>
+              <w:rPr>
+                <w:rFonts w:ascii="Times New Roman" w:hAnsi="Times New Roman" w:cs="Times New Roman"/>
+                <w:b w:val="0"/>
+                <w:bCs w:val="0"/>
+                <w:noProof/>
+                <w:webHidden/>
+                <w:sz w:val="28"/>
+                <w:szCs w:val="28"/>
+              </w:rPr>
+              <w:fldChar w:fldCharType="separate"/>
+            </w:r>
+            <w:r>
+              <w:rPr>
+                <w:rFonts w:ascii="Times New Roman" w:hAnsi="Times New Roman" w:cs="Times New Roman"/>
+                <w:b w:val="0"/>
+                <w:bCs w:val="0"/>
+                <w:noProof/>
+                <w:webHidden/>
+                <w:sz w:val="28"/>
+                <w:szCs w:val="28"/>
+              </w:rPr>
+              <w:t>4</w:t>
+            </w:r>
+            <w:r>
+              <w:rPr>
+                <w:rFonts w:ascii="Times New Roman" w:hAnsi="Times New Roman" w:cs="Times New Roman"/>
+                <w:b w:val="0"/>
+                <w:bCs w:val="0"/>
+                <w:noProof/>
+                <w:webHidden/>
+                <w:sz w:val="28"/>
+                <w:szCs w:val="28"/>
+              </w:rPr>
+              <w:fldChar w:fldCharType="end"/>
+            </w:r>
+          </w:hyperlink>
+        </w:p>
+        <w:p>
+          <w:pPr>
+            <w:pStyle w:val="23"/>
+            <w:tabs>
+              <w:tab w:val="right" w:leader="dot" w:pos="9345"/>
+            </w:tabs>
+            <w:ind w:left="0" w:firstLine="0"/>
+            <w:rPr>
+              <w:rFonts w:ascii="Times New Roman" w:hAnsi="Times New Roman" w:cs="Times New Roman"/>
+              <w:b w:val="0"/>
+              <w:bCs w:val="0"/>
+              <w:noProof/>
+              <w:sz w:val="28"/>
+              <w:szCs w:val="28"/>
+            </w:rPr>
+          </w:pPr>
+          <w:hyperlink w:anchor="_Toc216476071" w:history="1">
+            <w:r>
+              <w:rPr>
+                <w:rStyle w:val="ac"/>
+                <w:rFonts w:ascii="Times New Roman" w:hAnsi="Times New Roman" w:cs="Times New Roman"/>
+                <w:b w:val="0"/>
+                <w:bCs w:val="0"/>
+                <w:noProof/>
+                <w:sz w:val="28"/>
+                <w:szCs w:val="28"/>
+                <w:lang w:val="ru-RU"/>
+              </w:rPr>
+              <w:t>2. Планирование работ по проекту</w:t>
+            </w:r>
+            <w:r>
+              <w:rPr>
+                <w:rFonts w:ascii="Times New Roman" w:hAnsi="Times New Roman" w:cs="Times New Roman"/>
+                <w:b w:val="0"/>
+                <w:bCs w:val="0"/>
+                <w:noProof/>
+                <w:webHidden/>
+                <w:sz w:val="28"/>
+                <w:szCs w:val="28"/>
+              </w:rPr>
+              <w:tab/>
+            </w:r>
+            <w:r>
+              <w:rPr>
+                <w:rFonts w:ascii="Times New Roman" w:hAnsi="Times New Roman" w:cs="Times New Roman"/>
+                <w:b w:val="0"/>
+                <w:bCs w:val="0"/>
+                <w:noProof/>
+                <w:webHidden/>
+                <w:sz w:val="28"/>
+                <w:szCs w:val="28"/>
+              </w:rPr>
+              <w:fldChar w:fldCharType="begin"/>
+            </w:r>
+            <w:r>
+              <w:rPr>
+                <w:rFonts w:ascii="Times New Roman" w:hAnsi="Times New Roman" w:cs="Times New Roman"/>
+                <w:b w:val="0"/>
+                <w:bCs w:val="0"/>
+                <w:noProof/>
+                <w:webHidden/>
+                <w:sz w:val="28"/>
+                <w:szCs w:val="28"/>
+              </w:rPr>
+              <w:instrText xml:space="preserve"> PAGEREF _Toc216476071 \h </w:instrText>
+            </w:r>
+            <w:r>
+              <w:rPr>
+                <w:rFonts w:ascii="Times New Roman" w:hAnsi="Times New Roman" w:cs="Times New Roman"/>
+                <w:b w:val="0"/>
+                <w:bCs w:val="0"/>
+                <w:noProof/>
+                <w:webHidden/>
+                <w:sz w:val="28"/>
+                <w:szCs w:val="28"/>
+              </w:rPr>
+            </w:r>
+            <w:r>
+              <w:rPr>
+                <w:rFonts w:ascii="Times New Roman" w:hAnsi="Times New Roman" w:cs="Times New Roman"/>
+                <w:b w:val="0"/>
+                <w:bCs w:val="0"/>
+                <w:noProof/>
+                <w:webHidden/>
+                <w:sz w:val="28"/>
+                <w:szCs w:val="28"/>
+              </w:rPr>
+              <w:fldChar w:fldCharType="separate"/>
+            </w:r>
+            <w:r>
+              <w:rPr>
+                <w:rFonts w:ascii="Times New Roman" w:hAnsi="Times New Roman" w:cs="Times New Roman"/>
+                <w:b w:val="0"/>
+                <w:bCs w:val="0"/>
+                <w:noProof/>
+                <w:webHidden/>
+                <w:sz w:val="28"/>
+                <w:szCs w:val="28"/>
+              </w:rPr>
+              <w:t>8</w:t>
+            </w:r>
+            <w:r>
+              <w:rPr>
+                <w:rFonts w:ascii="Times New Roman" w:hAnsi="Times New Roman" w:cs="Times New Roman"/>
+                <w:b w:val="0"/>
+                <w:bCs w:val="0"/>
+                <w:noProof/>
+                <w:webHidden/>
+                <w:sz w:val="28"/>
+                <w:szCs w:val="28"/>
+              </w:rPr>
+              <w:fldChar w:fldCharType="end"/>
+            </w:r>
+          </w:hyperlink>
+        </w:p>
+        <w:p>
+          <w:pPr>
+            <w:pStyle w:val="23"/>
+            <w:tabs>
+              <w:tab w:val="right" w:leader="dot" w:pos="9345"/>
+            </w:tabs>
+            <w:ind w:left="0" w:firstLine="0"/>
+            <w:rPr>
+              <w:rFonts w:ascii="Times New Roman" w:hAnsi="Times New Roman" w:cs="Times New Roman"/>
+              <w:b w:val="0"/>
+              <w:bCs w:val="0"/>
+              <w:noProof/>
+              <w:sz w:val="28"/>
+              <w:szCs w:val="28"/>
+            </w:rPr>
+          </w:pPr>
+          <w:hyperlink w:anchor="_Toc216476072" w:history="1">
+            <w:r>
+              <w:rPr>
+                <w:rStyle w:val="ac"/>
+                <w:rFonts w:ascii="Times New Roman" w:hAnsi="Times New Roman" w:cs="Times New Roman"/>
+                <w:b w:val="0"/>
+                <w:bCs w:val="0"/>
+                <w:noProof/>
+                <w:sz w:val="28"/>
+                <w:szCs w:val="28"/>
+                <w:lang w:val="ru-RU"/>
+              </w:rPr>
+              <w:t>3. Выбор технологии и инструментальных средств реализации проекта</w:t>
+            </w:r>
+            <w:r>
+              <w:rPr>
+                <w:rFonts w:ascii="Times New Roman" w:hAnsi="Times New Roman" w:cs="Times New Roman"/>
+                <w:b w:val="0"/>
+                <w:bCs w:val="0"/>
+                <w:noProof/>
+                <w:webHidden/>
+                <w:sz w:val="28"/>
+                <w:szCs w:val="28"/>
+              </w:rPr>
+              <w:tab/>
+            </w:r>
+            <w:r>
+              <w:rPr>
+                <w:rFonts w:ascii="Times New Roman" w:hAnsi="Times New Roman" w:cs="Times New Roman"/>
+                <w:b w:val="0"/>
+                <w:bCs w:val="0"/>
+                <w:noProof/>
+                <w:webHidden/>
+                <w:sz w:val="28"/>
+                <w:szCs w:val="28"/>
+              </w:rPr>
+              <w:fldChar w:fldCharType="begin"/>
+            </w:r>
+            <w:r>
+              <w:rPr>
+                <w:rFonts w:ascii="Times New Roman" w:hAnsi="Times New Roman" w:cs="Times New Roman"/>
+                <w:b w:val="0"/>
+                <w:bCs w:val="0"/>
+                <w:noProof/>
+                <w:webHidden/>
+                <w:sz w:val="28"/>
+                <w:szCs w:val="28"/>
+              </w:rPr>
+              <w:instrText xml:space="preserve"> PAGEREF _Toc216476072 \h </w:instrText>
+            </w:r>
+            <w:r>
+              <w:rPr>
+                <w:rFonts w:ascii="Times New Roman" w:hAnsi="Times New Roman" w:cs="Times New Roman"/>
+                <w:b w:val="0"/>
+                <w:bCs w:val="0"/>
+                <w:noProof/>
+                <w:webHidden/>
+                <w:sz w:val="28"/>
+                <w:szCs w:val="28"/>
+              </w:rPr>
+            </w:r>
+            <w:r>
+              <w:rPr>
+                <w:rFonts w:ascii="Times New Roman" w:hAnsi="Times New Roman" w:cs="Times New Roman"/>
+                <w:b w:val="0"/>
+                <w:bCs w:val="0"/>
+                <w:noProof/>
+                <w:webHidden/>
+                <w:sz w:val="28"/>
+                <w:szCs w:val="28"/>
+              </w:rPr>
+              <w:fldChar w:fldCharType="separate"/>
+            </w:r>
+            <w:r>
+              <w:rPr>
+                <w:rFonts w:ascii="Times New Roman" w:hAnsi="Times New Roman" w:cs="Times New Roman"/>
+                <w:b w:val="0"/>
+                <w:bCs w:val="0"/>
+                <w:noProof/>
+                <w:webHidden/>
+                <w:sz w:val="28"/>
+                <w:szCs w:val="28"/>
+              </w:rPr>
+              <w:t>11</w:t>
+            </w:r>
+            <w:r>
+              <w:rPr>
+                <w:rFonts w:ascii="Times New Roman" w:hAnsi="Times New Roman" w:cs="Times New Roman"/>
+                <w:b w:val="0"/>
+                <w:bCs w:val="0"/>
+                <w:noProof/>
+                <w:webHidden/>
+                <w:sz w:val="28"/>
+                <w:szCs w:val="28"/>
+              </w:rPr>
+              <w:fldChar w:fldCharType="end"/>
+            </w:r>
+          </w:hyperlink>
+        </w:p>
+        <w:p>
+          <w:pPr>
+            <w:pStyle w:val="23"/>
+            <w:tabs>
+              <w:tab w:val="right" w:leader="dot" w:pos="9345"/>
+            </w:tabs>
+            <w:ind w:left="0" w:firstLine="0"/>
+            <w:rPr>
+              <w:rFonts w:ascii="Times New Roman" w:hAnsi="Times New Roman" w:cs="Times New Roman"/>
+              <w:b w:val="0"/>
+              <w:bCs w:val="0"/>
+              <w:noProof/>
+              <w:sz w:val="28"/>
+              <w:szCs w:val="28"/>
+            </w:rPr>
+          </w:pPr>
+          <w:hyperlink w:anchor="_Toc216476073" w:history="1">
+            <w:r>
+              <w:rPr>
+                <w:rStyle w:val="ac"/>
+                <w:rFonts w:ascii="Times New Roman" w:hAnsi="Times New Roman" w:cs="Times New Roman"/>
+                <w:b w:val="0"/>
+                <w:bCs w:val="0"/>
+                <w:noProof/>
+                <w:sz w:val="28"/>
+                <w:szCs w:val="28"/>
+                <w:lang w:val="ru-RU"/>
+              </w:rPr>
+              <w:t xml:space="preserve">4. Анализ </w:t>
+            </w:r>
+            <w:r>
+              <w:rPr>
+                <w:rStyle w:val="ac"/>
+                <w:rFonts w:ascii="Times New Roman" w:hAnsi="Times New Roman" w:cs="Times New Roman"/>
+                <w:b w:val="0"/>
+                <w:bCs w:val="0"/>
+                <w:noProof/>
+                <w:sz w:val="28"/>
+                <w:szCs w:val="28"/>
+                <w:lang w:val="ru-RU"/>
+              </w:rPr>
+              <w:t>с</w:t>
+            </w:r>
+            <w:r>
+              <w:rPr>
+                <w:rStyle w:val="ac"/>
+                <w:rFonts w:ascii="Times New Roman" w:hAnsi="Times New Roman" w:cs="Times New Roman"/>
+                <w:b w:val="0"/>
+                <w:bCs w:val="0"/>
+                <w:noProof/>
+                <w:sz w:val="28"/>
+                <w:szCs w:val="28"/>
+                <w:lang w:val="ru-RU"/>
+              </w:rPr>
+              <w:t>уществующих технических решений</w:t>
+            </w:r>
+            <w:r>
+              <w:rPr>
+                <w:rFonts w:ascii="Times New Roman" w:hAnsi="Times New Roman" w:cs="Times New Roman"/>
+                <w:b w:val="0"/>
+                <w:bCs w:val="0"/>
+                <w:noProof/>
+                <w:webHidden/>
+                <w:sz w:val="28"/>
+                <w:szCs w:val="28"/>
+              </w:rPr>
+              <w:tab/>
+            </w:r>
+            <w:r>
+              <w:rPr>
+                <w:rFonts w:ascii="Times New Roman" w:hAnsi="Times New Roman" w:cs="Times New Roman"/>
+                <w:b w:val="0"/>
+                <w:bCs w:val="0"/>
+                <w:noProof/>
+                <w:webHidden/>
+                <w:sz w:val="28"/>
+                <w:szCs w:val="28"/>
+              </w:rPr>
+              <w:fldChar w:fldCharType="begin"/>
+            </w:r>
+            <w:r>
+              <w:rPr>
+                <w:rFonts w:ascii="Times New Roman" w:hAnsi="Times New Roman" w:cs="Times New Roman"/>
+                <w:b w:val="0"/>
+                <w:bCs w:val="0"/>
+                <w:noProof/>
+                <w:webHidden/>
+                <w:sz w:val="28"/>
+                <w:szCs w:val="28"/>
+              </w:rPr>
+              <w:instrText xml:space="preserve"> PAGEREF _Toc216476073 \h </w:instrText>
+            </w:r>
+            <w:r>
+              <w:rPr>
+                <w:rFonts w:ascii="Times New Roman" w:hAnsi="Times New Roman" w:cs="Times New Roman"/>
+                <w:b w:val="0"/>
+                <w:bCs w:val="0"/>
+                <w:noProof/>
+                <w:webHidden/>
+                <w:sz w:val="28"/>
+                <w:szCs w:val="28"/>
+              </w:rPr>
+            </w:r>
+            <w:r>
+              <w:rPr>
+                <w:rFonts w:ascii="Times New Roman" w:hAnsi="Times New Roman" w:cs="Times New Roman"/>
+                <w:b w:val="0"/>
+                <w:bCs w:val="0"/>
+                <w:noProof/>
+                <w:webHidden/>
+                <w:sz w:val="28"/>
+                <w:szCs w:val="28"/>
+              </w:rPr>
+              <w:fldChar w:fldCharType="separate"/>
+            </w:r>
+            <w:r>
+              <w:rPr>
+                <w:rFonts w:ascii="Times New Roman" w:hAnsi="Times New Roman" w:cs="Times New Roman"/>
+                <w:b w:val="0"/>
+                <w:bCs w:val="0"/>
+                <w:noProof/>
+                <w:webHidden/>
+                <w:sz w:val="28"/>
+                <w:szCs w:val="28"/>
+              </w:rPr>
+              <w:t>18</w:t>
+            </w:r>
+            <w:r>
+              <w:rPr>
+                <w:rFonts w:ascii="Times New Roman" w:hAnsi="Times New Roman" w:cs="Times New Roman"/>
+                <w:b w:val="0"/>
+                <w:bCs w:val="0"/>
+                <w:noProof/>
+                <w:webHidden/>
+                <w:sz w:val="28"/>
+                <w:szCs w:val="28"/>
+              </w:rPr>
+              <w:fldChar w:fldCharType="end"/>
+            </w:r>
+          </w:hyperlink>
+        </w:p>
+        <w:p>
+          <w:pPr>
+            <w:pStyle w:val="23"/>
+            <w:tabs>
+              <w:tab w:val="right" w:leader="dot" w:pos="9345"/>
+            </w:tabs>
+            <w:ind w:left="0" w:firstLine="0"/>
+            <w:rPr>
+              <w:rFonts w:ascii="Times New Roman" w:hAnsi="Times New Roman" w:cs="Times New Roman"/>
+              <w:b w:val="0"/>
+              <w:bCs w:val="0"/>
+              <w:noProof/>
+              <w:sz w:val="28"/>
+              <w:szCs w:val="28"/>
+            </w:rPr>
+          </w:pPr>
+          <w:hyperlink w:anchor="_Toc216476074" w:history="1">
+            <w:r>
+              <w:rPr>
+                <w:rStyle w:val="ac"/>
+                <w:rFonts w:ascii="Times New Roman" w:hAnsi="Times New Roman" w:cs="Times New Roman"/>
+                <w:b w:val="0"/>
+                <w:bCs w:val="0"/>
+                <w:noProof/>
+                <w:sz w:val="28"/>
+                <w:szCs w:val="28"/>
+                <w:lang w:val="ru-RU"/>
+              </w:rPr>
+              <w:t>5. Подбор математического аппарата</w:t>
+            </w:r>
+            <w:r>
+              <w:rPr>
+                <w:rFonts w:ascii="Times New Roman" w:hAnsi="Times New Roman" w:cs="Times New Roman"/>
+                <w:b w:val="0"/>
+                <w:bCs w:val="0"/>
+                <w:noProof/>
+                <w:webHidden/>
+                <w:sz w:val="28"/>
+                <w:szCs w:val="28"/>
+              </w:rPr>
+              <w:tab/>
+            </w:r>
+            <w:r>
+              <w:rPr>
+                <w:rFonts w:ascii="Times New Roman" w:hAnsi="Times New Roman" w:cs="Times New Roman"/>
+                <w:b w:val="0"/>
+                <w:bCs w:val="0"/>
+                <w:noProof/>
+                <w:webHidden/>
+                <w:sz w:val="28"/>
+                <w:szCs w:val="28"/>
+              </w:rPr>
+              <w:fldChar w:fldCharType="begin"/>
+            </w:r>
+            <w:r>
+              <w:rPr>
+                <w:rFonts w:ascii="Times New Roman" w:hAnsi="Times New Roman" w:cs="Times New Roman"/>
+                <w:b w:val="0"/>
+                <w:bCs w:val="0"/>
+                <w:noProof/>
+                <w:webHidden/>
+                <w:sz w:val="28"/>
+                <w:szCs w:val="28"/>
+              </w:rPr>
+              <w:instrText xml:space="preserve"> PAGEREF _Toc216476074 \h </w:instrText>
+            </w:r>
+            <w:r>
+              <w:rPr>
+                <w:rFonts w:ascii="Times New Roman" w:hAnsi="Times New Roman" w:cs="Times New Roman"/>
+                <w:b w:val="0"/>
+                <w:bCs w:val="0"/>
+                <w:noProof/>
+                <w:webHidden/>
+                <w:sz w:val="28"/>
+                <w:szCs w:val="28"/>
+              </w:rPr>
+            </w:r>
+            <w:r>
+              <w:rPr>
+                <w:rFonts w:ascii="Times New Roman" w:hAnsi="Times New Roman" w:cs="Times New Roman"/>
+                <w:b w:val="0"/>
+                <w:bCs w:val="0"/>
+                <w:noProof/>
+                <w:webHidden/>
+                <w:sz w:val="28"/>
+                <w:szCs w:val="28"/>
+              </w:rPr>
+              <w:fldChar w:fldCharType="separate"/>
+            </w:r>
+            <w:r>
+              <w:rPr>
+                <w:rFonts w:ascii="Times New Roman" w:hAnsi="Times New Roman" w:cs="Times New Roman"/>
+                <w:b w:val="0"/>
+                <w:bCs w:val="0"/>
+                <w:noProof/>
+                <w:webHidden/>
+                <w:sz w:val="28"/>
+                <w:szCs w:val="28"/>
+              </w:rPr>
+              <w:t>20</w:t>
+            </w:r>
+            <w:r>
+              <w:rPr>
+                <w:rFonts w:ascii="Times New Roman" w:hAnsi="Times New Roman" w:cs="Times New Roman"/>
+                <w:b w:val="0"/>
+                <w:bCs w:val="0"/>
+                <w:noProof/>
+                <w:webHidden/>
+                <w:sz w:val="28"/>
+                <w:szCs w:val="28"/>
+              </w:rPr>
+              <w:fldChar w:fldCharType="end"/>
+            </w:r>
+          </w:hyperlink>
+        </w:p>
+        <w:p>
+          <w:pPr>
+            <w:pStyle w:val="11"/>
+            <w:ind w:firstLine="0"/>
+            <w:rPr>
+              <w:rFonts w:ascii="Times New Roman" w:hAnsi="Times New Roman" w:cs="Times New Roman"/>
+              <w:b w:val="0"/>
+              <w:bCs w:val="0"/>
+              <w:i w:val="0"/>
+              <w:iCs w:val="0"/>
+              <w:noProof/>
+              <w:sz w:val="28"/>
+              <w:szCs w:val="28"/>
+            </w:rPr>
+          </w:pPr>
+          <w:hyperlink w:anchor="_Toc216476075" w:history="1">
+            <w:r>
+              <w:rPr>
+                <w:rStyle w:val="ac"/>
+                <w:rFonts w:ascii="Times New Roman" w:hAnsi="Times New Roman" w:cs="Times New Roman"/>
+                <w:b w:val="0"/>
+                <w:bCs w:val="0"/>
+                <w:i w:val="0"/>
+                <w:iCs w:val="0"/>
+                <w:noProof/>
+                <w:sz w:val="28"/>
+                <w:szCs w:val="28"/>
+                <w:lang w:val="ru-RU"/>
+              </w:rPr>
+              <w:t>Заключение</w:t>
+            </w:r>
+            <w:r>
+              <w:rPr>
+                <w:rFonts w:ascii="Times New Roman" w:hAnsi="Times New Roman" w:cs="Times New Roman"/>
+                <w:b w:val="0"/>
+                <w:bCs w:val="0"/>
+                <w:i w:val="0"/>
+                <w:iCs w:val="0"/>
+                <w:noProof/>
+                <w:webHidden/>
+                <w:sz w:val="28"/>
+                <w:szCs w:val="28"/>
+              </w:rPr>
+              <w:tab/>
+            </w:r>
+            <w:r>
+              <w:rPr>
+                <w:rFonts w:ascii="Times New Roman" w:hAnsi="Times New Roman" w:cs="Times New Roman"/>
+                <w:b w:val="0"/>
+                <w:bCs w:val="0"/>
+                <w:i w:val="0"/>
+                <w:iCs w:val="0"/>
+                <w:noProof/>
+                <w:webHidden/>
+                <w:sz w:val="28"/>
+                <w:szCs w:val="28"/>
+              </w:rPr>
+              <w:fldChar w:fldCharType="begin"/>
+            </w:r>
+            <w:r>
+              <w:rPr>
+                <w:rFonts w:ascii="Times New Roman" w:hAnsi="Times New Roman" w:cs="Times New Roman"/>
+                <w:b w:val="0"/>
+                <w:bCs w:val="0"/>
+                <w:i w:val="0"/>
+                <w:iCs w:val="0"/>
+                <w:noProof/>
+                <w:webHidden/>
+                <w:sz w:val="28"/>
+                <w:szCs w:val="28"/>
+              </w:rPr>
+              <w:instrText xml:space="preserve"> PAGEREF _Toc216476075 \h </w:instrText>
+            </w:r>
+            <w:r>
+              <w:rPr>
+                <w:rFonts w:ascii="Times New Roman" w:hAnsi="Times New Roman" w:cs="Times New Roman"/>
+                <w:b w:val="0"/>
+                <w:bCs w:val="0"/>
+                <w:i w:val="0"/>
+                <w:iCs w:val="0"/>
+                <w:noProof/>
+                <w:webHidden/>
+                <w:sz w:val="28"/>
+                <w:szCs w:val="28"/>
+              </w:rPr>
+            </w:r>
+            <w:r>
+              <w:rPr>
+                <w:rFonts w:ascii="Times New Roman" w:hAnsi="Times New Roman" w:cs="Times New Roman"/>
+                <w:b w:val="0"/>
+                <w:bCs w:val="0"/>
+                <w:i w:val="0"/>
+                <w:iCs w:val="0"/>
+                <w:noProof/>
+                <w:webHidden/>
+                <w:sz w:val="28"/>
+                <w:szCs w:val="28"/>
+              </w:rPr>
+              <w:fldChar w:fldCharType="separate"/>
+            </w:r>
+            <w:r>
+              <w:rPr>
+                <w:rFonts w:ascii="Times New Roman" w:hAnsi="Times New Roman" w:cs="Times New Roman"/>
+                <w:b w:val="0"/>
+                <w:bCs w:val="0"/>
+                <w:i w:val="0"/>
+                <w:iCs w:val="0"/>
+                <w:noProof/>
+                <w:webHidden/>
+                <w:sz w:val="28"/>
+                <w:szCs w:val="28"/>
+              </w:rPr>
+              <w:t>24</w:t>
+            </w:r>
+            <w:r>
+              <w:rPr>
+                <w:rFonts w:ascii="Times New Roman" w:hAnsi="Times New Roman" w:cs="Times New Roman"/>
+                <w:b w:val="0"/>
+                <w:bCs w:val="0"/>
+                <w:i w:val="0"/>
+                <w:iCs w:val="0"/>
+                <w:noProof/>
+                <w:webHidden/>
+                <w:sz w:val="28"/>
+                <w:szCs w:val="28"/>
+              </w:rPr>
+              <w:fldChar w:fldCharType="end"/>
+            </w:r>
+          </w:hyperlink>
+        </w:p>
+        <w:p>
+          <w:pPr>
+            <w:pStyle w:val="11"/>
+            <w:ind w:firstLine="0"/>
+            <w:rPr>
+              <w:rFonts w:ascii="Times New Roman" w:hAnsi="Times New Roman" w:cs="Times New Roman"/>
+              <w:b w:val="0"/>
+              <w:bCs w:val="0"/>
+              <w:i w:val="0"/>
+              <w:iCs w:val="0"/>
+              <w:noProof/>
+              <w:sz w:val="28"/>
+              <w:szCs w:val="28"/>
+            </w:rPr>
+          </w:pPr>
+          <w:hyperlink w:anchor="_Toc216476076" w:history="1">
+            <w:r>
+              <w:rPr>
+                <w:rStyle w:val="ac"/>
+                <w:rFonts w:ascii="Times New Roman" w:hAnsi="Times New Roman" w:cs="Times New Roman"/>
+                <w:b w:val="0"/>
+                <w:bCs w:val="0"/>
+                <w:i w:val="0"/>
+                <w:iCs w:val="0"/>
+                <w:noProof/>
+                <w:sz w:val="28"/>
+                <w:szCs w:val="28"/>
+                <w:lang w:val="ru-RU"/>
+              </w:rPr>
+              <w:t>Список литературы</w:t>
+            </w:r>
+            <w:r>
+              <w:rPr>
+                <w:rFonts w:ascii="Times New Roman" w:hAnsi="Times New Roman" w:cs="Times New Roman"/>
+                <w:b w:val="0"/>
+                <w:bCs w:val="0"/>
+                <w:i w:val="0"/>
+                <w:iCs w:val="0"/>
+                <w:noProof/>
+                <w:webHidden/>
+                <w:sz w:val="28"/>
+                <w:szCs w:val="28"/>
+              </w:rPr>
+              <w:tab/>
+            </w:r>
+            <w:r>
+              <w:rPr>
+                <w:rFonts w:ascii="Times New Roman" w:hAnsi="Times New Roman" w:cs="Times New Roman"/>
+                <w:b w:val="0"/>
+                <w:bCs w:val="0"/>
+                <w:i w:val="0"/>
+                <w:iCs w:val="0"/>
+                <w:noProof/>
+                <w:webHidden/>
+                <w:sz w:val="28"/>
+                <w:szCs w:val="28"/>
+              </w:rPr>
+              <w:fldChar w:fldCharType="begin"/>
+            </w:r>
+            <w:r>
+              <w:rPr>
+                <w:rFonts w:ascii="Times New Roman" w:hAnsi="Times New Roman" w:cs="Times New Roman"/>
+                <w:b w:val="0"/>
+                <w:bCs w:val="0"/>
+                <w:i w:val="0"/>
+                <w:iCs w:val="0"/>
+                <w:noProof/>
+                <w:webHidden/>
+                <w:sz w:val="28"/>
+                <w:szCs w:val="28"/>
+              </w:rPr>
+              <w:instrText xml:space="preserve"> PAGEREF _Toc216476076 \h </w:instrText>
+            </w:r>
+            <w:r>
+              <w:rPr>
+                <w:rFonts w:ascii="Times New Roman" w:hAnsi="Times New Roman" w:cs="Times New Roman"/>
+                <w:b w:val="0"/>
+                <w:bCs w:val="0"/>
+                <w:i w:val="0"/>
+                <w:iCs w:val="0"/>
+                <w:noProof/>
+                <w:webHidden/>
+                <w:sz w:val="28"/>
+                <w:szCs w:val="28"/>
+              </w:rPr>
+            </w:r>
+            <w:r>
+              <w:rPr>
+                <w:rFonts w:ascii="Times New Roman" w:hAnsi="Times New Roman" w:cs="Times New Roman"/>
+                <w:b w:val="0"/>
+                <w:bCs w:val="0"/>
+                <w:i w:val="0"/>
+                <w:iCs w:val="0"/>
+                <w:noProof/>
+                <w:webHidden/>
+                <w:sz w:val="28"/>
+                <w:szCs w:val="28"/>
+              </w:rPr>
+              <w:fldChar w:fldCharType="separate"/>
+            </w:r>
+            <w:r>
+              <w:rPr>
+                <w:rFonts w:ascii="Times New Roman" w:hAnsi="Times New Roman" w:cs="Times New Roman"/>
+                <w:b w:val="0"/>
+                <w:bCs w:val="0"/>
+                <w:i w:val="0"/>
+                <w:iCs w:val="0"/>
+                <w:noProof/>
+                <w:webHidden/>
+                <w:sz w:val="28"/>
+                <w:szCs w:val="28"/>
+              </w:rPr>
+              <w:t>25</w:t>
+            </w:r>
+            <w:r>
+              <w:rPr>
+                <w:rFonts w:ascii="Times New Roman" w:hAnsi="Times New Roman" w:cs="Times New Roman"/>
+                <w:b w:val="0"/>
+                <w:bCs w:val="0"/>
+                <w:i w:val="0"/>
+                <w:iCs w:val="0"/>
+                <w:noProof/>
+                <w:webHidden/>
+                <w:sz w:val="28"/>
+                <w:szCs w:val="28"/>
+              </w:rPr>
+              <w:fldChar w:fldCharType="end"/>
+            </w:r>
+          </w:hyperlink>
+        </w:p>
+        <w:p>
+          <w:r>
+            <w:rPr>
+              <w:rFonts w:cs="Times New Roman"/>
+              <w:noProof/>
+              <w:szCs w:val="28"/>
+            </w:rPr>
+            <w:fldChar w:fldCharType="end"/>
+          </w:r>
+        </w:p>
+      </w:sdtContent>
+    </w:sdt>
     <w:p>
       <w:pPr>
         <w:spacing w:after="160" w:line="278" w:lineRule="auto"/>
@@ -1275,11 +2311,12 @@
     </w:p>
     <w:p>
       <w:pPr>
-        <w:jc w:val="center"/>
-        <w:rPr>
-          <w:lang w:val="ru-RU"/>
-        </w:rPr>
-      </w:pPr>
+        <w:pStyle w:val="1"/>
+        <w:rPr>
+          <w:lang w:val="ru-RU"/>
+        </w:rPr>
+      </w:pPr>
+      <w:bookmarkStart w:id="0" w:name="_Toc216476068"/>
       <w:r>
         <w:rPr>
           <w:lang w:val="ru-RU"/>
@@ -1287,6 +2324,7 @@
         <w:lastRenderedPageBreak/>
         <w:t>Введение</w:t>
       </w:r>
+      <w:bookmarkEnd w:id="0"/>
     </w:p>
     <w:p>
       <w:pPr>
@@ -1401,11 +2439,12 @@
     </w:p>
     <w:p>
       <w:pPr>
-        <w:jc w:val="center"/>
-        <w:rPr>
-          <w:lang w:val="ru-RU"/>
-        </w:rPr>
-      </w:pPr>
+        <w:pStyle w:val="1"/>
+        <w:rPr>
+          <w:lang w:val="ru-RU"/>
+        </w:rPr>
+      </w:pPr>
+      <w:bookmarkStart w:id="1" w:name="_Toc216476069"/>
       <w:r>
         <w:rPr>
           <w:lang w:val="ru-RU"/>
@@ -1413,14 +2452,16 @@
         <w:lastRenderedPageBreak/>
         <w:t>Основная часть</w:t>
       </w:r>
+      <w:bookmarkEnd w:id="1"/>
     </w:p>
     <w:p>
       <w:pPr>
-        <w:pStyle w:val="1"/>
-        <w:rPr>
-          <w:lang w:val="ru-RU"/>
-        </w:rPr>
-      </w:pPr>
+        <w:pStyle w:val="2"/>
+        <w:rPr>
+          <w:lang w:val="ru-RU"/>
+        </w:rPr>
+      </w:pPr>
+      <w:bookmarkStart w:id="2" w:name="_Toc216476070"/>
       <w:r>
         <w:rPr>
           <w:lang w:val="ru-RU"/>
@@ -1439,6 +2480,7 @@
         </w:rPr>
         <w:t>.</w:t>
       </w:r>
+      <w:bookmarkEnd w:id="2"/>
     </w:p>
     <w:p>
       <w:pPr>
@@ -1781,7 +2823,7 @@
       </w:r>
       <w:r>
         <w:rPr>
-          <w:lang w:val="en-US" w:eastAsia="ru-RU"/>
+          <w:lang w:val="ru-RU" w:eastAsia="ru-RU"/>
         </w:rPr>
         <w:t>30</w:t>
       </w:r>
@@ -1809,7 +2851,7 @@
           <w:szCs w:val="28"/>
           <w:lang w:eastAsia="ru-RU"/>
         </w:rPr>
-        <w:t xml:space="preserve">Технологическая транскрипция использует программное обеспечение для преобразования аудиофайлов в текстовый формат. Этот тип транскрипции предлагает </w:t>
+        <w:t xml:space="preserve">Технологическая транскрипция использует программное обеспечение для преобразования </w:t>
       </w:r>
       <w:r>
         <w:rPr>
@@ -1818,7 +2860,7 @@
           <w:lang w:eastAsia="ru-RU"/>
         </w:rPr>
         <w:lastRenderedPageBreak/>
-        <w:t xml:space="preserve">несколько преимуществ по сравнению с ручной транскрипцией, включая скорость, точность и экономичность. </w:t>
+        <w:t xml:space="preserve">аудиофайлов в текстовый формат. Этот тип транскрипции предлагает несколько преимуществ по сравнению с ручной транскрипцией, включая скорость, точность и экономичность. </w:t>
       </w:r>
     </w:p>
     <w:p>
@@ -2018,14 +3060,8 @@
         <w:rPr>
           <w:lang w:eastAsia="ru-RU"/>
         </w:rPr>
-        <w:t xml:space="preserve">Во-вторых, результат транскрибации зависит от того, является ли транскрибация потоковой или создается транскрипт аудио/видео записи. </w:t>
-      </w:r>
-      <w:r>
-        <w:rPr>
-          <w:lang w:eastAsia="ru-RU"/>
-        </w:rPr>
         <w:lastRenderedPageBreak/>
-        <w:t xml:space="preserve">Потоковая транскрибация может выдавать большее количество ошибок, чем транскрибация аудио/видео записи. </w:t>
+        <w:t xml:space="preserve">Во-вторых, результат транскрибации зависит от того, является ли транскрибация потоковой или создается транскрипт аудио/видео записи. Потоковая транскрибация может выдавать большее количество ошибок, чем транскрибация аудио/видео записи. </w:t>
       </w:r>
     </w:p>
     <w:p>
@@ -2228,7 +3264,7 @@
       </w:r>
       <w:r>
         <w:rPr>
-          <w:lang w:val="en-US" w:eastAsia="ru-RU"/>
+          <w:lang w:val="ru-RU" w:eastAsia="ru-RU"/>
         </w:rPr>
         <w:t>6</w:t>
       </w:r>
@@ -2350,14 +3386,8 @@
         <w:rPr>
           <w:lang w:val="ru-RU" w:eastAsia="ru-RU"/>
         </w:rPr>
-        <w:t xml:space="preserve">В общем и целом, автоматическое транскрибирование при помощи технологии искусственного интеллекта позволяет сильно повысить </w:t>
-      </w:r>
-      <w:r>
-        <w:rPr>
-          <w:lang w:val="ru-RU" w:eastAsia="ru-RU"/>
-        </w:rPr>
         <w:lastRenderedPageBreak/>
-        <w:t>эффективность работы путём сокращения временных затрат, отсутствия необходимости воспринимать аудио и видео материал, а также исключая фактор человеческих ошибок. Подробнее обо всех преимуществах и возможных трудностях описано в статье</w:t>
+        <w:t>В общем и целом, автоматическое транскрибирование при помощи технологии искусственного интеллекта позволяет сильно повысить эффективность работы путём сокращения временных затрат, отсутствия необходимости воспринимать аудио и видео материал, а также исключая фактор человеческих ошибок. Подробнее обо всех преимуществах и возможных трудностях описано в статье</w:t>
       </w:r>
       <w:r>
         <w:rPr>
@@ -2484,7 +3514,7 @@
       </w:r>
       <w:r>
         <w:rPr>
-          <w:lang w:val="en-US"/>
+          <w:lang w:val="ru-RU"/>
         </w:rPr>
         <w:t>45</w:t>
       </w:r>
@@ -2505,7 +3535,7 @@
       <w:pPr>
         <w:ind w:firstLine="426"/>
         <w:rPr>
-          <w:lang w:val="en-US" w:eastAsia="ru-RU"/>
+          <w:lang w:val="ru-RU" w:eastAsia="ru-RU"/>
         </w:rPr>
       </w:pPr>
       <w:r>
@@ -2643,11 +3673,12 @@
     </w:p>
     <w:p>
       <w:pPr>
-        <w:pStyle w:val="1"/>
-        <w:rPr>
-          <w:lang w:val="ru-RU"/>
-        </w:rPr>
-      </w:pPr>
+        <w:pStyle w:val="2"/>
+        <w:rPr>
+          <w:lang w:val="ru-RU"/>
+        </w:rPr>
+      </w:pPr>
+      <w:bookmarkStart w:id="3" w:name="_Toc216476071"/>
       <w:r>
         <w:rPr>
           <w:lang w:val="ru-RU"/>
@@ -2655,6 +3686,7 @@
         <w:lastRenderedPageBreak/>
         <w:t>2. Планирование работ по проекту</w:t>
       </w:r>
+      <w:bookmarkEnd w:id="3"/>
     </w:p>
     <w:p>
       <w:pPr>
@@ -6957,11 +7989,12 @@
     </w:p>
     <w:p>
       <w:pPr>
-        <w:pStyle w:val="1"/>
-        <w:rPr>
-          <w:lang w:val="ru-RU"/>
-        </w:rPr>
-      </w:pPr>
+        <w:pStyle w:val="2"/>
+        <w:rPr>
+          <w:lang w:val="ru-RU"/>
+        </w:rPr>
+      </w:pPr>
+      <w:bookmarkStart w:id="4" w:name="_Toc216476072"/>
       <w:r>
         <w:rPr>
           <w:lang w:val="ru-RU"/>
@@ -6969,6 +8002,7 @@
         <w:lastRenderedPageBreak/>
         <w:t>3. Выбор технологии и инструментальных средств реализации проекта</w:t>
       </w:r>
+      <w:bookmarkEnd w:id="4"/>
     </w:p>
     <w:p>
       <w:pPr>
@@ -7394,7 +8428,7 @@
       </w:r>
       <w:r>
         <w:rPr>
-          <w:lang w:val="en-US"/>
+          <w:lang w:val="ru-RU"/>
         </w:rPr>
         <w:t>34</w:t>
       </w:r>
@@ -7715,7 +8749,7 @@
       </w:r>
       <w:r>
         <w:rPr>
-          <w:lang w:val="en-US"/>
+          <w:lang w:val="ru-RU"/>
         </w:rPr>
         <w:t>49</w:t>
       </w:r>
@@ -7847,7 +8881,7 @@
       </w:r>
       <w:r>
         <w:rPr>
-          <w:lang w:val="en-US"/>
+          <w:lang w:val="ru-RU"/>
         </w:rPr>
         <w:t>14</w:t>
       </w:r>
@@ -8162,7 +9196,7 @@
       </w:r>
       <w:r>
         <w:rPr>
-          <w:lang w:val="en-US"/>
+          <w:lang w:val="ru-RU"/>
         </w:rPr>
         <w:t>42</w:t>
       </w:r>
@@ -8428,7 +9462,7 @@
     <w:p>
       <w:pPr>
         <w:rPr>
-          <w:lang w:val="en-US"/>
+          <w:lang w:val="ru-RU"/>
         </w:rPr>
       </w:pPr>
       <w:r>
@@ -8883,19 +9917,19 @@
         <w:rPr>
           <w:lang w:val="ru-RU"/>
         </w:rPr>
-        <w:t xml:space="preserve"> Software Foundation в 2005 году.</w:t>
-      </w:r>
-      <w:r>
-        <w:rPr>
-          <w:lang w:val="ru-RU"/>
-        </w:rPr>
-        <w:t xml:space="preserve"> </w:t>
-      </w:r>
-      <w:r>
-        <w:rPr>
-          <w:lang w:val="en-US"/>
-        </w:rPr>
-        <w:t xml:space="preserve">Django </w:t>
+        <w:t xml:space="preserve"> Software Foundation в 2005 году. </w:t>
+      </w:r>
+      <w:r>
+        <w:rPr>
+          <w:lang w:val="en-US"/>
+        </w:rPr>
+        <w:t>Django</w:t>
+      </w:r>
+      <w:r>
+        <w:rPr>
+          <w:lang w:val="ru-RU"/>
+        </w:rPr>
+        <w:t xml:space="preserve"> </w:t>
       </w:r>
       <w:r>
         <w:rPr>
@@ -8905,7 +9939,7 @@
       </w:r>
       <w:r>
         <w:rPr>
-          <w:lang w:val="en-US"/>
+          <w:lang w:val="ru-RU"/>
         </w:rPr>
         <w:t xml:space="preserve"> </w:t>
       </w:r>
@@ -8917,7 +9951,7 @@
       </w:r>
       <w:r>
         <w:rPr>
-          <w:lang w:val="en-US"/>
+          <w:lang w:val="ru-RU"/>
         </w:rPr>
         <w:t xml:space="preserve"> </w:t>
       </w:r>
@@ -8929,9 +9963,69 @@
       </w:r>
       <w:r>
         <w:rPr>
-          <w:lang w:val="en-US"/>
-        </w:rPr>
-        <w:t xml:space="preserve"> 3-clause BSD (Berkeley Software Distribution). </w:t>
+          <w:lang w:val="ru-RU"/>
+        </w:rPr>
+        <w:t xml:space="preserve"> 3-</w:t>
+      </w:r>
+      <w:r>
+        <w:rPr>
+          <w:lang w:val="en-US"/>
+        </w:rPr>
+        <w:t>clause</w:t>
+      </w:r>
+      <w:r>
+        <w:rPr>
+          <w:lang w:val="ru-RU"/>
+        </w:rPr>
+        <w:t xml:space="preserve"> </w:t>
+      </w:r>
+      <w:r>
+        <w:rPr>
+          <w:lang w:val="en-US"/>
+        </w:rPr>
+        <w:t>BSD</w:t>
+      </w:r>
+      <w:r>
+        <w:rPr>
+          <w:lang w:val="ru-RU"/>
+        </w:rPr>
+        <w:t xml:space="preserve"> (</w:t>
+      </w:r>
+      <w:r>
+        <w:rPr>
+          <w:lang w:val="en-US"/>
+        </w:rPr>
+        <w:t>Berkeley</w:t>
+      </w:r>
+      <w:r>
+        <w:rPr>
+          <w:lang w:val="ru-RU"/>
+        </w:rPr>
+        <w:t xml:space="preserve"> </w:t>
+      </w:r>
+      <w:r>
+        <w:rPr>
+          <w:lang w:val="en-US"/>
+        </w:rPr>
+        <w:t>Software</w:t>
+      </w:r>
+      <w:r>
+        <w:rPr>
+          <w:lang w:val="ru-RU"/>
+        </w:rPr>
+        <w:t xml:space="preserve"> </w:t>
+      </w:r>
+      <w:r>
+        <w:rPr>
+          <w:lang w:val="en-US"/>
+        </w:rPr>
+        <w:t>Distribution</w:t>
+      </w:r>
+      <w:r>
+        <w:rPr>
+          <w:lang w:val="ru-RU"/>
+        </w:rPr>
+        <w:t xml:space="preserve">). </w:t>
       </w:r>
       <w:r>
         <w:rPr>
@@ -8941,7 +10035,7 @@
       </w:r>
       <w:r>
         <w:rPr>
-          <w:lang w:val="en-US"/>
+          <w:lang w:val="ru-RU"/>
         </w:rPr>
         <w:t xml:space="preserve"> </w:t>
       </w:r>
@@ -8953,7 +10047,7 @@
       </w:r>
       <w:r>
         <w:rPr>
-          <w:lang w:val="en-US"/>
+          <w:lang w:val="ru-RU"/>
         </w:rPr>
         <w:t xml:space="preserve"> </w:t>
       </w:r>
@@ -8965,7 +10059,7 @@
       </w:r>
       <w:r>
         <w:rPr>
-          <w:lang w:val="en-US"/>
+          <w:lang w:val="ru-RU"/>
         </w:rPr>
         <w:t xml:space="preserve"> </w:t>
       </w:r>
@@ -8977,7 +10071,7 @@
       </w:r>
       <w:r>
         <w:rPr>
-          <w:lang w:val="en-US"/>
+          <w:lang w:val="ru-RU"/>
         </w:rPr>
         <w:t xml:space="preserve"> </w:t>
       </w:r>
@@ -8989,7 +10083,7 @@
       </w:r>
       <w:r>
         <w:rPr>
-          <w:lang w:val="en-US"/>
+          <w:lang w:val="ru-RU"/>
         </w:rPr>
         <w:t xml:space="preserve"> </w:t>
       </w:r>
@@ -9001,7 +10095,7 @@
       </w:r>
       <w:r>
         <w:rPr>
-          <w:lang w:val="en-US"/>
+          <w:lang w:val="ru-RU"/>
         </w:rPr>
         <w:t>-</w:t>
       </w:r>
@@ -9013,7 +10107,7 @@
       </w:r>
       <w:r>
         <w:rPr>
-          <w:lang w:val="en-US"/>
+          <w:lang w:val="ru-RU"/>
         </w:rPr>
         <w:t xml:space="preserve">, </w:t>
       </w:r>
@@ -9025,7 +10119,7 @@
       </w:r>
       <w:r>
         <w:rPr>
-          <w:lang w:val="en-US"/>
+          <w:lang w:val="ru-RU"/>
         </w:rPr>
         <w:t xml:space="preserve"> </w:t>
       </w:r>
@@ -9037,21 +10131,57 @@
       </w:r>
       <w:r>
         <w:rPr>
-          <w:lang w:val="en-US"/>
-        </w:rPr>
-        <w:t xml:space="preserve"> Mozilla, Instagram, Bitbucket,</w:t>
-      </w:r>
-      <w:r>
-        <w:rPr>
-          <w:lang w:val="en-US"/>
-        </w:rPr>
-        <w:t xml:space="preserve"> </w:t>
-      </w:r>
-      <w:r>
-        <w:rPr>
-          <w:lang w:val="en-US"/>
-        </w:rPr>
-        <w:t xml:space="preserve">Pinterest </w:t>
+          <w:lang w:val="ru-RU"/>
+        </w:rPr>
+        <w:t xml:space="preserve"> </w:t>
+      </w:r>
+      <w:r>
+        <w:rPr>
+          <w:lang w:val="en-US"/>
+        </w:rPr>
+        <w:t>Mozilla</w:t>
+      </w:r>
+      <w:r>
+        <w:rPr>
+          <w:lang w:val="ru-RU"/>
+        </w:rPr>
+        <w:t xml:space="preserve">, </w:t>
+      </w:r>
+      <w:r>
+        <w:rPr>
+          <w:lang w:val="en-US"/>
+        </w:rPr>
+        <w:t>Instagram</w:t>
+      </w:r>
+      <w:r>
+        <w:rPr>
+          <w:lang w:val="ru-RU"/>
+        </w:rPr>
+        <w:t xml:space="preserve">, </w:t>
+      </w:r>
+      <w:r>
+        <w:rPr>
+          <w:lang w:val="en-US"/>
+        </w:rPr>
+        <w:t>Bitbucket</w:t>
+      </w:r>
+      <w:r>
+        <w:rPr>
+          <w:lang w:val="ru-RU"/>
+        </w:rPr>
+        <w:t xml:space="preserve">, </w:t>
+      </w:r>
+      <w:r>
+        <w:rPr>
+          <w:lang w:val="en-US"/>
+        </w:rPr>
+        <w:t>Pinterest</w:t>
+      </w:r>
+      <w:r>
+        <w:rPr>
+          <w:lang w:val="ru-RU"/>
+        </w:rPr>
+        <w:t xml:space="preserve"> </w:t>
       </w:r>
       <w:r>
         <w:rPr>
@@ -9061,7 +10191,7 @@
       </w:r>
       <w:r>
         <w:rPr>
-          <w:lang w:val="en-US"/>
+          <w:lang w:val="ru-RU"/>
         </w:rPr>
         <w:t xml:space="preserve"> </w:t>
       </w:r>
@@ -9073,7 +10203,7 @@
       </w:r>
       <w:r>
         <w:rPr>
-          <w:lang w:val="en-US"/>
+          <w:lang w:val="ru-RU"/>
         </w:rPr>
         <w:t>.</w:t>
       </w:r>
@@ -9085,7 +10215,7 @@
       </w:r>
       <w:r>
         <w:rPr>
-          <w:lang w:val="en-US"/>
+          <w:lang w:val="ru-RU"/>
         </w:rPr>
         <w:t xml:space="preserve">. </w:t>
       </w:r>
@@ -9097,7 +10227,7 @@
       </w:r>
       <w:r>
         <w:rPr>
-          <w:lang w:val="en-US"/>
+          <w:lang w:val="ru-RU"/>
         </w:rPr>
         <w:t xml:space="preserve"> </w:t>
       </w:r>
@@ -9109,7 +10239,7 @@
       </w:r>
       <w:r>
         <w:rPr>
-          <w:lang w:val="en-US"/>
+          <w:lang w:val="ru-RU"/>
         </w:rPr>
         <w:t xml:space="preserve"> </w:t>
       </w:r>
@@ -9121,7 +10251,7 @@
       </w:r>
       <w:r>
         <w:rPr>
-          <w:lang w:val="en-US"/>
+          <w:lang w:val="ru-RU"/>
         </w:rPr>
         <w:t xml:space="preserve"> </w:t>
       </w:r>
@@ -9133,7 +10263,7 @@
       </w:r>
       <w:r>
         <w:rPr>
-          <w:lang w:val="en-US"/>
+          <w:lang w:val="ru-RU"/>
         </w:rPr>
         <w:t xml:space="preserve"> </w:t>
       </w:r>
@@ -9145,9 +10275,39 @@
       </w:r>
       <w:r>
         <w:rPr>
-          <w:lang w:val="en-US"/>
-        </w:rPr>
-        <w:t xml:space="preserve"> Django Software Foundatio</w:t>
+          <w:lang w:val="ru-RU"/>
+        </w:rPr>
+        <w:t xml:space="preserve"> </w:t>
+      </w:r>
+      <w:r>
+        <w:rPr>
+          <w:lang w:val="en-US"/>
+        </w:rPr>
+        <w:t>Django</w:t>
+      </w:r>
+      <w:r>
+        <w:rPr>
+          <w:lang w:val="ru-RU"/>
+        </w:rPr>
+        <w:t xml:space="preserve"> </w:t>
+      </w:r>
+      <w:r>
+        <w:rPr>
+          <w:lang w:val="en-US"/>
+        </w:rPr>
+        <w:t>Software</w:t>
+      </w:r>
+      <w:r>
+        <w:rPr>
+          <w:lang w:val="ru-RU"/>
+        </w:rPr>
+        <w:t xml:space="preserve"> </w:t>
+      </w:r>
+      <w:r>
+        <w:rPr>
+          <w:lang w:val="en-US"/>
+        </w:rPr>
+        <w:t>Foundatio</w:t>
       </w:r>
       <w:r>
         <w:rPr>
@@ -9157,7 +10317,7 @@
       </w:r>
       <w:r>
         <w:rPr>
-          <w:lang w:val="en-US"/>
+          <w:lang w:val="ru-RU"/>
         </w:rPr>
         <w:t xml:space="preserve">. </w:t>
       </w:r>
@@ -9173,19 +10333,7 @@
         <w:rPr>
           <w:lang w:val="ru-RU"/>
         </w:rPr>
-        <w:t xml:space="preserve"> легок и имеет автономную функцию для целей разработки и тестирования.</w:t>
-      </w:r>
-      <w:r>
-        <w:rPr>
-          <w:lang w:val="ru-RU"/>
-        </w:rPr>
-        <w:t xml:space="preserve"> </w:t>
-      </w:r>
-      <w:r>
-        <w:rPr>
-          <w:lang w:val="ru-RU"/>
-        </w:rPr>
-        <w:t xml:space="preserve">Основная цель инфраструктуры </w:t>
+        <w:t xml:space="preserve"> легок и имеет автономную функцию для целей разработки и тестирования. Основная цель инфраструктуры </w:t>
       </w:r>
       <w:proofErr w:type="spellStart"/>
       <w:r>
@@ -9199,85 +10347,7 @@
         <w:rPr>
           <w:lang w:val="ru-RU"/>
         </w:rPr>
-        <w:t xml:space="preserve"> – облегчить разработку сложных веб-приложений</w:t>
-      </w:r>
-      <w:r>
-        <w:rPr>
-          <w:lang w:val="ru-RU"/>
-        </w:rPr>
-        <w:t xml:space="preserve"> </w:t>
-      </w:r>
-      <w:r>
-        <w:rPr>
-          <w:lang w:val="ru-RU"/>
-        </w:rPr>
-        <w:t>за меньшее время.</w:t>
-      </w:r>
-      <w:r>
-        <w:rPr>
-          <w:lang w:val="ru-RU"/>
-        </w:rPr>
-        <w:t xml:space="preserve"> </w:t>
-      </w:r>
-      <w:r>
-        <w:rPr>
-          <w:lang w:val="ru-RU"/>
-        </w:rPr>
-        <w:t>Это подчеркивает возможность многократного использования компонентов, меньше</w:t>
-      </w:r>
-      <w:r>
-        <w:rPr>
-          <w:lang w:val="ru-RU"/>
-        </w:rPr>
-        <w:t xml:space="preserve"> </w:t>
-      </w:r>
-      <w:r>
-        <w:rPr>
-          <w:lang w:val="ru-RU"/>
-        </w:rPr>
-        <w:t>кода, слабое связывание и быструю разработку. Он также предоставляет создание,</w:t>
-      </w:r>
-      <w:r>
-        <w:rPr>
-          <w:lang w:val="ru-RU"/>
-        </w:rPr>
-        <w:t xml:space="preserve"> </w:t>
-      </w:r>
-      <w:r>
-        <w:rPr>
-          <w:lang w:val="ru-RU"/>
-        </w:rPr>
-        <w:t>обновление, чтение и удаление интерфейса, созданного посредством самоанализа и</w:t>
-      </w:r>
-      <w:r>
-        <w:rPr>
-          <w:lang w:val="ru-RU"/>
-        </w:rPr>
-        <w:t xml:space="preserve"> </w:t>
-      </w:r>
-      <w:r>
-        <w:rPr>
-          <w:lang w:val="ru-RU"/>
-        </w:rPr>
-        <w:t>созданного с помощью моделей администратора. Они используют разные подходы для</w:t>
-      </w:r>
-      <w:r>
-        <w:rPr>
-          <w:lang w:val="ru-RU"/>
-        </w:rPr>
-        <w:t xml:space="preserve"> </w:t>
-      </w:r>
-      <w:r>
-        <w:rPr>
-          <w:lang w:val="ru-RU"/>
-        </w:rPr>
-        <w:t>разработки веб-приложения и создания дизайна API на основе REST. Инфраструктура</w:t>
-      </w:r>
-      <w:r>
-        <w:rPr>
-          <w:lang w:val="ru-RU"/>
-        </w:rPr>
-        <w:t xml:space="preserve"> </w:t>
+        <w:t xml:space="preserve"> – облегчить разработку сложных веб-приложений за меньшее время. Это подчеркивает возможность многократного использования компонентов, меньше кода, слабое связывание и быструю разработку. Он также предоставляет создание, обновление, чтение и удаление интерфейса, созданного посредством самоанализа и созданного с помощью моделей администратора. Они используют разные подходы для разработки веб-приложения и создания дизайна API на основе REST. Инфраструктура </w:t>
       </w:r>
       <w:proofErr w:type="spellStart"/>
       <w:r>
@@ -9291,19 +10361,7 @@
         <w:rPr>
           <w:lang w:val="ru-RU"/>
         </w:rPr>
-        <w:t xml:space="preserve"> использует собственную встроенную пользовательскую модель, которая облегчает</w:t>
-      </w:r>
-      <w:r>
-        <w:rPr>
-          <w:lang w:val="ru-RU"/>
-        </w:rPr>
-        <w:t xml:space="preserve"> </w:t>
-      </w:r>
-      <w:r>
-        <w:rPr>
-          <w:lang w:val="ru-RU"/>
-        </w:rPr>
-        <w:t>авторизацию и аутентификацию API</w:t>
+        <w:t xml:space="preserve"> использует собственную встроенную пользовательскую модель, которая облегчает авторизацию и аутентификацию API</w:t>
       </w:r>
       <w:r>
         <w:rPr>
@@ -9327,13 +10385,7 @@
         <w:rPr>
           <w:lang w:val="ru-RU"/>
         </w:rPr>
-        <w:t>.</w:t>
-      </w:r>
-      <w:r>
-        <w:rPr>
-          <w:lang w:val="ru-RU"/>
-        </w:rPr>
-        <w:t xml:space="preserve"> </w:t>
+        <w:t xml:space="preserve">. </w:t>
       </w:r>
     </w:p>
     <w:p>
@@ -9854,11 +10906,12 @@
     </w:p>
     <w:p>
       <w:pPr>
-        <w:pStyle w:val="1"/>
-        <w:rPr>
-          <w:lang w:val="ru-RU"/>
-        </w:rPr>
-      </w:pPr>
+        <w:pStyle w:val="2"/>
+        <w:rPr>
+          <w:lang w:val="ru-RU"/>
+        </w:rPr>
+      </w:pPr>
+      <w:bookmarkStart w:id="5" w:name="_Toc216476073"/>
       <w:r>
         <w:rPr>
           <w:lang w:val="ru-RU"/>
@@ -9866,6 +10919,7 @@
         <w:lastRenderedPageBreak/>
         <w:t>4. Анализ существующих технических решений</w:t>
       </w:r>
+      <w:bookmarkEnd w:id="5"/>
     </w:p>
     <w:p>
       <w:pPr>
@@ -9913,13 +10967,7 @@
         <w:rPr>
           <w:lang w:val="ru-RU"/>
         </w:rPr>
-        <w:t>]</w:t>
-      </w:r>
-      <w:r>
-        <w:rPr>
-          <w:lang w:val="ru-RU"/>
-        </w:rPr>
-        <w:t>.</w:t>
+        <w:t>].</w:t>
       </w:r>
       <w:r>
         <w:rPr>
@@ -10563,7 +11611,7 @@
       </w:r>
       <w:r>
         <w:rPr>
-          <w:lang w:val="en-US"/>
+          <w:lang w:val="ru-RU"/>
         </w:rPr>
         <w:t>6</w:t>
       </w:r>
@@ -10901,11 +11949,12 @@
     </w:p>
     <w:p>
       <w:pPr>
-        <w:pStyle w:val="1"/>
-        <w:rPr>
-          <w:lang w:val="ru-RU"/>
-        </w:rPr>
-      </w:pPr>
+        <w:pStyle w:val="2"/>
+        <w:rPr>
+          <w:lang w:val="ru-RU"/>
+        </w:rPr>
+      </w:pPr>
+      <w:bookmarkStart w:id="6" w:name="_Toc216476074"/>
       <w:r>
         <w:rPr>
           <w:lang w:val="ru-RU"/>
@@ -10913,6 +11962,7 @@
         <w:lastRenderedPageBreak/>
         <w:t>5. Подбор математического аппарата</w:t>
       </w:r>
+      <w:bookmarkEnd w:id="6"/>
     </w:p>
     <w:p>
       <w:pPr>
@@ -10992,19 +12042,7 @@
         <w:rPr>
           <w:lang w:val="ru-RU"/>
         </w:rPr>
-        <w:t xml:space="preserve">Регрессия </w:t>
-      </w:r>
-      <w:r>
-        <w:rPr>
-          <w:lang w:val="ru-RU"/>
-        </w:rPr>
-        <w:t>— это</w:t>
-      </w:r>
-      <w:r>
-        <w:rPr>
-          <w:lang w:val="ru-RU"/>
-        </w:rPr>
-        <w:t xml:space="preserve"> метод моделирования целевого значения на основе независимых предикторов. Этот метод, как правило, используется для прогнозирования и выяснения причинно-следственных связей между переменными. Методы регрессии различаются в зависимости от количества независимых переменных и типа отношений между независимыми и зависимыми переменными</w:t>
+        <w:t>Регрессия — это метод моделирования целевого значения на основе независимых предикторов. Этот метод, как правило, используется для прогнозирования и выяснения причинно-следственных связей между переменными. Методы регрессии различаются в зависимости от количества независимых переменных и типа отношений между независимыми и зависимыми переменными</w:t>
       </w:r>
       <w:r>
         <w:rPr>
@@ -11047,13 +12085,7 @@
         <w:rPr>
           <w:lang w:val="ru-RU"/>
         </w:rPr>
-        <w:t>Основной смысл алгоритма линейной регрессии заключается в том, чтобы найти наилучшие значения для а0 и a</w:t>
-      </w:r>
-      <w:r>
-        <w:rPr>
-          <w:lang w:val="ru-RU"/>
-        </w:rPr>
-        <w:t>1</w:t>
+        <w:t>Основной смысл алгоритма линейной регрессии заключается в том, чтобы найти наилучшие значения для а0 и a1</w:t>
       </w:r>
       <w:r>
         <w:rPr>
@@ -11177,28 +12209,7 @@
             <w:rFonts w:ascii="Cambria Math" w:hAnsi="Cambria Math"/>
             <w:lang w:val="ru-RU"/>
           </w:rPr>
-          <m:t>f</m:t>
-        </m:r>
-        <m:r>
-          <w:rPr>
-            <w:rFonts w:ascii="Cambria Math" w:hAnsi="Cambria Math"/>
-            <w:lang w:val="ru-RU"/>
-          </w:rPr>
-          <m:t>(</m:t>
-        </m:r>
-        <m:r>
-          <w:rPr>
-            <w:rFonts w:ascii="Cambria Math" w:hAnsi="Cambria Math"/>
-            <w:lang w:val="ru-RU"/>
-          </w:rPr>
-          <m:t>x</m:t>
-        </m:r>
-        <m:r>
-          <w:rPr>
-            <w:rFonts w:ascii="Cambria Math" w:hAnsi="Cambria Math"/>
-            <w:lang w:val="ru-RU"/>
-          </w:rPr>
-          <m:t>,</m:t>
+          <m:t>f(x,</m:t>
         </m:r>
         <m:r>
           <w:rPr>
@@ -11212,42 +12223,14 @@
             <w:rFonts w:ascii="Cambria Math" w:hAnsi="Cambria Math"/>
             <w:lang w:val="ru-RU"/>
           </w:rPr>
-          <m:t>,</m:t>
-        </m:r>
-        <m:r>
-          <w:rPr>
-            <w:rFonts w:ascii="Cambria Math" w:hAnsi="Cambria Math"/>
-            <w:lang w:val="ru-RU"/>
-          </w:rPr>
-          <m:t>z</m:t>
-        </m:r>
-        <m:r>
-          <w:rPr>
-            <w:rFonts w:ascii="Cambria Math" w:hAnsi="Cambria Math"/>
-            <w:lang w:val="ru-RU"/>
-          </w:rPr>
-          <m:t>)</m:t>
+          <m:t>,z)</m:t>
         </m:r>
       </m:oMath>
       <w:r>
         <w:rPr>
           <w:lang w:val="ru-RU"/>
         </w:rPr>
-        <w:t>, то градиент рассчиты</w:t>
-      </w:r>
-      <w:proofErr w:type="spellStart"/>
-      <w:r>
-        <w:rPr>
-          <w:lang w:val="ru-RU"/>
-        </w:rPr>
-        <w:t>вается</w:t>
-      </w:r>
-      <w:proofErr w:type="spellEnd"/>
-      <w:r>
-        <w:rPr>
-          <w:lang w:val="ru-RU"/>
-        </w:rPr>
-        <w:t xml:space="preserve"> по следующей формуле [</w:t>
+        <w:t>, то градиент рассчитывается по следующей формуле [</w:t>
       </w:r>
       <w:r>
         <w:rPr>
@@ -11617,35 +12600,11 @@
         <w:rPr>
           <w:lang w:val="ru-RU"/>
         </w:rPr>
-        <w:t>).</w:t>
-      </w:r>
-      <w:r>
-        <w:rPr>
-          <w:lang w:val="ru-RU"/>
-        </w:rPr>
-        <w:t xml:space="preserve"> </w:t>
-      </w:r>
-      <w:r>
-        <w:rPr>
-          <w:lang w:val="ru-RU"/>
-        </w:rPr>
-        <w:t>MFCC – это своеобразное представление энергии спектра сигнала.</w:t>
-      </w:r>
-      <w:r>
-        <w:rPr>
-          <w:lang w:val="ru-RU"/>
-        </w:rPr>
-        <w:t xml:space="preserve"> </w:t>
-      </w:r>
-      <w:r>
-        <w:rPr>
-          <w:lang w:val="ru-RU"/>
-        </w:rPr>
-        <w:t>[</w:t>
-      </w:r>
-      <w:r>
-        <w:rPr>
-          <w:lang w:val="en-US"/>
+        <w:t>). MFCC – это своеобразное представление энергии спектра сигнала. [</w:t>
+      </w:r>
+      <w:r>
+        <w:rPr>
+          <w:lang w:val="ru-RU"/>
         </w:rPr>
         <w:t>41</w:t>
       </w:r>
@@ -11830,13 +12789,7 @@
         <w:rPr>
           <w:lang w:val="ru-RU"/>
         </w:rPr>
-        <w:t>и второй производными</w:t>
-      </w:r>
-      <w:r>
-        <w:rPr>
-          <w:lang w:val="ru-RU"/>
-        </w:rPr>
-        <w:t xml:space="preserve"> [</w:t>
+        <w:t>и второй производными [</w:t>
       </w:r>
       <w:r>
         <w:rPr>
@@ -11848,13 +12801,7 @@
         <w:rPr>
           <w:lang w:val="ru-RU"/>
         </w:rPr>
-        <w:t>]</w:t>
-      </w:r>
-      <w:r>
-        <w:rPr>
-          <w:lang w:val="ru-RU"/>
-        </w:rPr>
-        <w:t>.</w:t>
+        <w:t>].</w:t>
       </w:r>
     </w:p>
     <w:p>
@@ -11879,7 +12826,7 @@
     <w:p>
       <w:pPr>
         <w:rPr>
-          <w:lang w:val="en-US"/>
+          <w:lang w:val="ru-RU"/>
         </w:rPr>
       </w:pPr>
       <w:r>
@@ -11968,13 +12915,7 @@
         <w:rPr>
           <w:lang w:val="ru-RU"/>
         </w:rPr>
-        <w:t xml:space="preserve"> </w:t>
-      </w:r>
-      <w:r>
-        <w:rPr>
-          <w:lang w:val="ru-RU"/>
-        </w:rPr>
-        <w:t xml:space="preserve">Суть </w:t>
+        <w:t xml:space="preserve"> Суть </w:t>
       </w:r>
       <w:proofErr w:type="spellStart"/>
       <w:r>
@@ -12002,19 +12943,7 @@
         <w:rPr>
           <w:lang w:val="ru-RU"/>
         </w:rPr>
-        <w:t>. Затем</w:t>
-      </w:r>
-      <w:r>
-        <w:rPr>
-          <w:lang w:val="ru-RU"/>
-        </w:rPr>
-        <w:t xml:space="preserve"> </w:t>
-      </w:r>
-      <w:r>
-        <w:rPr>
-          <w:lang w:val="ru-RU"/>
-        </w:rPr>
-        <w:t xml:space="preserve">каждый </w:t>
+        <w:t xml:space="preserve">. Затем каждый </w:t>
       </w:r>
       <w:proofErr w:type="spellStart"/>
       <w:r>
@@ -12028,19 +12957,7 @@
         <w:rPr>
           <w:lang w:val="ru-RU"/>
         </w:rPr>
-        <w:t xml:space="preserve"> сортируется алгоритмом сортировки вставками,</w:t>
-      </w:r>
-      <w:r>
-        <w:rPr>
-          <w:lang w:val="ru-RU"/>
-        </w:rPr>
-        <w:t xml:space="preserve"> </w:t>
-      </w:r>
-      <w:r>
-        <w:rPr>
-          <w:lang w:val="ru-RU"/>
-        </w:rPr>
-        <w:t xml:space="preserve">затем при помощи сортировки слиянием </w:t>
+        <w:t xml:space="preserve"> сортируется алгоритмом сортировки вставками, затем при помощи сортировки слиянием </w:t>
       </w:r>
       <w:proofErr w:type="spellStart"/>
       <w:r>
@@ -12054,68 +12971,14 @@
         <w:rPr>
           <w:lang w:val="ru-RU"/>
         </w:rPr>
-        <w:t xml:space="preserve"> сливаются в</w:t>
-      </w:r>
-      <w:r>
-        <w:rPr>
-          <w:lang w:val="ru-RU"/>
-        </w:rPr>
-        <w:t xml:space="preserve"> </w:t>
-      </w:r>
-      <w:r>
-        <w:rPr>
-          <w:lang w:val="ru-RU"/>
-        </w:rPr>
-        <w:t>результирующий массив. Была реализована последовательная версия</w:t>
-      </w:r>
-      <w:r>
-        <w:rPr>
-          <w:lang w:val="ru-RU"/>
-        </w:rPr>
-        <w:t xml:space="preserve"> </w:t>
-      </w:r>
-      <w:r>
-        <w:rPr>
-          <w:lang w:val="ru-RU"/>
-        </w:rPr>
-        <w:t xml:space="preserve">алгоритма, при использовании модификации </w:t>
+        <w:t xml:space="preserve"> сливаются в результирующий массив. Была реализована последовательная версия алгоритма, при использовании модификации </w:t>
       </w:r>
       <w:r>
         <w:rPr>
           <w:lang w:val="ru-RU"/>
         </w:rPr>
         <w:lastRenderedPageBreak/>
-        <w:t>«галоп». Также была</w:t>
-      </w:r>
-      <w:r>
-        <w:rPr>
-          <w:lang w:val="ru-RU"/>
-        </w:rPr>
-        <w:t xml:space="preserve"> </w:t>
-      </w:r>
-      <w:r>
-        <w:rPr>
-          <w:lang w:val="ru-RU"/>
-        </w:rPr>
-        <w:t>выявлена возможность добавления распараллеливания отдельных</w:t>
-      </w:r>
-      <w:r>
-        <w:rPr>
-          <w:lang w:val="ru-RU"/>
-        </w:rPr>
-        <w:t xml:space="preserve"> </w:t>
-      </w:r>
-      <w:r>
-        <w:rPr>
-          <w:lang w:val="ru-RU"/>
-        </w:rPr>
-        <w:t>частей алгоритма для увеличения его эффективности.</w:t>
-      </w:r>
-      <w:r>
-        <w:rPr>
-          <w:lang w:val="ru-RU"/>
-        </w:rPr>
-        <w:t xml:space="preserve"> </w:t>
+        <w:t xml:space="preserve">«галоп». Также была выявлена возможность добавления распараллеливания отдельных частей алгоритма для увеличения его эффективности. </w:t>
       </w:r>
     </w:p>
     <w:p>
@@ -12128,19 +12991,7 @@
         <w:rPr>
           <w:lang w:val="ru-RU"/>
         </w:rPr>
-        <w:t>На этапе сортировок вставками одновременно сортируется</w:t>
-      </w:r>
-      <w:r>
-        <w:rPr>
-          <w:lang w:val="ru-RU"/>
-        </w:rPr>
-        <w:t xml:space="preserve"> </w:t>
-      </w:r>
-      <w:r>
-        <w:rPr>
-          <w:lang w:val="ru-RU"/>
-        </w:rPr>
-        <w:t xml:space="preserve">несколько </w:t>
+        <w:t xml:space="preserve">На этапе сортировок вставками одновременно сортируется несколько </w:t>
       </w:r>
       <w:proofErr w:type="spellStart"/>
       <w:r>
@@ -12154,19 +13005,7 @@
         <w:rPr>
           <w:lang w:val="ru-RU"/>
         </w:rPr>
-        <w:t>. При прохождении этапа слияния параллельно</w:t>
-      </w:r>
-      <w:r>
-        <w:rPr>
-          <w:lang w:val="ru-RU"/>
-        </w:rPr>
-        <w:t xml:space="preserve"> </w:t>
-      </w:r>
-      <w:r>
-        <w:rPr>
-          <w:lang w:val="ru-RU"/>
-        </w:rPr>
-        <w:t xml:space="preserve">сливается множество пар соседних </w:t>
+        <w:t xml:space="preserve">. При прохождении этапа слияния параллельно сливается множество пар соседних </w:t>
       </w:r>
       <w:proofErr w:type="spellStart"/>
       <w:r>
@@ -12180,31 +13019,7 @@
         <w:rPr>
           <w:lang w:val="ru-RU"/>
         </w:rPr>
-        <w:t>. Количество</w:t>
-      </w:r>
-      <w:r>
-        <w:rPr>
-          <w:lang w:val="ru-RU"/>
-        </w:rPr>
-        <w:t xml:space="preserve"> </w:t>
-      </w:r>
-      <w:r>
-        <w:rPr>
-          <w:lang w:val="ru-RU"/>
-        </w:rPr>
-        <w:t>одновременно выполняемых задач зависит от используемой системы и</w:t>
-      </w:r>
-      <w:r>
-        <w:rPr>
-          <w:lang w:val="ru-RU"/>
-        </w:rPr>
-        <w:t xml:space="preserve"> </w:t>
-      </w:r>
-      <w:r>
-        <w:rPr>
-          <w:lang w:val="ru-RU"/>
-        </w:rPr>
-        <w:t>аппаратного обеспечения.</w:t>
+        <w:t>. Количество одновременно выполняемых задач зависит от используемой системы и аппаратного обеспечения.</w:t>
       </w:r>
       <w:r>
         <w:rPr>
@@ -12903,12 +13718,12 @@
     </w:p>
     <w:p>
       <w:pPr>
-        <w:ind w:firstLine="0"/>
-        <w:jc w:val="center"/>
-        <w:rPr>
-          <w:lang w:val="ru-RU"/>
-        </w:rPr>
-      </w:pPr>
+        <w:pStyle w:val="1"/>
+        <w:rPr>
+          <w:lang w:val="ru-RU"/>
+        </w:rPr>
+      </w:pPr>
+      <w:bookmarkStart w:id="7" w:name="_Toc216476075"/>
       <w:r>
         <w:rPr>
           <w:lang w:val="ru-RU"/>
@@ -12916,6 +13731,7 @@
         <w:lastRenderedPageBreak/>
         <w:t>Заключение</w:t>
       </w:r>
+      <w:bookmarkEnd w:id="7"/>
     </w:p>
     <w:p>
       <w:pPr>
@@ -12948,12 +13764,12 @@
     </w:p>
     <w:p>
       <w:pPr>
-        <w:ind w:firstLine="0"/>
-        <w:jc w:val="center"/>
-        <w:rPr>
-          <w:lang w:val="ru-RU"/>
-        </w:rPr>
-      </w:pPr>
+        <w:pStyle w:val="1"/>
+        <w:rPr>
+          <w:lang w:val="ru-RU"/>
+        </w:rPr>
+      </w:pPr>
+      <w:bookmarkStart w:id="8" w:name="_Toc216476076"/>
       <w:r>
         <w:rPr>
           <w:lang w:val="ru-RU"/>
@@ -12961,6 +13777,7 @@
         <w:lastRenderedPageBreak/>
         <w:t>Список литературы</w:t>
       </w:r>
+      <w:bookmarkEnd w:id="8"/>
     </w:p>
     <w:p>
       <w:pPr>
@@ -12989,13 +13806,7 @@
         <w:rPr>
           <w:lang w:val="ru-RU"/>
         </w:rPr>
-        <w:t xml:space="preserve"> </w:t>
-      </w:r>
-      <w:r>
-        <w:rPr>
-          <w:lang w:val="ru-RU"/>
-        </w:rPr>
-        <w:t>Режим доступа</w:t>
+        <w:t xml:space="preserve"> Режим доступа</w:t>
       </w:r>
       <w:r>
         <w:rPr>
@@ -13004,43 +13815,16 @@
         <w:t xml:space="preserve">: </w:t>
       </w:r>
       <w:r>
-        <w:t>https://elibrary.ru/item.asp?id=5</w:t>
-      </w:r>
-      <w:r>
-        <w:t>3</w:t>
-      </w:r>
-      <w:r>
-        <w:t>93</w:t>
-      </w:r>
-      <w:r>
-        <w:t>5</w:t>
-      </w:r>
-      <w:r>
-        <w:t>1</w:t>
-      </w:r>
-      <w:r>
-        <w:t>5</w:t>
-      </w:r>
-      <w:r>
-        <w:t>8</w:t>
-      </w:r>
-      <w:r>
-        <w:t xml:space="preserve"> </w:t>
-      </w:r>
-      <w:r>
-        <w:t>(</w:t>
-      </w:r>
-      <w:r>
-        <w:rPr>
-          <w:lang w:val="ru-RU"/>
-        </w:rPr>
-        <w:t>д</w:t>
-      </w:r>
-      <w:r>
-        <w:rPr>
-          <w:lang w:val="ru-RU"/>
-        </w:rPr>
-        <w:t xml:space="preserve">ата обращения: </w:t>
+        <w:t>https://elibrary.ru/item.asp?id=53935158</w:t>
+      </w:r>
+      <w:r>
+        <w:t xml:space="preserve"> (</w:t>
+      </w:r>
+      <w:r>
+        <w:rPr>
+          <w:lang w:val="ru-RU"/>
+        </w:rPr>
+        <w:t xml:space="preserve">дата обращения: </w:t>
       </w:r>
       <w:r>
         <w:rPr>
@@ -13073,13 +13857,7 @@
         <w:rPr>
           <w:lang w:val="ru-RU"/>
         </w:rPr>
-        <w:t xml:space="preserve"> </w:t>
-      </w:r>
-      <w:r>
-        <w:rPr>
-          <w:lang w:val="ru-RU"/>
-        </w:rPr>
-        <w:t>Режим доступа</w:t>
+        <w:t xml:space="preserve"> Режим доступа</w:t>
       </w:r>
       <w:r>
         <w:rPr>
@@ -13088,13 +13866,7 @@
         <w:t xml:space="preserve">: </w:t>
       </w:r>
       <w:r>
-        <w:t>https://www.elibrary.ru/ite</w:t>
-      </w:r>
-      <w:r>
-        <w:t>m</w:t>
-      </w:r>
-      <w:r>
-        <w:t>.asp?id=47571509</w:t>
+        <w:t>https://www.elibrary.ru/item.asp?id=47571509</w:t>
       </w:r>
       <w:r>
         <w:t xml:space="preserve"> </w:t>
@@ -13118,10 +13890,7 @@
         </w:rPr>
       </w:pPr>
       <w:r>
-        <w:t xml:space="preserve">Брыжинская А. В., Чернова С. В. </w:t>
-      </w:r>
-      <w:r>
-        <w:t xml:space="preserve">Кратко про </w:t>
+        <w:t xml:space="preserve">Брыжинская А. В., Чернова С. В. Кратко про </w:t>
       </w:r>
       <w:r>
         <w:rPr>
@@ -13130,10 +13899,7 @@
         <w:t>D</w:t>
       </w:r>
       <w:r>
-        <w:t xml:space="preserve">ocker </w:t>
-      </w:r>
-      <w:r>
-        <w:t xml:space="preserve">// Теория и практика современной науки. 2019. №10 (52). </w:t>
+        <w:t xml:space="preserve">ocker // Теория и практика современной науки. 2019. №10 (52). </w:t>
       </w:r>
       <w:r>
         <w:rPr>
@@ -13169,13 +13935,7 @@
         <w:rPr>
           <w:lang w:val="ru-RU"/>
         </w:rPr>
-        <w:t xml:space="preserve"> </w:t>
-      </w:r>
-      <w:r>
-        <w:rPr>
-          <w:lang w:val="ru-RU"/>
-        </w:rPr>
-        <w:t>Режим доступа</w:t>
+        <w:t xml:space="preserve"> Режим доступа</w:t>
       </w:r>
       <w:r>
         <w:rPr>
@@ -13239,6 +13999,7 @@
         <w:rPr>
           <w:lang w:val="ru-RU"/>
         </w:rPr>
+        <w:lastRenderedPageBreak/>
         <w:t>Вучков</w:t>
       </w:r>
       <w:proofErr w:type="spellEnd"/>
@@ -13272,7 +14033,6 @@
         </w:numPr>
       </w:pPr>
       <w:r>
-        <w:lastRenderedPageBreak/>
         <w:t>Грачев М. К. Aspect. Net Framework и его применение в задаче протоколирования – Текст : электронный // Вестник Санкт-Петербургского университета. Прикладная математика. Информатика. Процессы управления. – 2008. – № 4.</w:t>
       </w:r>
     </w:p>
@@ -13285,10 +14045,7 @@
         </w:numPr>
       </w:pPr>
       <w:r>
-        <w:t>Грузин, Н. А. Сравнение фреймворков для разработки веб-приложений: LARAVEL, DJANGO и FLASK / Н. А. Грузин // Modern Science. – 2020. – № 2-1. – С. 359-364. – EDN UQVAGU.</w:t>
-      </w:r>
-      <w:r>
-        <w:t xml:space="preserve"> </w:t>
+        <w:t xml:space="preserve">Грузин, Н. А. Сравнение фреймворков для разработки веб-приложений: LARAVEL, DJANGO и FLASK / Н. А. Грузин // Modern Science. – 2020. – № 2-1. – С. 359-364. – EDN UQVAGU. </w:t>
       </w:r>
       <w:r>
         <w:rPr>
@@ -13330,13 +14087,7 @@
         </w:rPr>
       </w:pPr>
       <w:r>
-        <w:t xml:space="preserve">Гурбангылычева М. Б. </w:t>
-      </w:r>
-      <w:r>
-        <w:t>Языки программирования – какими бывают и какой выбрать</w:t>
-      </w:r>
-      <w:r>
-        <w:t xml:space="preserve"> // Символ науки. 2023. №12-2. </w:t>
+        <w:t xml:space="preserve">Гурбангылычева М. Б. Языки программирования – какими бывают и какой выбрать // Символ науки. 2023. №12-2. </w:t>
       </w:r>
       <w:r>
         <w:rPr>
@@ -13580,10 +14331,7 @@
         </w:numPr>
       </w:pPr>
       <w:r>
-        <w:t>Елизаров, Д.А. Разработка системы транскрибации аудиои видеоконтента // Д.А. Елизаров // Вестник Российского нового университета серия «Сложные системы: модели, анализ, управление». - 2023. № 4. - 87-95</w:t>
-      </w:r>
-      <w:r>
-        <w:t>.</w:t>
+        <w:t>Елизаров, Д.А. Разработка системы транскрибации аудиои видеоконтента // Д.А. Елизаров // Вестник Российского нового университета серия «Сложные системы: модели, анализ, управление». - 2023. № 4. - 87-95.</w:t>
       </w:r>
     </w:p>
     <w:p>
@@ -13598,13 +14346,8 @@
         </w:rPr>
       </w:pPr>
       <w:r>
-        <w:t xml:space="preserve">Жауров С. Н. </w:t>
-      </w:r>
-      <w:r>
-        <w:t xml:space="preserve">Метод оптимального выбора библиотек для транскрибации аудиофайлов </w:t>
-      </w:r>
-      <w:r>
-        <w:t xml:space="preserve">// Инновационная наука. 2025. №6-2. </w:t>
+        <w:lastRenderedPageBreak/>
+        <w:t xml:space="preserve">Жауров С. Н. Метод оптимального выбора библиотек для транскрибации аудиофайлов // Инновационная наука. 2025. №6-2. </w:t>
       </w:r>
       <w:r>
         <w:rPr>
@@ -13613,11 +14356,7 @@
         <w:t>Режим доступа</w:t>
       </w:r>
       <w:r>
-        <w:t xml:space="preserve">: </w:t>
-      </w:r>
-      <w:r>
-        <w:lastRenderedPageBreak/>
-        <w:t>https://cyberleninka.ru/article/n/metod-optimalnogo-vybora-bibliotek-dlya-transkribatsii-audiofaylov (дата обращения: 1</w:t>
+        <w:t>: https://cyberleninka.ru/article/n/metod-optimalnogo-vybora-bibliotek-dlya-transkribatsii-audiofaylov (дата обращения: 1</w:t>
       </w:r>
       <w:r>
         <w:rPr>
@@ -13689,19 +14428,7 @@
         <w:rPr>
           <w:lang w:eastAsia="ru-RU"/>
         </w:rPr>
-        <w:t>https://www.interfax.ru/pressreleases/1017</w:t>
-      </w:r>
-      <w:r>
-        <w:rPr>
-          <w:lang w:eastAsia="ru-RU"/>
-        </w:rPr>
-        <w:t>5</w:t>
-      </w:r>
-      <w:r>
-        <w:rPr>
-          <w:lang w:eastAsia="ru-RU"/>
-        </w:rPr>
-        <w:t>11</w:t>
+        <w:t>https://www.interfax.ru/pressreleases/1017511</w:t>
       </w:r>
       <w:r>
         <w:rPr>
@@ -13728,10 +14455,7 @@
         </w:rPr>
       </w:pPr>
       <w:r>
-        <w:t>Каменская, А. С. Адаптация Google Cloud Speech-to-text API для автоматической транскрибации веб-конференций в реальном времени / А. С. Каменская // Автоматика и программная инженерия. – 2019. – № 2(28). – С. 19-23. – EDN NQOKPT.</w:t>
-      </w:r>
-      <w:r>
-        <w:t xml:space="preserve"> </w:t>
+        <w:t xml:space="preserve">Каменская, А. С. Адаптация Google Cloud Speech-to-text API для автоматической транскрибации веб-конференций в реальном времени / А. С. Каменская // Автоматика и программная инженерия. – 2019. – № 2(28). – С. 19-23. – EDN NQOKPT. </w:t>
       </w:r>
       <w:r>
         <w:rPr>
@@ -13803,13 +14527,7 @@
         <w:rPr>
           <w:lang w:val="ru-RU"/>
         </w:rPr>
-        <w:t xml:space="preserve"> </w:t>
-      </w:r>
-      <w:r>
-        <w:rPr>
-          <w:lang w:val="ru-RU"/>
-        </w:rPr>
-        <w:t>Режим доступа</w:t>
+        <w:t xml:space="preserve"> Режим доступа</w:t>
       </w:r>
       <w:r>
         <w:rPr>
@@ -13845,13 +14563,7 @@
         <w:rPr>
           <w:lang w:val="ru-RU"/>
         </w:rPr>
-        <w:t xml:space="preserve"> </w:t>
-      </w:r>
-      <w:r>
-        <w:rPr>
-          <w:lang w:val="ru-RU"/>
-        </w:rPr>
-        <w:t>Режим доступа</w:t>
+        <w:t xml:space="preserve"> Режим доступа</w:t>
       </w:r>
       <w:r>
         <w:rPr>
@@ -13860,13 +14572,7 @@
         <w:t xml:space="preserve">: </w:t>
       </w:r>
       <w:r>
-        <w:t>https://www.elibrary.ru/item.asp?id=5488</w:t>
-      </w:r>
-      <w:r>
-        <w:t>8</w:t>
-      </w:r>
-      <w:r>
-        <w:t>909</w:t>
+        <w:t>https://www.elibrary.ru/item.asp?id=54888909</w:t>
       </w:r>
       <w:r>
         <w:t xml:space="preserve"> </w:t>
@@ -13890,14 +14596,11 @@
         </w:rPr>
       </w:pPr>
       <w:r>
-        <w:t xml:space="preserve">Кочетков, М. А. Исследование востребованности на рынке специалистов, освоивших инструменты бережливого производства «диаграмма Ганта», «диаграмма Исикавы» и «диаграмма спагетти» / М. А. Кочетков // Бизнес-трансформация: управление улучшениями. – 2023. </w:t>
+        <w:t xml:space="preserve">Кочетков, М. А. Исследование востребованности на рынке специалистов, освоивших инструменты бережливого производства </w:t>
       </w:r>
       <w:r>
         <w:lastRenderedPageBreak/>
-        <w:t>– № 4. – С. 48-54. – EDN WSQWCV.</w:t>
-      </w:r>
-      <w:r>
-        <w:t xml:space="preserve"> </w:t>
+        <w:t xml:space="preserve">«диаграмма Ганта», «диаграмма Исикавы» и «диаграмма спагетти» / М. А. Кочетков // Бизнес-трансформация: управление улучшениями. – 2023. – № 4. – С. 48-54. – EDN WSQWCV. </w:t>
       </w:r>
       <w:r>
         <w:rPr>
@@ -13930,13 +14633,7 @@
         <w:rPr>
           <w:lang w:val="ru-RU"/>
         </w:rPr>
-        <w:t>д</w:t>
-      </w:r>
-      <w:r>
-        <w:rPr>
-          <w:lang w:val="ru-RU"/>
-        </w:rPr>
-        <w:t xml:space="preserve">ата обращения: </w:t>
+        <w:t xml:space="preserve">дата обращения: </w:t>
       </w:r>
       <w:r>
         <w:rPr>
@@ -13969,13 +14666,7 @@
         <w:rPr>
           <w:lang w:val="ru-RU"/>
         </w:rPr>
-        <w:t xml:space="preserve"> </w:t>
-      </w:r>
-      <w:r>
-        <w:rPr>
-          <w:lang w:val="ru-RU"/>
-        </w:rPr>
-        <w:t>Режим доступа</w:t>
+        <w:t xml:space="preserve"> Режим доступа</w:t>
       </w:r>
       <w:r>
         <w:rPr>
@@ -13984,13 +14675,7 @@
         <w:t xml:space="preserve">: </w:t>
       </w:r>
       <w:r>
-        <w:t>https://www.elibrary</w:t>
-      </w:r>
-      <w:r>
-        <w:t>.</w:t>
-      </w:r>
-      <w:r>
-        <w:t>ru/item.asp?id=48004881</w:t>
+        <w:t>https://www.elibrary.ru/item.asp?id=48004881</w:t>
       </w:r>
       <w:r>
         <w:rPr>
@@ -14014,13 +14699,7 @@
         <w:rPr>
           <w:lang w:val="ru-RU"/>
         </w:rPr>
-        <w:t xml:space="preserve"> </w:t>
-      </w:r>
-      <w:r>
-        <w:rPr>
-          <w:lang w:val="ru-RU"/>
-        </w:rPr>
-        <w:t>Режим доступа</w:t>
+        <w:t xml:space="preserve"> Режим доступа</w:t>
       </w:r>
       <w:r>
         <w:rPr>
@@ -14029,13 +14708,7 @@
         <w:t xml:space="preserve">: </w:t>
       </w:r>
       <w:r>
-        <w:t>https://www.elibrary.ru/i</w:t>
-      </w:r>
-      <w:r>
-        <w:t>t</w:t>
-      </w:r>
-      <w:r>
-        <w:t>em.asp?id=49988015</w:t>
+        <w:t>https://www.elibrary.ru/item.asp?id=49988015</w:t>
       </w:r>
       <w:r>
         <w:rPr>
@@ -14059,13 +14732,7 @@
         <w:rPr>
           <w:lang w:val="ru-RU"/>
         </w:rPr>
-        <w:t xml:space="preserve"> </w:t>
-      </w:r>
-      <w:r>
-        <w:rPr>
-          <w:lang w:val="ru-RU"/>
-        </w:rPr>
-        <w:t>Режим доступа</w:t>
+        <w:t xml:space="preserve"> Режим доступа</w:t>
       </w:r>
       <w:r>
         <w:rPr>
@@ -14098,7 +14765,11 @@
         </w:rPr>
       </w:pPr>
       <w:r>
-        <w:t>Паскевичян, А. А. Анализ и сравнение популярны средств разработки в рамках обучения программированию на языке C, C++ / А. А. Паскевичян, А. В. Свищев // Моя профессиональная карьера. – 2023. – Т. 3, № 55. – С. 218-223. – EDN HTPUIH.</w:t>
+        <w:t xml:space="preserve">Паскевичян, А. А. Анализ и сравнение популярны средств разработки в рамках обучения программированию на языке C, C++ / А. А. Паскевичян, А. В. Свищев // Моя профессиональная карьера. – 2023. – Т. 3, № 55. – С. </w:t>
+      </w:r>
+      <w:r>
+        <w:lastRenderedPageBreak/>
+        <w:t>218-223. – EDN HTPUIH.</w:t>
       </w:r>
       <w:r>
         <w:t xml:space="preserve"> </w:t>
@@ -14119,31 +14790,7 @@
         <w:rPr>
           <w:lang w:val="ru-RU"/>
         </w:rPr>
-        <w:t>https://elibrary.ru/item.asp?id</w:t>
-      </w:r>
-      <w:r>
-        <w:rPr>
-          <w:lang w:val="ru-RU"/>
-        </w:rPr>
-        <w:t>=</w:t>
-      </w:r>
-      <w:r>
-        <w:rPr>
-          <w:lang w:val="ru-RU"/>
-        </w:rPr>
-        <w:t>5880</w:t>
-      </w:r>
-      <w:r>
-        <w:rPr>
-          <w:lang w:val="ru-RU"/>
-        </w:rPr>
-        <w:t>3</w:t>
-      </w:r>
-      <w:r>
-        <w:rPr>
-          <w:lang w:val="ru-RU"/>
-        </w:rPr>
-        <w:t>818</w:t>
+        <w:t>https://elibrary.ru/item.asp?id=58803818</w:t>
       </w:r>
       <w:r>
         <w:rPr>
@@ -14158,13 +14805,7 @@
         <w:rPr>
           <w:lang w:val="ru-RU"/>
         </w:rPr>
-        <w:t>д</w:t>
-      </w:r>
-      <w:r>
-        <w:rPr>
-          <w:lang w:val="ru-RU"/>
-        </w:rPr>
-        <w:t xml:space="preserve">ата обращения: </w:t>
+        <w:t xml:space="preserve">дата обращения: </w:t>
       </w:r>
       <w:r>
         <w:rPr>
@@ -14191,7 +14832,6 @@
         </w:numPr>
       </w:pPr>
       <w:r>
-        <w:lastRenderedPageBreak/>
         <w:t>Политическая журналистика : учебник для бакалавриата и магистратуры / С. Г. Корконосенко [и др.] ; под ред. С. Г. Корконосенко. — М. : Издательство Юрайт, 2015. — 319 с.</w:t>
       </w:r>
     </w:p>
@@ -14284,13 +14924,7 @@
         </w:rPr>
       </w:pPr>
       <w:r>
-        <w:t xml:space="preserve">Ротова О. М., Шибанова А. Д. </w:t>
-      </w:r>
-      <w:r>
-        <w:t>Основные принципы метода линейной регрессии</w:t>
-      </w:r>
-      <w:r>
-        <w:t xml:space="preserve"> // Теория и практика современной науки. 2020. №1 (55). </w:t>
+        <w:t xml:space="preserve">Ротова О. М., Шибанова А. Д. Основные принципы метода линейной регрессии // Теория и практика современной науки. 2020. №1 (55). </w:t>
       </w:r>
       <w:r>
         <w:rPr>
@@ -14308,10 +14942,7 @@
         <w:t>2</w:t>
       </w:r>
       <w:r>
-        <w:t>.12.2025).</w:t>
-      </w:r>
-      <w:r>
-        <w:t>37</w:t>
+        <w:t>.12.2025).37</w:t>
       </w:r>
     </w:p>
     <w:p>
@@ -14326,10 +14957,7 @@
         </w:rPr>
       </w:pPr>
       <w:r>
-        <w:t xml:space="preserve">Рылёва А. А., Мелузов О. В. </w:t>
-      </w:r>
-      <w:r>
-        <w:t xml:space="preserve">Обзор различных </w:t>
+        <w:t xml:space="preserve">Рылёва А. А., Мелузов О. В. Обзор различных </w:t>
       </w:r>
       <w:r>
         <w:rPr>
@@ -14338,10 +14966,7 @@
         <w:t>W</w:t>
       </w:r>
       <w:r>
-        <w:t>eb-серверов</w:t>
-      </w:r>
-      <w:r>
-        <w:t xml:space="preserve"> // Форум молодых ученых. 2018. №12-3 (28). </w:t>
+        <w:t xml:space="preserve">eb-серверов // Форум молодых ученых. 2018. №12-3 (28). </w:t>
       </w:r>
       <w:r>
         <w:rPr>
@@ -14407,14 +15032,14 @@
         <w:rPr>
           <w:lang w:eastAsia="ru-RU"/>
         </w:rPr>
-        <w:t xml:space="preserve">Толкачева, Е. В. Применение систем автоматического транскрибирования данных фокус-групп при проведении исследований в организациях / Е. В. Толкачева // Инновационная парадигма экономических механизмов хозяйствования : Сборник научных трудов IX Международной научно-практической конференции, Симферополь, 15 мая 2024 года. – Симферополь: ООО "Издательство Типография </w:t>
+        <w:t xml:space="preserve">Толкачева, Е. В. Применение систем автоматического транскрибирования данных фокус-групп при проведении исследований в организациях / Е. В. Толкачева // Инновационная парадигма экономических механизмов хозяйствования : Сборник научных трудов </w:t>
       </w:r>
       <w:r>
         <w:rPr>
           <w:lang w:eastAsia="ru-RU"/>
         </w:rPr>
         <w:lastRenderedPageBreak/>
-        <w:t>"Ариал", 2024. – С. 656-658. – EDN PZLBXI.</w:t>
+        <w:t>IX Международной научно-практической конференции, Симферополь, 15 мая 2024 года. – Симферополь: ООО "Издательство Типография "Ариал", 2024. – С. 656-658. – EDN PZLBXI.</w:t>
       </w:r>
       <w:r>
         <w:rPr>
@@ -14636,10 +15261,7 @@
         <w:t>М</w:t>
       </w:r>
       <w:r>
-        <w:t xml:space="preserve">одель голосового управления движением поездов на станции </w:t>
-      </w:r>
-      <w:r>
-        <w:t xml:space="preserve">// Сборник научных трудов ДОНИЖТ. 2024. №1 (72). </w:t>
+        <w:t xml:space="preserve">одель голосового управления движением поездов на станции // Сборник научных трудов ДОНИЖТ. 2024. №1 (72). </w:t>
       </w:r>
       <w:r>
         <w:rPr>
@@ -14918,13 +15540,7 @@
         <w:rPr>
           <w:lang w:val="en-US"/>
         </w:rPr>
-        <w:t>find</w:t>
-      </w:r>
-      <w:r>
-        <w:rPr>
-          <w:lang w:val="en-US"/>
-        </w:rPr>
-        <w:t>index</w:t>
+        <w:t>findindex</w:t>
       </w:r>
       <w:proofErr w:type="spellEnd"/>
       <w:r>
@@ -14934,10 +15550,7 @@
         <w:t xml:space="preserve"> method</w:t>
       </w:r>
       <w:r>
-        <w:t xml:space="preserve"> </w:t>
-      </w:r>
-      <w:r>
-        <w:t>source code</w:t>
+        <w:t xml:space="preserve"> source code</w:t>
       </w:r>
       <w:r>
         <w:t xml:space="preserve"> </w:t>
@@ -14959,7 +15572,7 @@
       </w:r>
       <w:r>
         <w:rPr>
-          <w:lang w:val="en-US"/>
+          <w:lang w:val="ru-RU"/>
         </w:rPr>
         <w:t xml:space="preserve"> </w:t>
       </w:r>
@@ -14974,7 +15587,7 @@
       </w:r>
       <w:r>
         <w:rPr>
-          <w:lang w:val="en-US"/>
+          <w:lang w:val="ru-RU"/>
         </w:rPr>
         <w:t xml:space="preserve">. </w:t>
       </w:r>
@@ -14985,6 +15598,7 @@
         <w:t xml:space="preserve">Режим доступа: </w:t>
       </w:r>
       <w:r>
+        <w:lastRenderedPageBreak/>
         <w:t>https://github.com/python/cpython/blob/e6373c0d8b59512aa7f0dea7f3fb162b6ed10fa4/Objects/listobject.c#L2601</w:t>
       </w:r>
       <w:r>
@@ -15009,8 +15623,25 @@
         <w:rPr>
           <w:lang w:val="en-US"/>
         </w:rPr>
-        <w:lastRenderedPageBreak/>
-        <w:t xml:space="preserve">faster-whisper </w:t>
+        <w:t>faster</w:t>
+      </w:r>
+      <w:r>
+        <w:rPr>
+          <w:lang w:val="ru-RU"/>
+        </w:rPr>
+        <w:t>-</w:t>
+      </w:r>
+      <w:r>
+        <w:rPr>
+          <w:lang w:val="en-US"/>
+        </w:rPr>
+        <w:t>whisper</w:t>
+      </w:r>
+      <w:r>
+        <w:rPr>
+          <w:lang w:val="ru-RU"/>
+        </w:rPr>
+        <w:t xml:space="preserve"> </w:t>
       </w:r>
       <w:r>
         <w:rPr>
@@ -15244,9 +15875,39 @@
       </w:r>
       <w:r>
         <w:rPr>
-          <w:lang w:val="ru-RU"/>
-        </w:rPr>
-        <w:t xml:space="preserve">[Электронный ресурс]. Режим доступа: </w:t>
+          <w:lang w:val="en-US"/>
+        </w:rPr>
+        <w:t>[</w:t>
+      </w:r>
+      <w:r>
+        <w:rPr>
+          <w:lang w:val="ru-RU"/>
+        </w:rPr>
+        <w:t>Электронный</w:t>
+      </w:r>
+      <w:r>
+        <w:rPr>
+          <w:lang w:val="en-US"/>
+        </w:rPr>
+        <w:t xml:space="preserve"> </w:t>
+      </w:r>
+      <w:r>
+        <w:rPr>
+          <w:lang w:val="ru-RU"/>
+        </w:rPr>
+        <w:t>ресурс</w:t>
+      </w:r>
+      <w:r>
+        <w:rPr>
+          <w:lang w:val="en-US"/>
+        </w:rPr>
+        <w:t xml:space="preserve">]. </w:t>
+      </w:r>
+      <w:r>
+        <w:rPr>
+          <w:lang w:val="ru-RU"/>
+        </w:rPr>
+        <w:t xml:space="preserve">Режим доступа: </w:t>
       </w:r>
       <w:r>
         <w:rPr>
@@ -15362,31 +16023,13 @@
         <w:rPr>
           <w:lang w:val="ru-RU"/>
         </w:rPr>
-        <w:t xml:space="preserve">. </w:t>
-      </w:r>
-      <w:r>
-        <w:rPr>
-          <w:lang w:val="ru-RU"/>
-        </w:rPr>
-        <w:t xml:space="preserve">[Электронный ресурс]. Режим доступа: </w:t>
-      </w:r>
-      <w:r>
-        <w:rPr>
-          <w:lang w:val="ru-RU"/>
-        </w:rPr>
-        <w:t>https://github.com/OpenVoiceO</w:t>
-      </w:r>
-      <w:r>
-        <w:rPr>
-          <w:lang w:val="ru-RU"/>
-        </w:rPr>
-        <w:t>S</w:t>
-      </w:r>
-      <w:r>
-        <w:rPr>
-          <w:lang w:val="ru-RU"/>
-        </w:rPr>
-        <w:t>/ovos-docker-stt</w:t>
+        <w:t xml:space="preserve">. [Электронный ресурс]. Режим доступа: </w:t>
+      </w:r>
+      <w:r>
+        <w:rPr>
+          <w:lang w:val="ru-RU"/>
+        </w:rPr>
+        <w:t>https://github.com/OpenVoiceOS/ovos-docker-stt</w:t>
       </w:r>
       <w:r>
         <w:rPr>
@@ -15422,9 +16065,21 @@
       <w:proofErr w:type="spellEnd"/>
       <w:r>
         <w:rPr>
-          <w:lang w:val="en-US"/>
-        </w:rPr>
-        <w:t xml:space="preserve">-audio </w:t>
+          <w:lang w:val="ru-RU"/>
+        </w:rPr>
+        <w:t>-</w:t>
+      </w:r>
+      <w:r>
+        <w:rPr>
+          <w:lang w:val="en-US"/>
+        </w:rPr>
+        <w:t>audio</w:t>
+      </w:r>
+      <w:r>
+        <w:rPr>
+          <w:lang w:val="ru-RU"/>
+        </w:rPr>
+        <w:t xml:space="preserve"> </w:t>
       </w:r>
       <w:r>
         <w:rPr>
@@ -15815,7 +16470,13 @@
         <w:rPr>
           <w:lang w:val="en-US"/>
         </w:rPr>
-        <w:t xml:space="preserve">whisper </w:t>
+        <w:t>whisper</w:t>
+      </w:r>
+      <w:r>
+        <w:rPr>
+          <w:lang w:val="ru-RU"/>
+        </w:rPr>
+        <w:t xml:space="preserve"> </w:t>
       </w:r>
       <w:r>
         <w:rPr>
@@ -15941,7 +16602,25 @@
         <w:rPr>
           <w:lang w:val="en-US"/>
         </w:rPr>
-        <w:t xml:space="preserve">Wing IDE – </w:t>
+        <w:t>Wing</w:t>
+      </w:r>
+      <w:r>
+        <w:rPr>
+          <w:lang w:val="ru-RU"/>
+        </w:rPr>
+        <w:t xml:space="preserve"> </w:t>
+      </w:r>
+      <w:r>
+        <w:rPr>
+          <w:lang w:val="en-US"/>
+        </w:rPr>
+        <w:t>IDE</w:t>
+      </w:r>
+      <w:r>
+        <w:rPr>
+          <w:lang w:val="ru-RU"/>
+        </w:rPr>
+        <w:t xml:space="preserve"> – </w:t>
       </w:r>
       <w:proofErr w:type="spellStart"/>
       <w:r>
@@ -15953,7 +16632,7 @@
       <w:proofErr w:type="spellEnd"/>
       <w:r>
         <w:rPr>
-          <w:lang w:val="en-US"/>
+          <w:lang w:val="ru-RU"/>
         </w:rPr>
         <w:t xml:space="preserve">. </w:t>
       </w:r>
@@ -15980,19 +16659,7 @@
         <w:rPr>
           <w:lang w:val="en-US"/>
         </w:rPr>
-        <w:t>wingw</w:t>
-      </w:r>
-      <w:r>
-        <w:rPr>
-          <w:lang w:val="en-US"/>
-        </w:rPr>
-        <w:t>a</w:t>
-      </w:r>
-      <w:r>
-        <w:rPr>
-          <w:lang w:val="en-US"/>
-        </w:rPr>
-        <w:t>re</w:t>
+        <w:t>wingware</w:t>
       </w:r>
       <w:proofErr w:type="spellEnd"/>
       <w:r>
@@ -16066,13 +16733,7 @@
         <w:t xml:space="preserve">[Электронный ресурс]. Режим доступа: </w:t>
       </w:r>
       <w:r>
-        <w:t>https://yandex.cloud/ru/docs/spee</w:t>
-      </w:r>
-      <w:r>
-        <w:t>c</w:t>
-      </w:r>
-      <w:r>
-        <w:t>hkit/</w:t>
+        <w:t>https://yandex.cloud/ru/docs/speechkit/</w:t>
       </w:r>
       <w:r>
         <w:rPr>
@@ -18015,12 +18676,13 @@
     <w:link w:val="10"/>
     <w:uiPriority w:val="9"/>
     <w:qFormat/>
-    <w:rsid w:val="00CF30C8"/>
+    <w:rsid w:val="00986711"/>
     <w:pPr>
       <w:keepNext/>
       <w:keepLines/>
+      <w:spacing w:line="720" w:lineRule="auto"/>
       <w:ind w:firstLine="0"/>
-      <w:jc w:val="left"/>
+      <w:jc w:val="center"/>
       <w:outlineLvl w:val="0"/>
     </w:pPr>
     <w:rPr>
@@ -18035,20 +18697,19 @@
     <w:next w:val="a"/>
     <w:link w:val="20"/>
     <w:uiPriority w:val="9"/>
-    <w:semiHidden/>
     <w:unhideWhenUsed/>
     <w:qFormat/>
-    <w:rsid w:val="001C2B37"/>
+    <w:rsid w:val="00986711"/>
     <w:pPr>
       <w:keepNext/>
       <w:keepLines/>
-      <w:spacing w:before="160" w:after="80"/>
+      <w:ind w:firstLine="0"/>
+      <w:jc w:val="left"/>
       <w:outlineLvl w:val="1"/>
     </w:pPr>
     <w:rPr>
-      <w:rFonts w:asciiTheme="majorHAnsi" w:eastAsiaTheme="majorEastAsia" w:hAnsiTheme="majorHAnsi" w:cstheme="majorBidi"/>
-      <w:color w:val="2F5496" w:themeColor="accent1" w:themeShade="BF"/>
-      <w:sz w:val="32"/>
+      <w:rFonts w:eastAsiaTheme="majorEastAsia" w:cstheme="majorBidi"/>
+      <w:color w:val="000000" w:themeColor="text1"/>
       <w:szCs w:val="32"/>
     </w:rPr>
   </w:style>
@@ -18207,6 +18868,7 @@
   <w:style w:type="character" w:default="1" w:styleId="a0">
     <w:name w:val="Default Paragraph Font"/>
     <w:uiPriority w:val="1"/>
+    <w:semiHidden/>
     <w:unhideWhenUsed/>
   </w:style>
   <w:style w:type="table" w:default="1" w:styleId="a1">
@@ -18235,7 +18897,7 @@
     <w:basedOn w:val="a0"/>
     <w:link w:val="1"/>
     <w:uiPriority w:val="9"/>
-    <w:rsid w:val="00CF30C8"/>
+    <w:rsid w:val="00986711"/>
     <w:rPr>
       <w:rFonts w:ascii="Times New Roman" w:eastAsiaTheme="majorEastAsia" w:hAnsi="Times New Roman" w:cstheme="majorBidi"/>
       <w:color w:val="000000" w:themeColor="text1"/>
@@ -18248,12 +18910,11 @@
     <w:basedOn w:val="a0"/>
     <w:link w:val="2"/>
     <w:uiPriority w:val="9"/>
-    <w:semiHidden/>
-    <w:rsid w:val="001C2B37"/>
+    <w:rsid w:val="00986711"/>
     <w:rPr>
-      <w:rFonts w:asciiTheme="majorHAnsi" w:eastAsiaTheme="majorEastAsia" w:hAnsiTheme="majorHAnsi" w:cstheme="majorBidi"/>
-      <w:color w:val="2F5496" w:themeColor="accent1" w:themeShade="BF"/>
-      <w:sz w:val="32"/>
+      <w:rFonts w:ascii="Times New Roman" w:eastAsiaTheme="majorEastAsia" w:hAnsi="Times New Roman" w:cstheme="majorBidi"/>
+      <w:color w:val="000000" w:themeColor="text1"/>
+      <w:sz w:val="28"/>
       <w:szCs w:val="32"/>
     </w:rPr>
   </w:style>
@@ -18605,6 +19266,208 @@
       <w:bCs/>
     </w:rPr>
   </w:style>
+  <w:style w:type="paragraph" w:styleId="af2">
+    <w:name w:val="TOC Heading"/>
+    <w:basedOn w:val="1"/>
+    <w:next w:val="a"/>
+    <w:uiPriority w:val="39"/>
+    <w:unhideWhenUsed/>
+    <w:qFormat/>
+    <w:rsid w:val="00D31F33"/>
+    <w:pPr>
+      <w:spacing w:before="480" w:line="276" w:lineRule="auto"/>
+      <w:jc w:val="left"/>
+      <w:outlineLvl w:val="9"/>
+    </w:pPr>
+    <w:rPr>
+      <w:rFonts w:asciiTheme="majorHAnsi" w:hAnsiTheme="majorHAnsi"/>
+      <w:b/>
+      <w:bCs/>
+      <w:color w:val="2F5496" w:themeColor="accent1" w:themeShade="BF"/>
+      <w:kern w:val="0"/>
+      <w:szCs w:val="28"/>
+      <w:lang w:eastAsia="ru-RU"/>
+      <w14:ligatures w14:val="none"/>
+    </w:rPr>
+  </w:style>
+  <w:style w:type="paragraph" w:styleId="11">
+    <w:name w:val="toc 1"/>
+    <w:basedOn w:val="a"/>
+    <w:next w:val="a"/>
+    <w:autoRedefine/>
+    <w:uiPriority w:val="39"/>
+    <w:unhideWhenUsed/>
+    <w:rsid w:val="00D31F33"/>
+    <w:pPr>
+      <w:tabs>
+        <w:tab w:val="right" w:leader="dot" w:pos="9345"/>
+      </w:tabs>
+      <w:spacing w:before="120"/>
+      <w:jc w:val="left"/>
+    </w:pPr>
+    <w:rPr>
+      <w:rFonts w:asciiTheme="minorHAnsi" w:hAnsiTheme="minorHAnsi" w:cstheme="minorHAnsi"/>
+      <w:b/>
+      <w:bCs/>
+      <w:i/>
+      <w:iCs/>
+      <w:sz w:val="24"/>
+    </w:rPr>
+  </w:style>
+  <w:style w:type="paragraph" w:styleId="23">
+    <w:name w:val="toc 2"/>
+    <w:basedOn w:val="a"/>
+    <w:next w:val="a"/>
+    <w:autoRedefine/>
+    <w:uiPriority w:val="39"/>
+    <w:unhideWhenUsed/>
+    <w:rsid w:val="00D31F33"/>
+    <w:pPr>
+      <w:spacing w:before="120"/>
+      <w:ind w:left="280"/>
+      <w:jc w:val="left"/>
+    </w:pPr>
+    <w:rPr>
+      <w:rFonts w:asciiTheme="minorHAnsi" w:hAnsiTheme="minorHAnsi" w:cstheme="minorHAnsi"/>
+      <w:b/>
+      <w:bCs/>
+      <w:sz w:val="22"/>
+      <w:szCs w:val="22"/>
+    </w:rPr>
+  </w:style>
+  <w:style w:type="paragraph" w:styleId="31">
+    <w:name w:val="toc 3"/>
+    <w:basedOn w:val="a"/>
+    <w:next w:val="a"/>
+    <w:autoRedefine/>
+    <w:uiPriority w:val="39"/>
+    <w:semiHidden/>
+    <w:unhideWhenUsed/>
+    <w:rsid w:val="00D31F33"/>
+    <w:pPr>
+      <w:ind w:left="560"/>
+      <w:jc w:val="left"/>
+    </w:pPr>
+    <w:rPr>
+      <w:rFonts w:asciiTheme="minorHAnsi" w:hAnsiTheme="minorHAnsi" w:cstheme="minorHAnsi"/>
+      <w:sz w:val="20"/>
+      <w:szCs w:val="20"/>
+    </w:rPr>
+  </w:style>
+  <w:style w:type="paragraph" w:styleId="41">
+    <w:name w:val="toc 4"/>
+    <w:basedOn w:val="a"/>
+    <w:next w:val="a"/>
+    <w:autoRedefine/>
+    <w:uiPriority w:val="39"/>
+    <w:semiHidden/>
+    <w:unhideWhenUsed/>
+    <w:rsid w:val="00D31F33"/>
+    <w:pPr>
+      <w:ind w:left="840"/>
+      <w:jc w:val="left"/>
+    </w:pPr>
+    <w:rPr>
+      <w:rFonts w:asciiTheme="minorHAnsi" w:hAnsiTheme="minorHAnsi" w:cstheme="minorHAnsi"/>
+      <w:sz w:val="20"/>
+      <w:szCs w:val="20"/>
+    </w:rPr>
+  </w:style>
+  <w:style w:type="paragraph" w:styleId="51">
+    <w:name w:val="toc 5"/>
+    <w:basedOn w:val="a"/>
+    <w:next w:val="a"/>
+    <w:autoRedefine/>
+    <w:uiPriority w:val="39"/>
+    <w:semiHidden/>
+    <w:unhideWhenUsed/>
+    <w:rsid w:val="00D31F33"/>
+    <w:pPr>
+      <w:ind w:left="1120"/>
+      <w:jc w:val="left"/>
+    </w:pPr>
+    <w:rPr>
+      <w:rFonts w:asciiTheme="minorHAnsi" w:hAnsiTheme="minorHAnsi" w:cstheme="minorHAnsi"/>
+      <w:sz w:val="20"/>
+      <w:szCs w:val="20"/>
+    </w:rPr>
+  </w:style>
+  <w:style w:type="paragraph" w:styleId="61">
+    <w:name w:val="toc 6"/>
+    <w:basedOn w:val="a"/>
+    <w:next w:val="a"/>
+    <w:autoRedefine/>
+    <w:uiPriority w:val="39"/>
+    <w:semiHidden/>
+    <w:unhideWhenUsed/>
+    <w:rsid w:val="00D31F33"/>
+    <w:pPr>
+      <w:ind w:left="1400"/>
+      <w:jc w:val="left"/>
+    </w:pPr>
+    <w:rPr>
+      <w:rFonts w:asciiTheme="minorHAnsi" w:hAnsiTheme="minorHAnsi" w:cstheme="minorHAnsi"/>
+      <w:sz w:val="20"/>
+      <w:szCs w:val="20"/>
+    </w:rPr>
+  </w:style>
+  <w:style w:type="paragraph" w:styleId="71">
+    <w:name w:val="toc 7"/>
+    <w:basedOn w:val="a"/>
+    <w:next w:val="a"/>
+    <w:autoRedefine/>
+    <w:uiPriority w:val="39"/>
+    <w:semiHidden/>
+    <w:unhideWhenUsed/>
+    <w:rsid w:val="00D31F33"/>
+    <w:pPr>
+      <w:ind w:left="1680"/>
+      <w:jc w:val="left"/>
+    </w:pPr>
+    <w:rPr>
+      <w:rFonts w:asciiTheme="minorHAnsi" w:hAnsiTheme="minorHAnsi" w:cstheme="minorHAnsi"/>
+      <w:sz w:val="20"/>
+      <w:szCs w:val="20"/>
+    </w:rPr>
+  </w:style>
+  <w:style w:type="paragraph" w:styleId="81">
+    <w:name w:val="toc 8"/>
+    <w:basedOn w:val="a"/>
+    <w:next w:val="a"/>
+    <w:autoRedefine/>
+    <w:uiPriority w:val="39"/>
+    <w:semiHidden/>
+    <w:unhideWhenUsed/>
+    <w:rsid w:val="00D31F33"/>
+    <w:pPr>
+      <w:ind w:left="1960"/>
+      <w:jc w:val="left"/>
+    </w:pPr>
+    <w:rPr>
+      <w:rFonts w:asciiTheme="minorHAnsi" w:hAnsiTheme="minorHAnsi" w:cstheme="minorHAnsi"/>
+      <w:sz w:val="20"/>
+      <w:szCs w:val="20"/>
+    </w:rPr>
+  </w:style>
+  <w:style w:type="paragraph" w:styleId="91">
+    <w:name w:val="toc 9"/>
+    <w:basedOn w:val="a"/>
+    <w:next w:val="a"/>
+    <w:autoRedefine/>
+    <w:uiPriority w:val="39"/>
+    <w:semiHidden/>
+    <w:unhideWhenUsed/>
+    <w:rsid w:val="00D31F33"/>
+    <w:pPr>
+      <w:ind w:left="2240"/>
+      <w:jc w:val="left"/>
+    </w:pPr>
+    <w:rPr>
+      <w:rFonts w:asciiTheme="minorHAnsi" w:hAnsiTheme="minorHAnsi" w:cstheme="minorHAnsi"/>
+      <w:sz w:val="20"/>
+      <w:szCs w:val="20"/>
+    </w:rPr>
+  </w:style>
 </w:styles>
 </file>
 

</xml_diff>

<commit_message>
vault backup: 2025-12-19 04:59:39
</commit_message>
<xml_diff>
--- a/Курс 3/НИР/НИР_Кринкин.docx
+++ b/Курс 3/НИР/НИР_Кринкин.docx
@@ -17276,7 +17276,6 @@
         <w:sectPr>
           <w:headerReference w:type="even" r:id="rId8"/>
           <w:headerReference w:type="default" r:id="rId9"/>
-          <w:headerReference w:type="first" r:id="rId10"/>
           <w:pgSz w:w="11906" w:h="16838"/>
           <w:pgMar w:top="1134" w:right="850" w:bottom="1134" w:left="1701" w:header="708" w:footer="708" w:gutter="0"/>
           <w:cols w:space="708"/>
@@ -17434,7 +17433,7 @@
                     <pic:cNvPicPr/>
                   </pic:nvPicPr>
                   <pic:blipFill>
-                    <a:blip r:embed="rId11" cstate="print">
+                    <a:blip r:embed="rId10" cstate="print">
                       <a:extLst>
                         <a:ext uri="{28A0092B-C50C-407E-A947-70E740481C1C}">
                           <a14:useLocalDpi xmlns:a14="http://schemas.microsoft.com/office/drawing/2010/main" val="0"/>
@@ -17738,77 +17737,6 @@
             <w:rStyle w:val="af7"/>
           </w:rPr>
           <w:fldChar w:fldCharType="separate"/>
-        </w:r>
-        <w:r>
-          <w:rPr>
-            <w:rStyle w:val="af7"/>
-            <w:noProof/>
-          </w:rPr>
-          <w:t>3</w:t>
-        </w:r>
-        <w:r>
-          <w:rPr>
-            <w:rStyle w:val="af7"/>
-          </w:rPr>
-          <w:fldChar w:fldCharType="end"/>
-        </w:r>
-      </w:p>
-    </w:sdtContent>
-  </w:sdt>
-  <w:p>
-    <w:pPr>
-      <w:pStyle w:val="af3"/>
-    </w:pPr>
-  </w:p>
-</w:hdr>
-</file>
-
-<file path=word/header3.xml><?xml version="1.0" encoding="utf-8"?>
-<w:hdr xmlns:wpc="http://schemas.microsoft.com/office/word/2010/wordprocessingCanvas" xmlns:cx="http://schemas.microsoft.com/office/drawing/2014/chartex" xmlns:cx1="http://schemas.microsoft.com/office/drawing/2015/9/8/chartex" xmlns:cx2="http://schemas.microsoft.com/office/drawing/2015/10/21/chartex" xmlns:cx3="http://schemas.microsoft.com/office/drawing/2016/5/9/chartex" xmlns:cx4="http://schemas.microsoft.com/office/drawing/2016/5/10/chartex" xmlns:cx5="http://schemas.microsoft.com/office/drawing/2016/5/11/chartex" xmlns:cx6="http://schemas.microsoft.com/office/drawing/2016/5/12/chartex" xmlns:cx7="http://schemas.microsoft.com/office/drawing/2016/5/13/chartex" xmlns:cx8="http://schemas.microsoft.com/office/drawing/2016/5/14/chartex" xmlns:mc="http://schemas.openxmlformats.org/markup-compatibility/2006" xmlns:aink="http://schemas.microsoft.com/office/drawing/2016/ink" xmlns:am3d="http://schemas.microsoft.com/office/drawing/2017/model3d" xmlns:o="urn:schemas-microsoft-com:office:office" xmlns:oel="http://schemas.microsoft.com/office/2019/extlst" xmlns:r="http://schemas.openxmlformats.org/officeDocument/2006/relationships" xmlns:m="http://schemas.openxmlformats.org/officeDocument/2006/math" xmlns:v="urn:schemas-microsoft-com:vml" xmlns:wp14="http://schemas.microsoft.com/office/word/2010/wordprocessingDrawing" xmlns:wp="http://schemas.openxmlformats.org/drawingml/2006/wordprocessingDrawing" xmlns:w10="urn:schemas-microsoft-com:office:word" xmlns:w="http://schemas.openxmlformats.org/wordprocessingml/2006/main" xmlns:w14="http://schemas.microsoft.com/office/word/2010/wordml" xmlns:w15="http://schemas.microsoft.com/office/word/2012/wordml" xmlns:w16cex="http://schemas.microsoft.com/office/word/2018/wordml/cex" xmlns:w16cid="http://schemas.microsoft.com/office/word/2016/wordml/cid" xmlns:w16="http://schemas.microsoft.com/office/word/2018/wordml" xmlns:w16du="http://schemas.microsoft.com/office/word/2023/wordml/word16du" xmlns:w16sdtdh="http://schemas.microsoft.com/office/word/2020/wordml/sdtdatahash" xmlns:w16sdtfl="http://schemas.microsoft.com/office/word/2024/wordml/sdtformatlock" xmlns:w16se="http://schemas.microsoft.com/office/word/2015/wordml/symex" xmlns:wpg="http://schemas.microsoft.com/office/word/2010/wordprocessingGroup" xmlns:wpi="http://schemas.microsoft.com/office/word/2010/wordprocessingInk" xmlns:wne="http://schemas.microsoft.com/office/word/2006/wordml" xmlns:wps="http://schemas.microsoft.com/office/word/2010/wordprocessingShape" mc:Ignorable="w14 w15 w16se w16cid w16 w16cex w16sdtdh w16sdtfl w16du wp14">
-  <w:sdt>
-    <w:sdtPr>
-      <w:rPr>
-        <w:rStyle w:val="af7"/>
-      </w:rPr>
-      <w:id w:val="-1410693626"/>
-      <w:docPartObj>
-        <w:docPartGallery w:val="Page Numbers (Top of Page)"/>
-        <w:docPartUnique/>
-      </w:docPartObj>
-    </w:sdtPr>
-    <w:sdtContent>
-      <w:p>
-        <w:pPr>
-          <w:pStyle w:val="af3"/>
-          <w:framePr w:wrap="none" w:vAnchor="text" w:hAnchor="margin" w:xAlign="center" w:y="1"/>
-          <w:rPr>
-            <w:rStyle w:val="af7"/>
-          </w:rPr>
-        </w:pPr>
-        <w:r>
-          <w:rPr>
-            <w:rStyle w:val="af7"/>
-          </w:rPr>
-          <w:fldChar w:fldCharType="begin"/>
-        </w:r>
-        <w:r>
-          <w:rPr>
-            <w:rStyle w:val="af7"/>
-          </w:rPr>
-          <w:instrText xml:space="preserve"> PAGE </w:instrText>
-        </w:r>
-        <w:r>
-          <w:rPr>
-            <w:rStyle w:val="af7"/>
-          </w:rPr>
-          <w:fldChar w:fldCharType="separate"/>
-        </w:r>
-        <w:r>
-          <w:rPr>
-            <w:rStyle w:val="af7"/>
-            <w:noProof/>
-          </w:rPr>
-          <w:t>3</w:t>
         </w:r>
         <w:r>
           <w:rPr>

</xml_diff>